<commit_message>
Drawn DFD diagrams: vector groups replace table grids (closed boxes + arrows)
</commit_message>
<xml_diff>
--- a/FITCORE_DFD.docx
+++ b/FITCORE_DFD.docx
@@ -1335,384 +1335,474 @@
         <w:t/>
       </w:r>
     </w:p>
-    <w:tbl>
-      <w:tblPr>
-        <w:tblW w:w="9000" w:type="dxa"/>
-        <w:jc w:val="center"/>
-        <w:tblBorders>
-          <w:top w:val="single" w:sz="4" w:space="0" w:color="auto"/>
-          <w:left w:val="single" w:sz="4" w:space="0" w:color="auto"/>
-          <w:bottom w:val="single" w:sz="4" w:space="0" w:color="auto"/>
-          <w:right w:val="single" w:sz="4" w:space="0" w:color="auto"/>
-          <w:insideH w:val="single" w:sz="4" w:space="0" w:color="auto"/>
-          <w:insideV w:val="single" w:sz="4" w:space="0" w:color="auto"/>
-        </w:tblBorders>
-        <w:tblCellMar>
-          <w:left w:w="10" w:type="dxa"/>
-          <w:right w:w="10" w:type="dxa"/>
-        </w:tblCellMar>
-        <w:tblLook w:val="04A0" w:firstRow="1" w:lastRow="0" w:firstColumn="1" w:lastColumn="0" w:noHBand="0" w:noVBand="1"/>
-      </w:tblPr>
-      <w:tblGrid>
-        <w:gridCol w:w="3000"/>
-        <w:gridCol w:w="3000"/>
-        <w:gridCol w:w="3000"/>
-      </w:tblGrid>
-      <w:tr>
-        <w:tc>
-          <w:tcPr>
-            <w:tcW w:w="3000" w:type="dxa"/>
-            <w:tcBorders>
-              <w:top w:val="single" w:sz="4" w:space="0" w:color="000000"/>
-              <w:left w:val="single" w:sz="4" w:space="0" w:color="000000"/>
-              <w:bottom w:val="single" w:sz="4" w:space="0" w:color="000000"/>
-              <w:right w:val="single" w:sz="4" w:space="0" w:color="000000"/>
-            </w:tcBorders>
-            <w:shd w:val="clear" w:color="auto" w:fill="FFFFFF"/>
-            <w:tcMar>
-              <w:top w:w="80" w:type="dxa"/>
-              <w:left w:w="120" w:type="dxa"/>
-              <w:bottom w:w="80" w:type="dxa"/>
-              <w:right w:w="120" w:type="dxa"/>
-            </w:tcMar>
-            <w:shd w:val="clear" w:color="auto" w:fill="F2F2F2"/>
-          </w:tcPr>
-          <w:p>
-            <w:pPr>
-              <w:jc w:val="center"/>
-              <w:rPr>
-                <w:sz w:val="24"/>
-                <w:szCs w:val="24"/>
-              </w:rPr>
-            </w:pPr>
-            <w:r>
-              <w:rPr>
-                <w:rFonts w:eastAsia="Arial"/>
-                <w:b/>
-                <w:bCs/>
-                <w:sz w:val="24"/>
-                <w:szCs w:val="24"/>
-              </w:rPr>
-              <w:t/>
-            </w:r>
-          </w:p>
-        </w:tc>
-        <w:tc>
-          <w:tcPr>
-            <w:tcW w:w="3000" w:type="dxa"/>
-            <w:tcBorders>
-              <w:top w:val="single" w:sz="4" w:space="0" w:color="000000"/>
-              <w:left w:val="single" w:sz="4" w:space="0" w:color="000000"/>
-              <w:bottom w:val="single" w:sz="4" w:space="0" w:color="000000"/>
-              <w:right w:val="single" w:sz="4" w:space="0" w:color="000000"/>
-            </w:tcBorders>
-            <w:shd w:val="clear" w:color="auto" w:fill="FFFFFF"/>
-            <w:tcMar>
-              <w:top w:w="80" w:type="dxa"/>
-              <w:left w:w="120" w:type="dxa"/>
-              <w:bottom w:w="80" w:type="dxa"/>
-              <w:right w:w="120" w:type="dxa"/>
-            </w:tcMar>
-            <w:shd w:val="clear" w:color="auto" w:fill="F2F2F2"/>
-          </w:tcPr>
-          <w:p>
-            <w:pPr>
-              <w:jc w:val="center"/>
-              <w:rPr>
-                <w:b/>
-                <w:bCs/>
-                <w:sz w:val="24"/>
-                <w:szCs w:val="24"/>
-              </w:rPr>
-            </w:pPr>
-            <w:r>
-              <w:rPr>
-                <w:rFonts w:eastAsia="Arial"/>
-                <w:sz w:val="24"/>
-                <w:szCs w:val="24"/>
-              </w:rPr>
-              <w:t>Trainer</w:t>
-            </w:r>
-          </w:p>
-        </w:tc>
-        <w:tc>
-          <w:tcPr>
-            <w:tcW w:w="3000" w:type="dxa"/>
-            <w:tcBorders>
-              <w:top w:val="single" w:sz="4" w:space="0" w:color="000000"/>
-              <w:left w:val="single" w:sz="4" w:space="0" w:color="000000"/>
-              <w:bottom w:val="single" w:sz="4" w:space="0" w:color="000000"/>
-              <w:right w:val="single" w:sz="4" w:space="0" w:color="000000"/>
-            </w:tcBorders>
-            <w:shd w:val="clear" w:color="auto" w:fill="FFFFFF"/>
-            <w:tcMar>
-              <w:top w:w="80" w:type="dxa"/>
-              <w:left w:w="120" w:type="dxa"/>
-              <w:bottom w:w="80" w:type="dxa"/>
-              <w:right w:w="120" w:type="dxa"/>
-            </w:tcMar>
-            <w:shd w:val="clear" w:color="auto" w:fill="F2F2F2"/>
-          </w:tcPr>
-          <w:p>
-            <w:pPr>
-              <w:jc w:val="center"/>
-              <w:rPr>
-                <w:sz w:val="24"/>
-                <w:szCs w:val="24"/>
-              </w:rPr>
-            </w:pPr>
-            <w:r>
-              <w:rPr>
-                <w:rFonts w:eastAsia="Arial"/>
-                <w:b/>
-                <w:bCs/>
-                <w:sz w:val="24"/>
-                <w:szCs w:val="24"/>
-              </w:rPr>
-              <w:t/>
-            </w:r>
-          </w:p>
-        </w:tc>
-      </w:tr>
-      <w:tr>
-        <w:tc>
-          <w:tcPr>
-            <w:tcW w:w="3000" w:type="dxa"/>
-            <w:tcBorders>
-              <w:top w:val="single" w:sz="4" w:space="0" w:color="000000"/>
-              <w:left w:val="single" w:sz="4" w:space="0" w:color="000000"/>
-              <w:bottom w:val="single" w:sz="4" w:space="0" w:color="000000"/>
-              <w:right w:val="single" w:sz="4" w:space="0" w:color="000000"/>
-            </w:tcBorders>
-            <w:shd w:val="clear" w:color="auto" w:fill="FFFFFF"/>
-            <w:tcMar>
-              <w:top w:w="80" w:type="dxa"/>
-              <w:left w:w="120" w:type="dxa"/>
-              <w:bottom w:w="80" w:type="dxa"/>
-              <w:right w:w="120" w:type="dxa"/>
-            </w:tcMar>
-            <w:shd w:val="clear" w:color="auto" w:fill="F2F2F2"/>
-          </w:tcPr>
-          <w:p>
-            <w:pPr>
-              <w:jc w:val="center"/>
-              <w:rPr>
-                <w:b/>
-                <w:bCs/>
-                <w:sz w:val="24"/>
-                <w:szCs w:val="24"/>
-              </w:rPr>
-            </w:pPr>
-            <w:r>
-              <w:rPr>
-                <w:rFonts w:eastAsia="Arial"/>
-                <w:b/>
-                <w:bCs/>
-                <w:sz w:val="24"/>
-                <w:szCs w:val="24"/>
-              </w:rPr>
-              <w:t>Guest</w:t>
-            </w:r>
-          </w:p>
-        </w:tc>
-        <w:tc>
-          <w:tcPr>
-            <w:tcW w:w="3000" w:type="dxa"/>
-            <w:tcBorders>
-              <w:top w:val="single" w:sz="4" w:space="0" w:color="000000"/>
-              <w:left w:val="single" w:sz="4" w:space="0" w:color="000000"/>
-              <w:bottom w:val="single" w:sz="4" w:space="0" w:color="000000"/>
-              <w:right w:val="single" w:sz="4" w:space="0" w:color="000000"/>
-            </w:tcBorders>
-            <w:shd w:val="clear" w:color="auto" w:fill="FFFFFF"/>
-            <w:tcMar>
-              <w:top w:w="80" w:type="dxa"/>
-              <w:left w:w="120" w:type="dxa"/>
-              <w:bottom w:w="80" w:type="dxa"/>
-              <w:right w:w="120" w:type="dxa"/>
-            </w:tcMar>
-            <w:shd w:val="clear" w:color="auto" w:fill="D9EAD3"/>
-          </w:tcPr>
-          <w:p>
-            <w:pPr>
-              <w:jc w:val="center"/>
-              <w:rPr>
-                <w:b/>
-                <w:bCs/>
-                <w:sz w:val="24"/>
-                <w:szCs w:val="24"/>
-              </w:rPr>
-            </w:pPr>
-            <w:r>
-              <w:rPr>
-                <w:rFonts w:eastAsia="Arial"/>
-                <w:sz w:val="24"/>
-                <w:szCs w:val="24"/>
-              </w:rPr>
-              <w:t>0. FitCore GMS</w:t>
-            </w:r>
-          </w:p>
-        </w:tc>
-        <w:tc>
-          <w:tcPr>
-            <w:tcW w:w="3000" w:type="dxa"/>
-            <w:tcBorders>
-              <w:top w:val="single" w:sz="4" w:space="0" w:color="000000"/>
-              <w:left w:val="single" w:sz="4" w:space="0" w:color="000000"/>
-              <w:bottom w:val="single" w:sz="4" w:space="0" w:color="000000"/>
-              <w:right w:val="single" w:sz="4" w:space="0" w:color="000000"/>
-            </w:tcBorders>
-            <w:shd w:val="clear" w:color="auto" w:fill="FFFFFF"/>
-            <w:tcMar>
-              <w:top w:w="80" w:type="dxa"/>
-              <w:left w:w="120" w:type="dxa"/>
-              <w:bottom w:w="80" w:type="dxa"/>
-              <w:right w:w="120" w:type="dxa"/>
-            </w:tcMar>
-            <w:shd w:val="clear" w:color="auto" w:fill="F2F2F2"/>
-          </w:tcPr>
-          <w:p>
-            <w:pPr>
-              <w:jc w:val="center"/>
-              <w:rPr>
-                <w:b/>
-                <w:bCs/>
-                <w:sz w:val="24"/>
-                <w:szCs w:val="24"/>
-              </w:rPr>
-            </w:pPr>
-            <w:r>
-              <w:rPr>
-                <w:rFonts w:eastAsia="Arial"/>
-                <w:b/>
-                <w:bCs/>
-                <w:sz w:val="24"/>
-                <w:szCs w:val="24"/>
-              </w:rPr>
-              <w:t>Member</w:t>
-            </w:r>
-          </w:p>
-        </w:tc>
-      </w:tr>
-      <w:tr>
-        <w:tc>
-          <w:tcPr>
-            <w:tcW w:w="3000" w:type="dxa"/>
-            <w:tcBorders>
-              <w:top w:val="single" w:sz="4" w:space="0" w:color="000000"/>
-              <w:left w:val="single" w:sz="4" w:space="0" w:color="000000"/>
-              <w:bottom w:val="single" w:sz="4" w:space="0" w:color="000000"/>
-              <w:right w:val="single" w:sz="4" w:space="0" w:color="000000"/>
-            </w:tcBorders>
-            <w:shd w:val="clear" w:color="auto" w:fill="FFFFFF"/>
-            <w:tcMar>
-              <w:top w:w="80" w:type="dxa"/>
-              <w:left w:w="120" w:type="dxa"/>
-              <w:bottom w:w="80" w:type="dxa"/>
-              <w:right w:w="120" w:type="dxa"/>
-            </w:tcMar>
-            <w:shd w:val="clear" w:color="auto" w:fill="F2F2F2"/>
-          </w:tcPr>
-          <w:p>
-            <w:pPr>
-              <w:jc w:val="center"/>
-              <w:rPr>
-                <w:b/>
-                <w:bCs/>
-                <w:sz w:val="24"/>
-                <w:szCs w:val="24"/>
-              </w:rPr>
-            </w:pPr>
-            <w:r>
-              <w:rPr>
-                <w:rFonts w:eastAsia="Arial"/>
-                <w:b/>
-                <w:bCs/>
-                <w:sz w:val="24"/>
-                <w:szCs w:val="24"/>
-              </w:rPr>
-              <w:t>Firebase Auth + Firestore</w:t>
-            </w:r>
-          </w:p>
-        </w:tc>
-        <w:tc>
-          <w:tcPr>
-            <w:tcW w:w="3000" w:type="dxa"/>
-            <w:tcBorders>
-              <w:top w:val="single" w:sz="4" w:space="0" w:color="000000"/>
-              <w:left w:val="single" w:sz="4" w:space="0" w:color="000000"/>
-              <w:bottom w:val="single" w:sz="4" w:space="0" w:color="000000"/>
-              <w:right w:val="single" w:sz="4" w:space="0" w:color="000000"/>
-            </w:tcBorders>
-            <w:shd w:val="clear" w:color="auto" w:fill="FFFFFF"/>
-            <w:tcMar>
-              <w:top w:w="80" w:type="dxa"/>
-              <w:left w:w="120" w:type="dxa"/>
-              <w:bottom w:w="80" w:type="dxa"/>
-              <w:right w:w="120" w:type="dxa"/>
-            </w:tcMar>
-            <w:shd w:val="clear" w:color="auto" w:fill="F2F2F2"/>
-          </w:tcPr>
-          <w:p>
-            <w:pPr>
-              <w:jc w:val="center"/>
-              <w:rPr>
-                <w:b/>
-                <w:bCs/>
-                <w:sz w:val="24"/>
-                <w:szCs w:val="24"/>
-              </w:rPr>
-            </w:pPr>
-            <w:r>
-              <w:rPr>
-                <w:rFonts w:eastAsia="Arial"/>
-                <w:sz w:val="24"/>
-                <w:szCs w:val="24"/>
-              </w:rPr>
-              <w:t>Staff / Admin</w:t>
-            </w:r>
-          </w:p>
-        </w:tc>
-        <w:tc>
-          <w:tcPr>
-            <w:tcW w:w="3000" w:type="dxa"/>
-            <w:tcBorders>
-              <w:top w:val="single" w:sz="4" w:space="0" w:color="000000"/>
-              <w:left w:val="single" w:sz="4" w:space="0" w:color="000000"/>
-              <w:bottom w:val="single" w:sz="4" w:space="0" w:color="000000"/>
-              <w:right w:val="single" w:sz="4" w:space="0" w:color="000000"/>
-            </w:tcBorders>
-            <w:shd w:val="clear" w:color="auto" w:fill="FFFFFF"/>
-            <w:tcMar>
-              <w:top w:w="80" w:type="dxa"/>
-              <w:left w:w="120" w:type="dxa"/>
-              <w:bottom w:w="80" w:type="dxa"/>
-              <w:right w:w="120" w:type="dxa"/>
-            </w:tcMar>
-            <w:shd w:val="clear" w:color="auto" w:fill="F2F2F2"/>
-          </w:tcPr>
-          <w:p>
-            <w:pPr>
-              <w:jc w:val="center"/>
-              <w:rPr>
-                <w:sz w:val="24"/>
-                <w:szCs w:val="24"/>
-              </w:rPr>
-            </w:pPr>
-            <w:r>
-              <w:rPr>
-                <w:rFonts w:eastAsia="Arial"/>
-                <w:b/>
-                <w:bCs/>
-                <w:sz w:val="24"/>
-                <w:szCs w:val="24"/>
-              </w:rPr>
-              <w:t/>
-            </w:r>
-          </w:p>
-        </w:tc>
-      </w:tr>
-    </w:tbl>
+    <w:p>
+      <w:r>
+        <w:drawing>
+          <wp:anchor distT="0" distB="0" distL="114300" distR="114300" simplePos="0" relativeHeight="251679744" behindDoc="0" locked="0" layoutInCell="1" allowOverlap="1" wp14:anchorId="001E848D" wp14:editId="001E848E">
+            <wp:simplePos x="0" y="0"/>
+            <wp:positionH relativeFrom="column">
+              <wp:posOffset>19050</wp:posOffset>
+            </wp:positionH>
+            <wp:positionV relativeFrom="paragraph">
+              <wp:posOffset>179070</wp:posOffset>
+            </wp:positionV>
+            <wp:extent cx="5700000" cy="3600000"/>
+            <wp:effectExtent l="0" t="0" r="0" b="10160"/>
+            <wp:wrapTopAndBottom/>
+            <wp:docPr id="2000014" name="DFD Figure"/>
+            <wp:cNvGraphicFramePr/>
+            <a:graphic xmlns:a="http://schemas.openxmlformats.org/drawingml/2006/main">
+              <a:graphicData uri="http://schemas.microsoft.com/office/word/2010/wordprocessingGroup">
+                <wpg:wgp>
+                  <wpg:cNvGrpSpPr/>
+                  <wpg:grpSpPr>
+                    <a:xfrm>
+                      <a:off x="0" y="0"/>
+                      <a:ext cx="5700000" cy="3600000"/>
+                      <a:chOff x="0" y="0"/>
+                      <a:chExt cx="5700000" cy="3600000"/>
+                    </a:xfrm>
+                  </wpg:grpSpPr>
+                  <wps:wsp>
+                    <wps:cNvPr id="2000001" name="Box 2000001"/>
+                    <wps:cNvSpPr/>
+                    <wps:spPr>
+                      <a:xfrm>
+                        <a:off x="1950000" y="200000"/>
+                        <a:ext cx="1800000" cy="600000"/>
+                      </a:xfrm>
+                      <a:prstGeom prst="rect">
+                        <a:avLst/>
+                      </a:prstGeom>
+                      <a:ln w="19050">
+                        <a:solidFill>
+                          <a:srgbClr val="404040"/>
+                        </a:solidFill>
+                      </a:ln>
+                      <a:solidFill>
+                        <a:srgbClr val="F2F2F2"/>
+                      </a:solidFill>
+                    </wps:spPr>
+                    <wps:txbx>
+                      <wps:txbxContent>
+                        <w:p>
+                          <w:pPr>
+                            <w:jc w:val="center"/>
+                          </w:pPr>
+                          <w:r>
+                            <w:rPr>
+                              <w:rFonts w:ascii="Arial" w:eastAsia="Arial" w:hAnsi="Arial" w:cs="Arial"/>
+                              <w:b/>
+                              <w:bCs/>
+                              <w:sz w:val="20"/>
+                              <w:szCs w:val="20"/>
+                            </w:rPr>
+                            <w:t xml:space="preserve">Trainer</w:t>
+                          </w:r>
+                        </w:p>
+                      </wps:txbxContent>
+                    </wps:txbx>
+                    <wps:bodyPr horzOverflow="overflow" vert="horz" lIns="0" tIns="0" rIns="0" bIns="0" rtlCol="0">
+                      <a:noAutofit/>
+                    </wps:bodyPr>
+                  </wps:wsp>
+                  <wps:wsp>
+                    <wps:cNvPr id="2000002" name="Box 2000002"/>
+                    <wps:cNvSpPr/>
+                    <wps:spPr>
+                      <a:xfrm>
+                        <a:off x="50000" y="1450000"/>
+                        <a:ext cx="1500000" cy="700000"/>
+                      </a:xfrm>
+                      <a:prstGeom prst="rect">
+                        <a:avLst/>
+                      </a:prstGeom>
+                      <a:ln w="19050">
+                        <a:solidFill>
+                          <a:srgbClr val="404040"/>
+                        </a:solidFill>
+                      </a:ln>
+                      <a:solidFill>
+                        <a:srgbClr val="F2F2F2"/>
+                      </a:solidFill>
+                    </wps:spPr>
+                    <wps:txbx>
+                      <wps:txbxContent>
+                        <w:p>
+                          <w:pPr>
+                            <w:jc w:val="center"/>
+                          </w:pPr>
+                          <w:r>
+                            <w:rPr>
+                              <w:rFonts w:ascii="Arial" w:eastAsia="Arial" w:hAnsi="Arial" w:cs="Arial"/>
+                              <w:b/>
+                              <w:bCs/>
+                              <w:sz w:val="20"/>
+                              <w:szCs w:val="20"/>
+                            </w:rPr>
+                            <w:t xml:space="preserve">Guest</w:t>
+                          </w:r>
+                        </w:p>
+                      </wps:txbxContent>
+                    </wps:txbx>
+                    <wps:bodyPr horzOverflow="overflow" vert="horz" lIns="0" tIns="0" rIns="0" bIns="0" rtlCol="0">
+                      <a:noAutofit/>
+                    </wps:bodyPr>
+                  </wps:wsp>
+                  <wps:wsp>
+                    <wps:cNvPr id="2000003" name="Box 2000003"/>
+                    <wps:cNvSpPr/>
+                    <wps:spPr>
+                      <a:xfrm>
+                        <a:off x="1950000" y="1450000"/>
+                        <a:ext cx="1800000" cy="700000"/>
+                      </a:xfrm>
+                      <a:prstGeom prst="rect">
+                        <a:avLst/>
+                      </a:prstGeom>
+                      <a:ln w="19050">
+                        <a:solidFill>
+                          <a:srgbClr val="404040"/>
+                        </a:solidFill>
+                      </a:ln>
+                      <a:solidFill>
+                        <a:srgbClr val="D9EAD3"/>
+                      </a:solidFill>
+                    </wps:spPr>
+                    <wps:txbx>
+                      <wps:txbxContent>
+                        <w:p>
+                          <w:pPr>
+                            <w:jc w:val="center"/>
+                          </w:pPr>
+                          <w:r>
+                            <w:rPr>
+                              <w:rFonts w:ascii="Arial" w:eastAsia="Arial" w:hAnsi="Arial" w:cs="Arial"/>
+                              <w:b/>
+                              <w:bCs/>
+                              <w:sz w:val="22"/>
+                              <w:szCs w:val="22"/>
+                            </w:rPr>
+                            <w:t xml:space="preserve">0. FitCore GMS</w:t>
+                          </w:r>
+                        </w:p>
+                      </wps:txbxContent>
+                    </wps:txbx>
+                    <wps:bodyPr horzOverflow="overflow" vert="horz" lIns="0" tIns="0" rIns="0" bIns="0" rtlCol="0">
+                      <a:noAutofit/>
+                    </wps:bodyPr>
+                  </wps:wsp>
+                  <wps:wsp>
+                    <wps:cNvPr id="2000004" name="Box 2000004"/>
+                    <wps:cNvSpPr/>
+                    <wps:spPr>
+                      <a:xfrm>
+                        <a:off x="4150000" y="1450000"/>
+                        <a:ext cx="1500000" cy="700000"/>
+                      </a:xfrm>
+                      <a:prstGeom prst="rect">
+                        <a:avLst/>
+                      </a:prstGeom>
+                      <a:ln w="19050">
+                        <a:solidFill>
+                          <a:srgbClr val="404040"/>
+                        </a:solidFill>
+                      </a:ln>
+                      <a:solidFill>
+                        <a:srgbClr val="F2F2F2"/>
+                      </a:solidFill>
+                    </wps:spPr>
+                    <wps:txbx>
+                      <wps:txbxContent>
+                        <w:p>
+                          <w:pPr>
+                            <w:jc w:val="center"/>
+                          </w:pPr>
+                          <w:r>
+                            <w:rPr>
+                              <w:rFonts w:ascii="Arial" w:eastAsia="Arial" w:hAnsi="Arial" w:cs="Arial"/>
+                              <w:b/>
+                              <w:bCs/>
+                              <w:sz w:val="20"/>
+                              <w:szCs w:val="20"/>
+                            </w:rPr>
+                            <w:t xml:space="preserve">Member</w:t>
+                          </w:r>
+                        </w:p>
+                      </wps:txbxContent>
+                    </wps:txbx>
+                    <wps:bodyPr horzOverflow="overflow" vert="horz" lIns="0" tIns="0" rIns="0" bIns="0" rtlCol="0">
+                      <a:noAutofit/>
+                    </wps:bodyPr>
+                  </wps:wsp>
+                  <wps:wsp>
+                    <wps:cNvPr id="2000005" name="Box 2000005"/>
+                    <wps:cNvSpPr/>
+                    <wps:spPr>
+                      <a:xfrm>
+                        <a:off x="900000" y="2700000"/>
+                        <a:ext cx="1800000" cy="600000"/>
+                      </a:xfrm>
+                      <a:prstGeom prst="rect">
+                        <a:avLst/>
+                      </a:prstGeom>
+                      <a:ln w="19050">
+                        <a:solidFill>
+                          <a:srgbClr val="404040"/>
+                        </a:solidFill>
+                      </a:ln>
+                      <a:solidFill>
+                        <a:srgbClr val="F2F2F2"/>
+                      </a:solidFill>
+                    </wps:spPr>
+                    <wps:txbx>
+                      <wps:txbxContent>
+                        <w:p>
+                          <w:pPr>
+                            <w:jc w:val="center"/>
+                          </w:pPr>
+                          <w:r>
+                            <w:rPr>
+                              <w:rFonts w:ascii="Arial" w:eastAsia="Arial" w:hAnsi="Arial" w:cs="Arial"/>
+                              <w:b/>
+                              <w:bCs/>
+                              <w:sz w:val="20"/>
+                              <w:szCs w:val="20"/>
+                            </w:rPr>
+                            <w:t xml:space="preserve">Staff / Admin</w:t>
+                          </w:r>
+                        </w:p>
+                      </wps:txbxContent>
+                    </wps:txbx>
+                    <wps:bodyPr horzOverflow="overflow" vert="horz" lIns="0" tIns="0" rIns="0" bIns="0" rtlCol="0">
+                      <a:noAutofit/>
+                    </wps:bodyPr>
+                  </wps:wsp>
+                  <wps:wsp>
+                    <wps:cNvPr id="2000006" name="Box 2000006"/>
+                    <wps:cNvSpPr/>
+                    <wps:spPr>
+                      <a:xfrm>
+                        <a:off x="3000000" y="2700000"/>
+                        <a:ext cx="1800000" cy="600000"/>
+                      </a:xfrm>
+                      <a:prstGeom prst="rect">
+                        <a:avLst/>
+                      </a:prstGeom>
+                      <a:ln w="19050">
+                        <a:solidFill>
+                          <a:srgbClr val="404040"/>
+                        </a:solidFill>
+                      </a:ln>
+                      <a:solidFill>
+                        <a:srgbClr val="F2F2F2"/>
+                      </a:solidFill>
+                    </wps:spPr>
+                    <wps:txbx>
+                      <wps:txbxContent>
+                        <w:p>
+                          <w:pPr>
+                            <w:jc w:val="center"/>
+                          </w:pPr>
+                          <w:r>
+                            <w:rPr>
+                              <w:rFonts w:ascii="Arial" w:eastAsia="Arial" w:hAnsi="Arial" w:cs="Arial"/>
+                              <w:b/>
+                              <w:bCs/>
+                              <w:sz w:val="18"/>
+                              <w:szCs w:val="18"/>
+                            </w:rPr>
+                            <w:t xml:space="preserve">Firebase Auth + Firestore</w:t>
+                          </w:r>
+                        </w:p>
+                      </wps:txbxContent>
+                    </wps:txbx>
+                    <wps:bodyPr horzOverflow="overflow" vert="horz" lIns="0" tIns="0" rIns="0" bIns="0" rtlCol="0">
+                      <a:noAutofit/>
+                    </wps:bodyPr>
+                  </wps:wsp>
+                  <wps:wsp>
+                    <wps:cNvPr id="2000007" name="Arrow 2000007"/>
+                    <wps:cNvSpPr/>
+                    <wps:spPr>
+                      <a:xfrm>
+                        <a:off x="2850000" y="800000"/>
+                        <a:ext cx="0" cy="650000"/>
+                      </a:xfrm>
+                      <a:custGeom>
+                        <a:avLst/>
+                        <a:gdLst/>
+                        <a:ahLst/>
+                        <a:cxnLst/>
+                        <a:rect l="0" t="0" r="0" b="0"/>
+                        <a:pathLst>
+                          <a:path h="650000" w="650000">
+                            <a:moveTo>
+                              <a:pt x="0" y="0"/>
+                            </a:moveTo>
+                            <a:lnTo>
+                              <a:pt x="0" y="650000"/>
+                            </a:lnTo>
+                          </a:path>
+                        </a:pathLst>
+                      </a:custGeom>
+                      <a:ln w="12700" cap="flat">
+                        <a:solidFill>
+                          <a:srgbClr val="404040"/>
+                        </a:solidFill>
+                        <a:headEnd ty="triangle" w="med" len="med"/>
+                        <a:tailEnd ty="triangle" w="med" len="med"/>
+                      </a:ln>
+                    </wps:spPr>
+                    <wps:bodyPr/>
+                  </wps:wsp>
+                  <wps:wsp>
+                    <wps:cNvPr id="2000008" name="Arrow 2000008"/>
+                    <wps:cNvSpPr/>
+                    <wps:spPr>
+                      <a:xfrm>
+                        <a:off x="1550000" y="1800000"/>
+                        <a:ext cx="400000" cy="0"/>
+                      </a:xfrm>
+                      <a:custGeom>
+                        <a:avLst/>
+                        <a:gdLst/>
+                        <a:ahLst/>
+                        <a:cxnLst/>
+                        <a:rect l="0" t="0" r="0" b="0"/>
+                        <a:pathLst>
+                          <a:path h="400000" w="400000">
+                            <a:moveTo>
+                              <a:pt x="0" y="0"/>
+                            </a:moveTo>
+                            <a:lnTo>
+                              <a:pt x="400000" y="0"/>
+                            </a:lnTo>
+                          </a:path>
+                        </a:pathLst>
+                      </a:custGeom>
+                      <a:ln w="12700" cap="flat">
+                        <a:solidFill>
+                          <a:srgbClr val="404040"/>
+                        </a:solidFill>
+                        <a:headEnd ty="triangle" w="med" len="med"/>
+                        <a:tailEnd ty="triangle" w="med" len="med"/>
+                      </a:ln>
+                    </wps:spPr>
+                    <wps:bodyPr/>
+                  </wps:wsp>
+                  <wps:wsp>
+                    <wps:cNvPr id="2000009" name="Arrow 2000009"/>
+                    <wps:cNvSpPr/>
+                    <wps:spPr>
+                      <a:xfrm>
+                        <a:off x="3750000" y="1800000"/>
+                        <a:ext cx="400000" cy="0"/>
+                      </a:xfrm>
+                      <a:custGeom>
+                        <a:avLst/>
+                        <a:gdLst/>
+                        <a:ahLst/>
+                        <a:cxnLst/>
+                        <a:rect l="0" t="0" r="0" b="0"/>
+                        <a:pathLst>
+                          <a:path h="400000" w="400000">
+                            <a:moveTo>
+                              <a:pt x="0" y="0"/>
+                            </a:moveTo>
+                            <a:lnTo>
+                              <a:pt x="400000" y="0"/>
+                            </a:lnTo>
+                          </a:path>
+                        </a:pathLst>
+                      </a:custGeom>
+                      <a:ln w="12700" cap="flat">
+                        <a:solidFill>
+                          <a:srgbClr val="404040"/>
+                        </a:solidFill>
+                        <a:headEnd ty="triangle" w="med" len="med"/>
+                        <a:tailEnd ty="triangle" w="med" len="med"/>
+                      </a:ln>
+                    </wps:spPr>
+                    <wps:bodyPr/>
+                  </wps:wsp>
+                  <wps:wsp>
+                    <wps:cNvPr id="2000010" name="Arrow 2000010"/>
+                    <wps:cNvSpPr/>
+                    <wps:spPr>
+                      <a:xfrm>
+                        <a:off x="1800000" y="2150000"/>
+                        <a:ext cx="600000" cy="550000"/>
+                      </a:xfrm>
+                      <a:custGeom>
+                        <a:avLst/>
+                        <a:gdLst/>
+                        <a:ahLst/>
+                        <a:cxnLst/>
+                        <a:rect l="0" t="0" r="0" b="0"/>
+                        <a:pathLst>
+                          <a:path h="600000" w="600000">
+                            <a:moveTo>
+                              <a:pt x="0" y="550000"/>
+                            </a:moveTo>
+                            <a:lnTo>
+                              <a:pt x="600000" y="0"/>
+                            </a:lnTo>
+                          </a:path>
+                        </a:pathLst>
+                      </a:custGeom>
+                      <a:ln w="12700" cap="flat">
+                        <a:solidFill>
+                          <a:srgbClr val="404040"/>
+                        </a:solidFill>
+                        <a:headEnd ty="triangle" w="med" len="med"/>
+                        <a:tailEnd ty="triangle" w="med" len="med"/>
+                      </a:ln>
+                    </wps:spPr>
+                    <wps:bodyPr/>
+                  </wps:wsp>
+                  <wps:wsp>
+                    <wps:cNvPr id="2000011" name="Arrow 2000011"/>
+                    <wps:cNvSpPr/>
+                    <wps:spPr>
+                      <a:xfrm>
+                        <a:off x="3300000" y="2150000"/>
+                        <a:ext cx="600000" cy="550000"/>
+                      </a:xfrm>
+                      <a:custGeom>
+                        <a:avLst/>
+                        <a:gdLst/>
+                        <a:ahLst/>
+                        <a:cxnLst/>
+                        <a:rect l="0" t="0" r="0" b="0"/>
+                        <a:pathLst>
+                          <a:path h="600000" w="600000">
+                            <a:moveTo>
+                              <a:pt x="600000" y="550000"/>
+                            </a:moveTo>
+                            <a:lnTo>
+                              <a:pt x="0" y="0"/>
+                            </a:lnTo>
+                          </a:path>
+                        </a:pathLst>
+                      </a:custGeom>
+                      <a:ln w="12700" cap="flat">
+                        <a:solidFill>
+                          <a:srgbClr val="404040"/>
+                        </a:solidFill>
+                        <a:headEnd ty="triangle" w="med" len="med"/>
+                        <a:tailEnd ty="triangle" w="med" len="med"/>
+                      </a:ln>
+                    </wps:spPr>
+                    <wps:bodyPr/>
+                  </wps:wsp>
+                </wpg:wgp>
+              </a:graphicData>
+            </a:graphic>
+          </wp:anchor>
+        </w:drawing>
+      </w:r>
+    </w:p>
     <w:p>
       <w:pPr>
         <w:spacing w:line="360" w:lineRule="auto"/>
@@ -2422,390 +2512,1017 @@
         <w:t/>
       </w:r>
     </w:p>
-    <w:tbl>
-      <w:tblPr>
-        <w:tblW w:w="9000" w:type="dxa"/>
-        <w:jc w:val="center"/>
-        <w:tblBorders>
-          <w:top w:val="single" w:sz="4" w:space="0" w:color="auto"/>
-          <w:left w:val="single" w:sz="4" w:space="0" w:color="auto"/>
-          <w:bottom w:val="single" w:sz="4" w:space="0" w:color="auto"/>
-          <w:right w:val="single" w:sz="4" w:space="0" w:color="auto"/>
-          <w:insideH w:val="single" w:sz="4" w:space="0" w:color="auto"/>
-          <w:insideV w:val="single" w:sz="4" w:space="0" w:color="auto"/>
-        </w:tblBorders>
-        <w:tblCellMar>
-          <w:left w:w="10" w:type="dxa"/>
-          <w:right w:w="10" w:type="dxa"/>
-        </w:tblCellMar>
-        <w:tblLook w:val="04A0" w:firstRow="1" w:lastRow="0" w:firstColumn="1" w:lastColumn="0" w:noHBand="0" w:noVBand="1"/>
-      </w:tblPr>
-      <w:tblGrid>
-        <w:gridCol w:w="3000"/>
-        <w:gridCol w:w="3000"/>
-        <w:gridCol w:w="3000"/>
-      </w:tblGrid>
-      <w:tr>
-        <w:tc>
-          <w:tcPr>
-            <w:tcW w:w="3000" w:type="dxa"/>
-            <w:tcBorders>
-              <w:top w:val="single" w:sz="4" w:space="0" w:color="000000"/>
-              <w:left w:val="single" w:sz="4" w:space="0" w:color="000000"/>
-              <w:bottom w:val="single" w:sz="4" w:space="0" w:color="000000"/>
-              <w:right w:val="single" w:sz="4" w:space="0" w:color="000000"/>
-            </w:tcBorders>
-            <w:shd w:val="clear" w:color="auto" w:fill="FFFFFF"/>
-            <w:tcMar>
-              <w:top w:w="80" w:type="dxa"/>
-              <w:left w:w="120" w:type="dxa"/>
-              <w:bottom w:w="80" w:type="dxa"/>
-              <w:right w:w="120" w:type="dxa"/>
-            </w:tcMar>
-            <w:shd w:val="clear" w:color="auto" w:fill="D9EAD3"/>
-          </w:tcPr>
-          <w:p>
-            <w:pPr>
-              <w:jc w:val="center"/>
-              <w:rPr>
-                <w:b/>
-                <w:bCs/>
-                <w:sz w:val="24"/>
-                <w:szCs w:val="24"/>
-              </w:rPr>
-            </w:pPr>
-            <w:r>
-              <w:rPr>
-                <w:rFonts w:eastAsia="Arial"/>
-                <w:b/>
-                <w:bCs/>
-                <w:sz w:val="24"/>
-                <w:szCs w:val="24"/>
-              </w:rPr>
-              <w:t>1.0 Auth + Registration</w:t>
-            </w:r>
-          </w:p>
-        </w:tc>
-        <w:tc>
-          <w:tcPr>
-            <w:tcW w:w="3000" w:type="dxa"/>
-            <w:tcBorders>
-              <w:top w:val="single" w:sz="4" w:space="0" w:color="000000"/>
-              <w:left w:val="single" w:sz="4" w:space="0" w:color="000000"/>
-              <w:bottom w:val="single" w:sz="4" w:space="0" w:color="000000"/>
-              <w:right w:val="single" w:sz="4" w:space="0" w:color="000000"/>
-            </w:tcBorders>
-            <w:shd w:val="clear" w:color="auto" w:fill="FFFFFF"/>
-            <w:tcMar>
-              <w:top w:w="80" w:type="dxa"/>
-              <w:left w:w="120" w:type="dxa"/>
-              <w:bottom w:w="80" w:type="dxa"/>
-              <w:right w:w="120" w:type="dxa"/>
-            </w:tcMar>
-            <w:shd w:val="clear" w:color="auto" w:fill="D9EAD3"/>
-          </w:tcPr>
-          <w:p>
-            <w:pPr>
-              <w:jc w:val="center"/>
-              <w:rPr>
-                <w:b/>
-                <w:bCs/>
-                <w:sz w:val="24"/>
-                <w:szCs w:val="24"/>
-              </w:rPr>
-            </w:pPr>
-            <w:r>
-              <w:rPr>
-                <w:rFonts w:eastAsia="Arial"/>
-                <w:sz w:val="24"/>
-                <w:szCs w:val="24"/>
-              </w:rPr>
-              <w:t>2.0 Member Management</w:t>
-            </w:r>
-          </w:p>
-        </w:tc>
-        <w:tc>
-          <w:tcPr>
-            <w:tcW w:w="3000" w:type="dxa"/>
-            <w:tcBorders>
-              <w:top w:val="single" w:sz="4" w:space="0" w:color="000000"/>
-              <w:left w:val="single" w:sz="4" w:space="0" w:color="000000"/>
-              <w:bottom w:val="single" w:sz="4" w:space="0" w:color="000000"/>
-              <w:right w:val="single" w:sz="4" w:space="0" w:color="000000"/>
-            </w:tcBorders>
-            <w:shd w:val="clear" w:color="auto" w:fill="FFFFFF"/>
-            <w:tcMar>
-              <w:top w:w="80" w:type="dxa"/>
-              <w:left w:w="120" w:type="dxa"/>
-              <w:bottom w:w="80" w:type="dxa"/>
-              <w:right w:w="120" w:type="dxa"/>
-            </w:tcMar>
-            <w:shd w:val="clear" w:color="auto" w:fill="D9EAD3"/>
-          </w:tcPr>
-          <w:p>
-            <w:pPr>
-              <w:jc w:val="center"/>
-              <w:rPr>
-                <w:b/>
-                <w:bCs/>
-                <w:sz w:val="24"/>
-                <w:szCs w:val="24"/>
-              </w:rPr>
-            </w:pPr>
-            <w:r>
-              <w:rPr>
-                <w:rFonts w:eastAsia="Arial"/>
-                <w:b/>
-                <w:bCs/>
-                <w:sz w:val="24"/>
-                <w:szCs w:val="24"/>
-              </w:rPr>
-              <w:t>3.0 Plans Management</w:t>
-            </w:r>
-          </w:p>
-        </w:tc>
-      </w:tr>
-      <w:tr>
-        <w:tc>
-          <w:tcPr>
-            <w:tcW w:w="3000" w:type="dxa"/>
-            <w:tcBorders>
-              <w:top w:val="single" w:sz="4" w:space="0" w:color="000000"/>
-              <w:left w:val="single" w:sz="4" w:space="0" w:color="000000"/>
-              <w:bottom w:val="single" w:sz="4" w:space="0" w:color="000000"/>
-              <w:right w:val="single" w:sz="4" w:space="0" w:color="000000"/>
-            </w:tcBorders>
-            <w:shd w:val="clear" w:color="auto" w:fill="FFFFFF"/>
-            <w:tcMar>
-              <w:top w:w="80" w:type="dxa"/>
-              <w:left w:w="120" w:type="dxa"/>
-              <w:bottom w:w="80" w:type="dxa"/>
-              <w:right w:w="120" w:type="dxa"/>
-            </w:tcMar>
-            <w:shd w:val="clear" w:color="auto" w:fill="D9EAD3"/>
-          </w:tcPr>
-          <w:p>
-            <w:pPr>
-              <w:jc w:val="center"/>
-              <w:rPr>
-                <w:b/>
-                <w:bCs/>
-                <w:sz w:val="24"/>
-                <w:szCs w:val="24"/>
-              </w:rPr>
-            </w:pPr>
-            <w:r>
-              <w:rPr>
-                <w:rFonts w:eastAsia="Arial"/>
-                <w:b/>
-                <w:bCs/>
-                <w:sz w:val="24"/>
-                <w:szCs w:val="24"/>
-              </w:rPr>
-              <w:t>4.0 Billing + Payments</w:t>
-            </w:r>
-          </w:p>
-        </w:tc>
-        <w:tc>
-          <w:tcPr>
-            <w:tcW w:w="3000" w:type="dxa"/>
-            <w:tcBorders>
-              <w:top w:val="single" w:sz="4" w:space="0" w:color="000000"/>
-              <w:left w:val="single" w:sz="4" w:space="0" w:color="000000"/>
-              <w:bottom w:val="single" w:sz="4" w:space="0" w:color="000000"/>
-              <w:right w:val="single" w:sz="4" w:space="0" w:color="000000"/>
-            </w:tcBorders>
-            <w:shd w:val="clear" w:color="auto" w:fill="FFFFFF"/>
-            <w:tcMar>
-              <w:top w:w="80" w:type="dxa"/>
-              <w:left w:w="120" w:type="dxa"/>
-              <w:bottom w:w="80" w:type="dxa"/>
-              <w:right w:w="120" w:type="dxa"/>
-            </w:tcMar>
-            <w:shd w:val="clear" w:color="auto" w:fill="D9EAD3"/>
-          </w:tcPr>
-          <w:p>
-            <w:pPr>
-              <w:jc w:val="center"/>
-              <w:rPr>
-                <w:b/>
-                <w:bCs/>
-                <w:sz w:val="24"/>
-                <w:szCs w:val="24"/>
-              </w:rPr>
-            </w:pPr>
-            <w:r>
-              <w:rPr>
-                <w:rFonts w:eastAsia="Arial"/>
-                <w:sz w:val="24"/>
-                <w:szCs w:val="24"/>
-              </w:rPr>
-              <w:t>5.0 Attendance (QR)</w:t>
-            </w:r>
-          </w:p>
-        </w:tc>
-        <w:tc>
-          <w:tcPr>
-            <w:tcW w:w="3000" w:type="dxa"/>
-            <w:tcBorders>
-              <w:top w:val="single" w:sz="4" w:space="0" w:color="000000"/>
-              <w:left w:val="single" w:sz="4" w:space="0" w:color="000000"/>
-              <w:bottom w:val="single" w:sz="4" w:space="0" w:color="000000"/>
-              <w:right w:val="single" w:sz="4" w:space="0" w:color="000000"/>
-            </w:tcBorders>
-            <w:shd w:val="clear" w:color="auto" w:fill="FFFFFF"/>
-            <w:tcMar>
-              <w:top w:w="80" w:type="dxa"/>
-              <w:left w:w="120" w:type="dxa"/>
-              <w:bottom w:w="80" w:type="dxa"/>
-              <w:right w:w="120" w:type="dxa"/>
-            </w:tcMar>
-            <w:shd w:val="clear" w:color="auto" w:fill="D9EAD3"/>
-          </w:tcPr>
-          <w:p>
-            <w:pPr>
-              <w:jc w:val="center"/>
-              <w:rPr>
-                <w:b/>
-                <w:bCs/>
-                <w:sz w:val="24"/>
-                <w:szCs w:val="24"/>
-              </w:rPr>
-            </w:pPr>
-            <w:r>
-              <w:rPr>
-                <w:rFonts w:eastAsia="Arial"/>
-                <w:b/>
-                <w:bCs/>
-                <w:sz w:val="24"/>
-                <w:szCs w:val="24"/>
-              </w:rPr>
-              <w:t>6.0 Walk-In + Fee</w:t>
-            </w:r>
-          </w:p>
-        </w:tc>
-      </w:tr>
-      <w:tr>
-        <w:tc>
-          <w:tcPr>
-            <w:tcW w:w="3000" w:type="dxa"/>
-            <w:tcBorders>
-              <w:top w:val="single" w:sz="4" w:space="0" w:color="000000"/>
-              <w:left w:val="single" w:sz="4" w:space="0" w:color="000000"/>
-              <w:bottom w:val="single" w:sz="4" w:space="0" w:color="000000"/>
-              <w:right w:val="single" w:sz="4" w:space="0" w:color="000000"/>
-            </w:tcBorders>
-            <w:shd w:val="clear" w:color="auto" w:fill="FFFFFF"/>
-            <w:tcMar>
-              <w:top w:w="80" w:type="dxa"/>
-              <w:left w:w="120" w:type="dxa"/>
-              <w:bottom w:w="80" w:type="dxa"/>
-              <w:right w:w="120" w:type="dxa"/>
-            </w:tcMar>
-            <w:shd w:val="clear" w:color="auto" w:fill="D9EAD3"/>
-          </w:tcPr>
-          <w:p>
-            <w:pPr>
-              <w:jc w:val="center"/>
-              <w:rPr>
-                <w:b/>
-                <w:bCs/>
-                <w:sz w:val="24"/>
-                <w:szCs w:val="24"/>
-              </w:rPr>
-            </w:pPr>
-            <w:r>
-              <w:rPr>
-                <w:rFonts w:eastAsia="Arial"/>
-                <w:b/>
-                <w:bCs/>
-                <w:sz w:val="24"/>
-                <w:szCs w:val="24"/>
-              </w:rPr>
-              <w:t>7.0 Trainer + Sessions</w:t>
-            </w:r>
-          </w:p>
-        </w:tc>
-        <w:tc>
-          <w:tcPr>
-            <w:tcW w:w="3000" w:type="dxa"/>
-            <w:tcBorders>
-              <w:top w:val="single" w:sz="4" w:space="0" w:color="000000"/>
-              <w:left w:val="single" w:sz="4" w:space="0" w:color="000000"/>
-              <w:bottom w:val="single" w:sz="4" w:space="0" w:color="000000"/>
-              <w:right w:val="single" w:sz="4" w:space="0" w:color="000000"/>
-            </w:tcBorders>
-            <w:shd w:val="clear" w:color="auto" w:fill="FFFFFF"/>
-            <w:tcMar>
-              <w:top w:w="80" w:type="dxa"/>
-              <w:left w:w="120" w:type="dxa"/>
-              <w:bottom w:w="80" w:type="dxa"/>
-              <w:right w:w="120" w:type="dxa"/>
-            </w:tcMar>
-            <w:shd w:val="clear" w:color="auto" w:fill="D9EAD3"/>
-          </w:tcPr>
-          <w:p>
-            <w:pPr>
-              <w:jc w:val="center"/>
-              <w:rPr>
-                <w:b/>
-                <w:bCs/>
-                <w:sz w:val="24"/>
-                <w:szCs w:val="24"/>
-              </w:rPr>
-            </w:pPr>
-            <w:r>
-              <w:rPr>
-                <w:rFonts w:eastAsia="Arial"/>
-                <w:sz w:val="24"/>
-                <w:szCs w:val="24"/>
-              </w:rPr>
-              <w:t>8.0 Announce + Messages</w:t>
-            </w:r>
-          </w:p>
-        </w:tc>
-        <w:tc>
-          <w:tcPr>
-            <w:tcW w:w="3000" w:type="dxa"/>
-            <w:tcBorders>
-              <w:top w:val="single" w:sz="4" w:space="0" w:color="000000"/>
-              <w:left w:val="single" w:sz="4" w:space="0" w:color="000000"/>
-              <w:bottom w:val="single" w:sz="4" w:space="0" w:color="000000"/>
-              <w:right w:val="single" w:sz="4" w:space="0" w:color="000000"/>
-            </w:tcBorders>
-            <w:shd w:val="clear" w:color="auto" w:fill="FFFFFF"/>
-            <w:tcMar>
-              <w:top w:w="80" w:type="dxa"/>
-              <w:left w:w="120" w:type="dxa"/>
-              <w:bottom w:w="80" w:type="dxa"/>
-              <w:right w:w="120" w:type="dxa"/>
-            </w:tcMar>
-            <w:shd w:val="clear" w:color="auto" w:fill="D9EAD3"/>
-          </w:tcPr>
-          <w:p>
-            <w:pPr>
-              <w:jc w:val="center"/>
-              <w:rPr>
-                <w:b/>
-                <w:bCs/>
-                <w:sz w:val="24"/>
-                <w:szCs w:val="24"/>
-              </w:rPr>
-            </w:pPr>
-            <w:r>
-              <w:rPr>
-                <w:rFonts w:eastAsia="Arial"/>
-                <w:b/>
-                <w:bCs/>
-                <w:sz w:val="24"/>
-                <w:szCs w:val="24"/>
-              </w:rPr>
-              <w:t>9.0 Reports</w:t>
-            </w:r>
-          </w:p>
-        </w:tc>
-      </w:tr>
-    </w:tbl>
+    <w:p>
+      <w:r>
+        <w:drawing>
+          <wp:anchor distT="0" distB="0" distL="114300" distR="114300" simplePos="0" relativeHeight="251679744" behindDoc="0" locked="0" layoutInCell="1" allowOverlap="1" wp14:anchorId="001E84A8" wp14:editId="001E84A9">
+            <wp:simplePos x="0" y="0"/>
+            <wp:positionH relativeFrom="column">
+              <wp:posOffset>19050</wp:posOffset>
+            </wp:positionH>
+            <wp:positionV relativeFrom="paragraph">
+              <wp:posOffset>179070</wp:posOffset>
+            </wp:positionV>
+            <wp:extent cx="5700000" cy="4800000"/>
+            <wp:effectExtent l="0" t="0" r="0" b="10160"/>
+            <wp:wrapTopAndBottom/>
+            <wp:docPr id="2000041" name="DFD Figure"/>
+            <wp:cNvGraphicFramePr/>
+            <a:graphic xmlns:a="http://schemas.openxmlformats.org/drawingml/2006/main">
+              <a:graphicData uri="http://schemas.microsoft.com/office/word/2010/wordprocessingGroup">
+                <wpg:wgp>
+                  <wpg:cNvGrpSpPr/>
+                  <wpg:grpSpPr>
+                    <a:xfrm>
+                      <a:off x="0" y="0"/>
+                      <a:ext cx="5700000" cy="4800000"/>
+                      <a:chOff x="0" y="0"/>
+                      <a:chExt cx="5700000" cy="4800000"/>
+                    </a:xfrm>
+                  </wpg:grpSpPr>
+                  <wps:wsp>
+                    <wps:cNvPr id="2000015" name="Box 2000015"/>
+                    <wps:cNvSpPr/>
+                    <wps:spPr>
+                      <a:xfrm>
+                        <a:off x="50000" y="100000"/>
+                        <a:ext cx="1300000" cy="550000"/>
+                      </a:xfrm>
+                      <a:prstGeom prst="rect">
+                        <a:avLst/>
+                      </a:prstGeom>
+                      <a:ln w="19050">
+                        <a:solidFill>
+                          <a:srgbClr val="404040"/>
+                        </a:solidFill>
+                      </a:ln>
+                      <a:solidFill>
+                        <a:srgbClr val="F2F2F2"/>
+                      </a:solidFill>
+                    </wps:spPr>
+                    <wps:txbx>
+                      <wps:txbxContent>
+                        <w:p>
+                          <w:pPr>
+                            <w:jc w:val="center"/>
+                          </w:pPr>
+                          <w:r>
+                            <w:rPr>
+                              <w:rFonts w:ascii="Arial" w:eastAsia="Arial" w:hAnsi="Arial" w:cs="Arial"/>
+                              <w:b/>
+                              <w:bCs/>
+                              <w:sz w:val="18"/>
+                              <w:szCs w:val="18"/>
+                            </w:rPr>
+                            <w:t xml:space="preserve">Guest</w:t>
+                          </w:r>
+                        </w:p>
+                      </wps:txbxContent>
+                    </wps:txbx>
+                    <wps:bodyPr horzOverflow="overflow" vert="horz" lIns="0" tIns="0" rIns="0" bIns="0" rtlCol="0">
+                      <a:noAutofit/>
+                    </wps:bodyPr>
+                  </wps:wsp>
+                  <wps:wsp>
+                    <wps:cNvPr id="2000016" name="Box 2000016"/>
+                    <wps:cNvSpPr/>
+                    <wps:spPr>
+                      <a:xfrm>
+                        <a:off x="1475000" y="100000"/>
+                        <a:ext cx="1300000" cy="550000"/>
+                      </a:xfrm>
+                      <a:prstGeom prst="rect">
+                        <a:avLst/>
+                      </a:prstGeom>
+                      <a:ln w="19050">
+                        <a:solidFill>
+                          <a:srgbClr val="404040"/>
+                        </a:solidFill>
+                      </a:ln>
+                      <a:solidFill>
+                        <a:srgbClr val="F2F2F2"/>
+                      </a:solidFill>
+                    </wps:spPr>
+                    <wps:txbx>
+                      <wps:txbxContent>
+                        <w:p>
+                          <w:pPr>
+                            <w:jc w:val="center"/>
+                          </w:pPr>
+                          <w:r>
+                            <w:rPr>
+                              <w:rFonts w:ascii="Arial" w:eastAsia="Arial" w:hAnsi="Arial" w:cs="Arial"/>
+                              <w:b/>
+                              <w:bCs/>
+                              <w:sz w:val="18"/>
+                              <w:szCs w:val="18"/>
+                            </w:rPr>
+                            <w:t xml:space="preserve">Member</w:t>
+                          </w:r>
+                        </w:p>
+                      </wps:txbxContent>
+                    </wps:txbx>
+                    <wps:bodyPr horzOverflow="overflow" vert="horz" lIns="0" tIns="0" rIns="0" bIns="0" rtlCol="0">
+                      <a:noAutofit/>
+                    </wps:bodyPr>
+                  </wps:wsp>
+                  <wps:wsp>
+                    <wps:cNvPr id="2000017" name="Box 2000017"/>
+                    <wps:cNvSpPr/>
+                    <wps:spPr>
+                      <a:xfrm>
+                        <a:off x="2900000" y="100000"/>
+                        <a:ext cx="1300000" cy="550000"/>
+                      </a:xfrm>
+                      <a:prstGeom prst="rect">
+                        <a:avLst/>
+                      </a:prstGeom>
+                      <a:ln w="19050">
+                        <a:solidFill>
+                          <a:srgbClr val="404040"/>
+                        </a:solidFill>
+                      </a:ln>
+                      <a:solidFill>
+                        <a:srgbClr val="F2F2F2"/>
+                      </a:solidFill>
+                    </wps:spPr>
+                    <wps:txbx>
+                      <wps:txbxContent>
+                        <w:p>
+                          <w:pPr>
+                            <w:jc w:val="center"/>
+                          </w:pPr>
+                          <w:r>
+                            <w:rPr>
+                              <w:rFonts w:ascii="Arial" w:eastAsia="Arial" w:hAnsi="Arial" w:cs="Arial"/>
+                              <w:b/>
+                              <w:bCs/>
+                              <w:sz w:val="18"/>
+                              <w:szCs w:val="18"/>
+                            </w:rPr>
+                            <w:t xml:space="preserve">Trainer</w:t>
+                          </w:r>
+                        </w:p>
+                      </wps:txbxContent>
+                    </wps:txbx>
+                    <wps:bodyPr horzOverflow="overflow" vert="horz" lIns="0" tIns="0" rIns="0" bIns="0" rtlCol="0">
+                      <a:noAutofit/>
+                    </wps:bodyPr>
+                  </wps:wsp>
+                  <wps:wsp>
+                    <wps:cNvPr id="2000018" name="Box 2000018"/>
+                    <wps:cNvSpPr/>
+                    <wps:spPr>
+                      <a:xfrm>
+                        <a:off x="4325000" y="100000"/>
+                        <a:ext cx="1300000" cy="550000"/>
+                      </a:xfrm>
+                      <a:prstGeom prst="rect">
+                        <a:avLst/>
+                      </a:prstGeom>
+                      <a:ln w="19050">
+                        <a:solidFill>
+                          <a:srgbClr val="404040"/>
+                        </a:solidFill>
+                      </a:ln>
+                      <a:solidFill>
+                        <a:srgbClr val="F2F2F2"/>
+                      </a:solidFill>
+                    </wps:spPr>
+                    <wps:txbx>
+                      <wps:txbxContent>
+                        <w:p>
+                          <w:pPr>
+                            <w:jc w:val="center"/>
+                          </w:pPr>
+                          <w:r>
+                            <w:rPr>
+                              <w:rFonts w:ascii="Arial" w:eastAsia="Arial" w:hAnsi="Arial" w:cs="Arial"/>
+                              <w:b/>
+                              <w:bCs/>
+                              <w:sz w:val="18"/>
+                              <w:szCs w:val="18"/>
+                            </w:rPr>
+                            <w:t xml:space="preserve">Staff/Admin</w:t>
+                          </w:r>
+                        </w:p>
+                      </wps:txbxContent>
+                    </wps:txbx>
+                    <wps:bodyPr horzOverflow="overflow" vert="horz" lIns="0" tIns="0" rIns="0" bIns="0" rtlCol="0">
+                      <a:noAutofit/>
+                    </wps:bodyPr>
+                  </wps:wsp>
+                  <wps:wsp>
+                    <wps:cNvPr id="2000019" name="Box 2000019"/>
+                    <wps:cNvSpPr/>
+                    <wps:spPr>
+                      <a:xfrm>
+                        <a:off x="50000" y="1100000"/>
+                        <a:ext cx="1750000" cy="650000"/>
+                      </a:xfrm>
+                      <a:prstGeom prst="rect">
+                        <a:avLst/>
+                      </a:prstGeom>
+                      <a:ln w="19050">
+                        <a:solidFill>
+                          <a:srgbClr val="404040"/>
+                        </a:solidFill>
+                      </a:ln>
+                      <a:solidFill>
+                        <a:srgbClr val="D9EAD3"/>
+                      </a:solidFill>
+                    </wps:spPr>
+                    <wps:txbx>
+                      <wps:txbxContent>
+                        <w:p>
+                          <w:pPr>
+                            <w:jc w:val="center"/>
+                          </w:pPr>
+                          <w:r>
+                            <w:rPr>
+                              <w:rFonts w:ascii="Arial" w:eastAsia="Arial" w:hAnsi="Arial" w:cs="Arial"/>
+                              <w:b/>
+                              <w:bCs/>
+                              <w:sz w:val="16"/>
+                              <w:szCs w:val="16"/>
+                            </w:rPr>
+                            <w:t xml:space="preserve">1.0 Auth + Registration</w:t>
+                          </w:r>
+                        </w:p>
+                      </wps:txbxContent>
+                    </wps:txbx>
+                    <wps:bodyPr horzOverflow="overflow" vert="horz" lIns="0" tIns="0" rIns="0" bIns="0" rtlCol="0">
+                      <a:noAutofit/>
+                    </wps:bodyPr>
+                  </wps:wsp>
+                  <wps:wsp>
+                    <wps:cNvPr id="2000020" name="Box 2000020"/>
+                    <wps:cNvSpPr/>
+                    <wps:spPr>
+                      <a:xfrm>
+                        <a:off x="1975000" y="1100000"/>
+                        <a:ext cx="1750000" cy="650000"/>
+                      </a:xfrm>
+                      <a:prstGeom prst="rect">
+                        <a:avLst/>
+                      </a:prstGeom>
+                      <a:ln w="19050">
+                        <a:solidFill>
+                          <a:srgbClr val="404040"/>
+                        </a:solidFill>
+                      </a:ln>
+                      <a:solidFill>
+                        <a:srgbClr val="D9EAD3"/>
+                      </a:solidFill>
+                    </wps:spPr>
+                    <wps:txbx>
+                      <wps:txbxContent>
+                        <w:p>
+                          <w:pPr>
+                            <w:jc w:val="center"/>
+                          </w:pPr>
+                          <w:r>
+                            <w:rPr>
+                              <w:rFonts w:ascii="Arial" w:eastAsia="Arial" w:hAnsi="Arial" w:cs="Arial"/>
+                              <w:b/>
+                              <w:bCs/>
+                              <w:sz w:val="16"/>
+                              <w:szCs w:val="16"/>
+                            </w:rPr>
+                            <w:t xml:space="preserve">2.0 Member Management</w:t>
+                          </w:r>
+                        </w:p>
+                      </wps:txbxContent>
+                    </wps:txbx>
+                    <wps:bodyPr horzOverflow="overflow" vert="horz" lIns="0" tIns="0" rIns="0" bIns="0" rtlCol="0">
+                      <a:noAutofit/>
+                    </wps:bodyPr>
+                  </wps:wsp>
+                  <wps:wsp>
+                    <wps:cNvPr id="2000021" name="Box 2000021"/>
+                    <wps:cNvSpPr/>
+                    <wps:spPr>
+                      <a:xfrm>
+                        <a:off x="3900000" y="1100000"/>
+                        <a:ext cx="1750000" cy="650000"/>
+                      </a:xfrm>
+                      <a:prstGeom prst="rect">
+                        <a:avLst/>
+                      </a:prstGeom>
+                      <a:ln w="19050">
+                        <a:solidFill>
+                          <a:srgbClr val="404040"/>
+                        </a:solidFill>
+                      </a:ln>
+                      <a:solidFill>
+                        <a:srgbClr val="D9EAD3"/>
+                      </a:solidFill>
+                    </wps:spPr>
+                    <wps:txbx>
+                      <wps:txbxContent>
+                        <w:p>
+                          <w:pPr>
+                            <w:jc w:val="center"/>
+                          </w:pPr>
+                          <w:r>
+                            <w:rPr>
+                              <w:rFonts w:ascii="Arial" w:eastAsia="Arial" w:hAnsi="Arial" w:cs="Arial"/>
+                              <w:b/>
+                              <w:bCs/>
+                              <w:sz w:val="16"/>
+                              <w:szCs w:val="16"/>
+                            </w:rPr>
+                            <w:t xml:space="preserve">3.0 Plans Management</w:t>
+                          </w:r>
+                        </w:p>
+                      </wps:txbxContent>
+                    </wps:txbx>
+                    <wps:bodyPr horzOverflow="overflow" vert="horz" lIns="0" tIns="0" rIns="0" bIns="0" rtlCol="0">
+                      <a:noAutofit/>
+                    </wps:bodyPr>
+                  </wps:wsp>
+                  <wps:wsp>
+                    <wps:cNvPr id="2000022" name="Box 2000022"/>
+                    <wps:cNvSpPr/>
+                    <wps:spPr>
+                      <a:xfrm>
+                        <a:off x="50000" y="1950000"/>
+                        <a:ext cx="1750000" cy="650000"/>
+                      </a:xfrm>
+                      <a:prstGeom prst="rect">
+                        <a:avLst/>
+                      </a:prstGeom>
+                      <a:ln w="19050">
+                        <a:solidFill>
+                          <a:srgbClr val="404040"/>
+                        </a:solidFill>
+                      </a:ln>
+                      <a:solidFill>
+                        <a:srgbClr val="D9EAD3"/>
+                      </a:solidFill>
+                    </wps:spPr>
+                    <wps:txbx>
+                      <wps:txbxContent>
+                        <w:p>
+                          <w:pPr>
+                            <w:jc w:val="center"/>
+                          </w:pPr>
+                          <w:r>
+                            <w:rPr>
+                              <w:rFonts w:ascii="Arial" w:eastAsia="Arial" w:hAnsi="Arial" w:cs="Arial"/>
+                              <w:b/>
+                              <w:bCs/>
+                              <w:sz w:val="16"/>
+                              <w:szCs w:val="16"/>
+                            </w:rPr>
+                            <w:t xml:space="preserve">4.0 Billing + Payments</w:t>
+                          </w:r>
+                        </w:p>
+                      </wps:txbxContent>
+                    </wps:txbx>
+                    <wps:bodyPr horzOverflow="overflow" vert="horz" lIns="0" tIns="0" rIns="0" bIns="0" rtlCol="0">
+                      <a:noAutofit/>
+                    </wps:bodyPr>
+                  </wps:wsp>
+                  <wps:wsp>
+                    <wps:cNvPr id="2000023" name="Box 2000023"/>
+                    <wps:cNvSpPr/>
+                    <wps:spPr>
+                      <a:xfrm>
+                        <a:off x="1975000" y="1950000"/>
+                        <a:ext cx="1750000" cy="650000"/>
+                      </a:xfrm>
+                      <a:prstGeom prst="rect">
+                        <a:avLst/>
+                      </a:prstGeom>
+                      <a:ln w="19050">
+                        <a:solidFill>
+                          <a:srgbClr val="404040"/>
+                        </a:solidFill>
+                      </a:ln>
+                      <a:solidFill>
+                        <a:srgbClr val="D9EAD3"/>
+                      </a:solidFill>
+                    </wps:spPr>
+                    <wps:txbx>
+                      <wps:txbxContent>
+                        <w:p>
+                          <w:pPr>
+                            <w:jc w:val="center"/>
+                          </w:pPr>
+                          <w:r>
+                            <w:rPr>
+                              <w:rFonts w:ascii="Arial" w:eastAsia="Arial" w:hAnsi="Arial" w:cs="Arial"/>
+                              <w:b/>
+                              <w:bCs/>
+                              <w:sz w:val="16"/>
+                              <w:szCs w:val="16"/>
+                            </w:rPr>
+                            <w:t xml:space="preserve">5.0 Attendance (QR)</w:t>
+                          </w:r>
+                        </w:p>
+                      </wps:txbxContent>
+                    </wps:txbx>
+                    <wps:bodyPr horzOverflow="overflow" vert="horz" lIns="0" tIns="0" rIns="0" bIns="0" rtlCol="0">
+                      <a:noAutofit/>
+                    </wps:bodyPr>
+                  </wps:wsp>
+                  <wps:wsp>
+                    <wps:cNvPr id="2000024" name="Box 2000024"/>
+                    <wps:cNvSpPr/>
+                    <wps:spPr>
+                      <a:xfrm>
+                        <a:off x="3900000" y="1950000"/>
+                        <a:ext cx="1750000" cy="650000"/>
+                      </a:xfrm>
+                      <a:prstGeom prst="rect">
+                        <a:avLst/>
+                      </a:prstGeom>
+                      <a:ln w="19050">
+                        <a:solidFill>
+                          <a:srgbClr val="404040"/>
+                        </a:solidFill>
+                      </a:ln>
+                      <a:solidFill>
+                        <a:srgbClr val="D9EAD3"/>
+                      </a:solidFill>
+                    </wps:spPr>
+                    <wps:txbx>
+                      <wps:txbxContent>
+                        <w:p>
+                          <w:pPr>
+                            <w:jc w:val="center"/>
+                          </w:pPr>
+                          <w:r>
+                            <w:rPr>
+                              <w:rFonts w:ascii="Arial" w:eastAsia="Arial" w:hAnsi="Arial" w:cs="Arial"/>
+                              <w:b/>
+                              <w:bCs/>
+                              <w:sz w:val="16"/>
+                              <w:szCs w:val="16"/>
+                            </w:rPr>
+                            <w:t xml:space="preserve">6.0 Walk-In + Fee</w:t>
+                          </w:r>
+                        </w:p>
+                      </wps:txbxContent>
+                    </wps:txbx>
+                    <wps:bodyPr horzOverflow="overflow" vert="horz" lIns="0" tIns="0" rIns="0" bIns="0" rtlCol="0">
+                      <a:noAutofit/>
+                    </wps:bodyPr>
+                  </wps:wsp>
+                  <wps:wsp>
+                    <wps:cNvPr id="2000025" name="Box 2000025"/>
+                    <wps:cNvSpPr/>
+                    <wps:spPr>
+                      <a:xfrm>
+                        <a:off x="50000" y="2800000"/>
+                        <a:ext cx="1750000" cy="650000"/>
+                      </a:xfrm>
+                      <a:prstGeom prst="rect">
+                        <a:avLst/>
+                      </a:prstGeom>
+                      <a:ln w="19050">
+                        <a:solidFill>
+                          <a:srgbClr val="404040"/>
+                        </a:solidFill>
+                      </a:ln>
+                      <a:solidFill>
+                        <a:srgbClr val="D9EAD3"/>
+                      </a:solidFill>
+                    </wps:spPr>
+                    <wps:txbx>
+                      <wps:txbxContent>
+                        <w:p>
+                          <w:pPr>
+                            <w:jc w:val="center"/>
+                          </w:pPr>
+                          <w:r>
+                            <w:rPr>
+                              <w:rFonts w:ascii="Arial" w:eastAsia="Arial" w:hAnsi="Arial" w:cs="Arial"/>
+                              <w:b/>
+                              <w:bCs/>
+                              <w:sz w:val="16"/>
+                              <w:szCs w:val="16"/>
+                            </w:rPr>
+                            <w:t xml:space="preserve">7.0 Trainer + Sessions</w:t>
+                          </w:r>
+                        </w:p>
+                      </wps:txbxContent>
+                    </wps:txbx>
+                    <wps:bodyPr horzOverflow="overflow" vert="horz" lIns="0" tIns="0" rIns="0" bIns="0" rtlCol="0">
+                      <a:noAutofit/>
+                    </wps:bodyPr>
+                  </wps:wsp>
+                  <wps:wsp>
+                    <wps:cNvPr id="2000026" name="Box 2000026"/>
+                    <wps:cNvSpPr/>
+                    <wps:spPr>
+                      <a:xfrm>
+                        <a:off x="1975000" y="2800000"/>
+                        <a:ext cx="1750000" cy="650000"/>
+                      </a:xfrm>
+                      <a:prstGeom prst="rect">
+                        <a:avLst/>
+                      </a:prstGeom>
+                      <a:ln w="19050">
+                        <a:solidFill>
+                          <a:srgbClr val="404040"/>
+                        </a:solidFill>
+                      </a:ln>
+                      <a:solidFill>
+                        <a:srgbClr val="D9EAD3"/>
+                      </a:solidFill>
+                    </wps:spPr>
+                    <wps:txbx>
+                      <wps:txbxContent>
+                        <w:p>
+                          <w:pPr>
+                            <w:jc w:val="center"/>
+                          </w:pPr>
+                          <w:r>
+                            <w:rPr>
+                              <w:rFonts w:ascii="Arial" w:eastAsia="Arial" w:hAnsi="Arial" w:cs="Arial"/>
+                              <w:b/>
+                              <w:bCs/>
+                              <w:sz w:val="16"/>
+                              <w:szCs w:val="16"/>
+                            </w:rPr>
+                            <w:t xml:space="preserve">8.0 Announce + Msg</w:t>
+                          </w:r>
+                        </w:p>
+                      </wps:txbxContent>
+                    </wps:txbx>
+                    <wps:bodyPr horzOverflow="overflow" vert="horz" lIns="0" tIns="0" rIns="0" bIns="0" rtlCol="0">
+                      <a:noAutofit/>
+                    </wps:bodyPr>
+                  </wps:wsp>
+                  <wps:wsp>
+                    <wps:cNvPr id="2000027" name="Box 2000027"/>
+                    <wps:cNvSpPr/>
+                    <wps:spPr>
+                      <a:xfrm>
+                        <a:off x="3900000" y="2800000"/>
+                        <a:ext cx="1750000" cy="650000"/>
+                      </a:xfrm>
+                      <a:prstGeom prst="rect">
+                        <a:avLst/>
+                      </a:prstGeom>
+                      <a:ln w="19050">
+                        <a:solidFill>
+                          <a:srgbClr val="404040"/>
+                        </a:solidFill>
+                      </a:ln>
+                      <a:solidFill>
+                        <a:srgbClr val="D9EAD3"/>
+                      </a:solidFill>
+                    </wps:spPr>
+                    <wps:txbx>
+                      <wps:txbxContent>
+                        <w:p>
+                          <w:pPr>
+                            <w:jc w:val="center"/>
+                          </w:pPr>
+                          <w:r>
+                            <w:rPr>
+                              <w:rFonts w:ascii="Arial" w:eastAsia="Arial" w:hAnsi="Arial" w:cs="Arial"/>
+                              <w:b/>
+                              <w:bCs/>
+                              <w:sz w:val="16"/>
+                              <w:szCs w:val="16"/>
+                            </w:rPr>
+                            <w:t xml:space="preserve">9.0 Reports</w:t>
+                          </w:r>
+                        </w:p>
+                      </wps:txbxContent>
+                    </wps:txbx>
+                    <wps:bodyPr horzOverflow="overflow" vert="horz" lIns="0" tIns="0" rIns="0" bIns="0" rtlCol="0">
+                      <a:noAutofit/>
+                    </wps:bodyPr>
+                  </wps:wsp>
+                  <wps:wsp>
+                    <wps:cNvPr id="2000028" name="Box 2000028"/>
+                    <wps:cNvSpPr/>
+                    <wps:spPr>
+                      <a:xfrm>
+                        <a:off x="50000" y="3900000"/>
+                        <a:ext cx="1300000" cy="600000"/>
+                      </a:xfrm>
+                      <a:prstGeom prst="rect">
+                        <a:avLst/>
+                      </a:prstGeom>
+                      <a:ln w="19050">
+                        <a:solidFill>
+                          <a:srgbClr val="404040"/>
+                        </a:solidFill>
+                      </a:ln>
+                      <a:solidFill>
+                        <a:srgbClr val="F2F2F2"/>
+                      </a:solidFill>
+                    </wps:spPr>
+                    <wps:txbx>
+                      <wps:txbxContent>
+                        <w:p>
+                          <w:pPr>
+                            <w:jc w:val="center"/>
+                          </w:pPr>
+                          <w:r>
+                            <w:rPr>
+                              <w:rFonts w:ascii="Arial" w:eastAsia="Arial" w:hAnsi="Arial" w:cs="Arial"/>
+                              <w:b/>
+                              <w:bCs/>
+                              <w:sz w:val="14"/>
+                              <w:szCs w:val="14"/>
+                            </w:rPr>
+                            <w:t xml:space="preserve">D1-D3 Users/Members/Plans</w:t>
+                          </w:r>
+                        </w:p>
+                      </wps:txbxContent>
+                    </wps:txbx>
+                    <wps:bodyPr horzOverflow="overflow" vert="horz" lIns="0" tIns="0" rIns="0" bIns="0" rtlCol="0">
+                      <a:noAutofit/>
+                    </wps:bodyPr>
+                  </wps:wsp>
+                  <wps:wsp>
+                    <wps:cNvPr id="2000029" name="Box 2000029"/>
+                    <wps:cNvSpPr/>
+                    <wps:spPr>
+                      <a:xfrm>
+                        <a:off x="1475000" y="3900000"/>
+                        <a:ext cx="1300000" cy="600000"/>
+                      </a:xfrm>
+                      <a:prstGeom prst="rect">
+                        <a:avLst/>
+                      </a:prstGeom>
+                      <a:ln w="19050">
+                        <a:solidFill>
+                          <a:srgbClr val="404040"/>
+                        </a:solidFill>
+                      </a:ln>
+                      <a:solidFill>
+                        <a:srgbClr val="F2F2F2"/>
+                      </a:solidFill>
+                    </wps:spPr>
+                    <wps:txbx>
+                      <wps:txbxContent>
+                        <w:p>
+                          <w:pPr>
+                            <w:jc w:val="center"/>
+                          </w:pPr>
+                          <w:r>
+                            <w:rPr>
+                              <w:rFonts w:ascii="Arial" w:eastAsia="Arial" w:hAnsi="Arial" w:cs="Arial"/>
+                              <w:b/>
+                              <w:bCs/>
+                              <w:sz w:val="14"/>
+                              <w:szCs w:val="14"/>
+                            </w:rPr>
+                            <w:t xml:space="preserve">D4-D7 Payments/Attend/Walkin/Sessions</w:t>
+                          </w:r>
+                        </w:p>
+                      </wps:txbxContent>
+                    </wps:txbx>
+                    <wps:bodyPr horzOverflow="overflow" vert="horz" lIns="0" tIns="0" rIns="0" bIns="0" rtlCol="0">
+                      <a:noAutofit/>
+                    </wps:bodyPr>
+                  </wps:wsp>
+                  <wps:wsp>
+                    <wps:cNvPr id="2000030" name="Box 2000030"/>
+                    <wps:cNvSpPr/>
+                    <wps:spPr>
+                      <a:xfrm>
+                        <a:off x="2900000" y="3900000"/>
+                        <a:ext cx="1300000" cy="600000"/>
+                      </a:xfrm>
+                      <a:prstGeom prst="rect">
+                        <a:avLst/>
+                      </a:prstGeom>
+                      <a:ln w="19050">
+                        <a:solidFill>
+                          <a:srgbClr val="404040"/>
+                        </a:solidFill>
+                      </a:ln>
+                      <a:solidFill>
+                        <a:srgbClr val="F2F2F2"/>
+                      </a:solidFill>
+                    </wps:spPr>
+                    <wps:txbx>
+                      <wps:txbxContent>
+                        <w:p>
+                          <w:pPr>
+                            <w:jc w:val="center"/>
+                          </w:pPr>
+                          <w:r>
+                            <w:rPr>
+                              <w:rFonts w:ascii="Arial" w:eastAsia="Arial" w:hAnsi="Arial" w:cs="Arial"/>
+                              <w:b/>
+                              <w:bCs/>
+                              <w:sz w:val="14"/>
+                              <w:szCs w:val="14"/>
+                            </w:rPr>
+                            <w:t xml:space="preserve">D8-D12 Comms/Workouts/Settings/Log</w:t>
+                          </w:r>
+                        </w:p>
+                      </wps:txbxContent>
+                    </wps:txbx>
+                    <wps:bodyPr horzOverflow="overflow" vert="horz" lIns="0" tIns="0" rIns="0" bIns="0" rtlCol="0">
+                      <a:noAutofit/>
+                    </wps:bodyPr>
+                  </wps:wsp>
+                  <wps:wsp>
+                    <wps:cNvPr id="2000031" name="Box 2000031"/>
+                    <wps:cNvSpPr/>
+                    <wps:spPr>
+                      <a:xfrm>
+                        <a:off x="4325000" y="3900000"/>
+                        <a:ext cx="1300000" cy="600000"/>
+                      </a:xfrm>
+                      <a:prstGeom prst="rect">
+                        <a:avLst/>
+                      </a:prstGeom>
+                      <a:ln w="19050">
+                        <a:solidFill>
+                          <a:srgbClr val="404040"/>
+                        </a:solidFill>
+                      </a:ln>
+                      <a:solidFill>
+                        <a:srgbClr val="F2F2F2"/>
+                      </a:solidFill>
+                    </wps:spPr>
+                    <wps:txbx>
+                      <wps:txbxContent>
+                        <w:p>
+                          <w:pPr>
+                            <w:jc w:val="center"/>
+                          </w:pPr>
+                          <w:r>
+                            <w:rPr>
+                              <w:rFonts w:ascii="Arial" w:eastAsia="Arial" w:hAnsi="Arial" w:cs="Arial"/>
+                              <w:b/>
+                              <w:bCs/>
+                              <w:sz w:val="16"/>
+                              <w:szCs w:val="16"/>
+                            </w:rPr>
+                            <w:t xml:space="preserve">Firebase Auth</w:t>
+                          </w:r>
+                        </w:p>
+                      </wps:txbxContent>
+                    </wps:txbx>
+                    <wps:bodyPr horzOverflow="overflow" vert="horz" lIns="0" tIns="0" rIns="0" bIns="0" rtlCol="0">
+                      <a:noAutofit/>
+                    </wps:bodyPr>
+                  </wps:wsp>
+                  <wps:wsp>
+                    <wps:cNvPr id="2000032" name="Arrow 2000032"/>
+                    <wps:cNvSpPr/>
+                    <wps:spPr>
+                      <a:xfrm>
+                        <a:off x="700000" y="650000"/>
+                        <a:ext cx="0" cy="450000"/>
+                      </a:xfrm>
+                      <a:custGeom>
+                        <a:avLst/>
+                        <a:gdLst/>
+                        <a:ahLst/>
+                        <a:cxnLst/>
+                        <a:rect l="0" t="0" r="0" b="0"/>
+                        <a:pathLst>
+                          <a:path h="450000" w="450000">
+                            <a:moveTo>
+                              <a:pt x="0" y="0"/>
+                            </a:moveTo>
+                            <a:lnTo>
+                              <a:pt x="0" y="450000"/>
+                            </a:lnTo>
+                          </a:path>
+                        </a:pathLst>
+                      </a:custGeom>
+                      <a:ln w="12700" cap="flat">
+                        <a:solidFill>
+                          <a:srgbClr val="404040"/>
+                        </a:solidFill>
+                        <a:headEnd ty="triangle" w="med" len="med"/>
+                        <a:tailEnd ty="triangle" w="med" len="med"/>
+                      </a:ln>
+                    </wps:spPr>
+                    <wps:bodyPr/>
+                  </wps:wsp>
+                  <wps:wsp>
+                    <wps:cNvPr id="2000033" name="Arrow 2000033"/>
+                    <wps:cNvSpPr/>
+                    <wps:spPr>
+                      <a:xfrm>
+                        <a:off x="2125000" y="650000"/>
+                        <a:ext cx="0" cy="450000"/>
+                      </a:xfrm>
+                      <a:custGeom>
+                        <a:avLst/>
+                        <a:gdLst/>
+                        <a:ahLst/>
+                        <a:cxnLst/>
+                        <a:rect l="0" t="0" r="0" b="0"/>
+                        <a:pathLst>
+                          <a:path h="450000" w="450000">
+                            <a:moveTo>
+                              <a:pt x="0" y="0"/>
+                            </a:moveTo>
+                            <a:lnTo>
+                              <a:pt x="0" y="450000"/>
+                            </a:lnTo>
+                          </a:path>
+                        </a:pathLst>
+                      </a:custGeom>
+                      <a:ln w="12700" cap="flat">
+                        <a:solidFill>
+                          <a:srgbClr val="404040"/>
+                        </a:solidFill>
+                        <a:headEnd ty="triangle" w="med" len="med"/>
+                        <a:tailEnd ty="triangle" w="med" len="med"/>
+                      </a:ln>
+                    </wps:spPr>
+                    <wps:bodyPr/>
+                  </wps:wsp>
+                  <wps:wsp>
+                    <wps:cNvPr id="2000034" name="Arrow 2000034"/>
+                    <wps:cNvSpPr/>
+                    <wps:spPr>
+                      <a:xfrm>
+                        <a:off x="3550000" y="650000"/>
+                        <a:ext cx="0" cy="450000"/>
+                      </a:xfrm>
+                      <a:custGeom>
+                        <a:avLst/>
+                        <a:gdLst/>
+                        <a:ahLst/>
+                        <a:cxnLst/>
+                        <a:rect l="0" t="0" r="0" b="0"/>
+                        <a:pathLst>
+                          <a:path h="450000" w="450000">
+                            <a:moveTo>
+                              <a:pt x="0" y="0"/>
+                            </a:moveTo>
+                            <a:lnTo>
+                              <a:pt x="0" y="450000"/>
+                            </a:lnTo>
+                          </a:path>
+                        </a:pathLst>
+                      </a:custGeom>
+                      <a:ln w="12700" cap="flat">
+                        <a:solidFill>
+                          <a:srgbClr val="404040"/>
+                        </a:solidFill>
+                        <a:headEnd ty="triangle" w="med" len="med"/>
+                        <a:tailEnd ty="triangle" w="med" len="med"/>
+                      </a:ln>
+                    </wps:spPr>
+                    <wps:bodyPr/>
+                  </wps:wsp>
+                  <wps:wsp>
+                    <wps:cNvPr id="2000035" name="Arrow 2000035"/>
+                    <wps:cNvSpPr/>
+                    <wps:spPr>
+                      <a:xfrm>
+                        <a:off x="4975000" y="650000"/>
+                        <a:ext cx="0" cy="450000"/>
+                      </a:xfrm>
+                      <a:custGeom>
+                        <a:avLst/>
+                        <a:gdLst/>
+                        <a:ahLst/>
+                        <a:cxnLst/>
+                        <a:rect l="0" t="0" r="0" b="0"/>
+                        <a:pathLst>
+                          <a:path h="450000" w="450000">
+                            <a:moveTo>
+                              <a:pt x="0" y="0"/>
+                            </a:moveTo>
+                            <a:lnTo>
+                              <a:pt x="0" y="450000"/>
+                            </a:lnTo>
+                          </a:path>
+                        </a:pathLst>
+                      </a:custGeom>
+                      <a:ln w="12700" cap="flat">
+                        <a:solidFill>
+                          <a:srgbClr val="404040"/>
+                        </a:solidFill>
+                        <a:headEnd ty="triangle" w="med" len="med"/>
+                        <a:tailEnd ty="triangle" w="med" len="med"/>
+                      </a:ln>
+                    </wps:spPr>
+                    <wps:bodyPr/>
+                  </wps:wsp>
+                  <wps:wsp>
+                    <wps:cNvPr id="2000036" name="Arrow 2000036"/>
+                    <wps:cNvSpPr/>
+                    <wps:spPr>
+                      <a:xfrm>
+                        <a:off x="925000" y="3450000"/>
+                        <a:ext cx="0" cy="450000"/>
+                      </a:xfrm>
+                      <a:custGeom>
+                        <a:avLst/>
+                        <a:gdLst/>
+                        <a:ahLst/>
+                        <a:cxnLst/>
+                        <a:rect l="0" t="0" r="0" b="0"/>
+                        <a:pathLst>
+                          <a:path h="450000" w="450000">
+                            <a:moveTo>
+                              <a:pt x="0" y="0"/>
+                            </a:moveTo>
+                            <a:lnTo>
+                              <a:pt x="0" y="450000"/>
+                            </a:lnTo>
+                          </a:path>
+                        </a:pathLst>
+                      </a:custGeom>
+                      <a:ln w="12700" cap="flat">
+                        <a:solidFill>
+                          <a:srgbClr val="404040"/>
+                        </a:solidFill>
+                        <a:headEnd ty="triangle" w="med" len="med"/>
+                        <a:tailEnd ty="triangle" w="med" len="med"/>
+                      </a:ln>
+                    </wps:spPr>
+                    <wps:bodyPr/>
+                  </wps:wsp>
+                  <wps:wsp>
+                    <wps:cNvPr id="2000037" name="Arrow 2000037"/>
+                    <wps:cNvSpPr/>
+                    <wps:spPr>
+                      <a:xfrm>
+                        <a:off x="2850000" y="3450000"/>
+                        <a:ext cx="0" cy="450000"/>
+                      </a:xfrm>
+                      <a:custGeom>
+                        <a:avLst/>
+                        <a:gdLst/>
+                        <a:ahLst/>
+                        <a:cxnLst/>
+                        <a:rect l="0" t="0" r="0" b="0"/>
+                        <a:pathLst>
+                          <a:path h="450000" w="450000">
+                            <a:moveTo>
+                              <a:pt x="0" y="0"/>
+                            </a:moveTo>
+                            <a:lnTo>
+                              <a:pt x="0" y="450000"/>
+                            </a:lnTo>
+                          </a:path>
+                        </a:pathLst>
+                      </a:custGeom>
+                      <a:ln w="12700" cap="flat">
+                        <a:solidFill>
+                          <a:srgbClr val="404040"/>
+                        </a:solidFill>
+                        <a:headEnd ty="triangle" w="med" len="med"/>
+                        <a:tailEnd ty="triangle" w="med" len="med"/>
+                      </a:ln>
+                    </wps:spPr>
+                    <wps:bodyPr/>
+                  </wps:wsp>
+                  <wps:wsp>
+                    <wps:cNvPr id="2000038" name="Arrow 2000038"/>
+                    <wps:cNvSpPr/>
+                    <wps:spPr>
+                      <a:xfrm>
+                        <a:off x="4775000" y="3450000"/>
+                        <a:ext cx="0" cy="450000"/>
+                      </a:xfrm>
+                      <a:custGeom>
+                        <a:avLst/>
+                        <a:gdLst/>
+                        <a:ahLst/>
+                        <a:cxnLst/>
+                        <a:rect l="0" t="0" r="0" b="0"/>
+                        <a:pathLst>
+                          <a:path h="450000" w="450000">
+                            <a:moveTo>
+                              <a:pt x="0" y="0"/>
+                            </a:moveTo>
+                            <a:lnTo>
+                              <a:pt x="0" y="450000"/>
+                            </a:lnTo>
+                          </a:path>
+                        </a:pathLst>
+                      </a:custGeom>
+                      <a:ln w="12700" cap="flat">
+                        <a:solidFill>
+                          <a:srgbClr val="404040"/>
+                        </a:solidFill>
+                        <a:headEnd ty="triangle" w="med" len="med"/>
+                        <a:tailEnd ty="triangle" w="med" len="med"/>
+                      </a:ln>
+                    </wps:spPr>
+                    <wps:bodyPr/>
+                  </wps:wsp>
+                </wpg:wgp>
+              </a:graphicData>
+            </a:graphic>
+          </wp:anchor>
+        </w:drawing>
+      </w:r>
+    </w:p>
     <w:p>
       <w:pPr>
         <w:spacing w:line="360" w:lineRule="auto"/>

</xml_diff>

<commit_message>
Fix drawn DFD: schema-correct shapes with content + 4 roles wording
</commit_message>
<xml_diff>
--- a/FITCORE_DFD.docx
+++ b/FITCORE_DFD.docx
@@ -1242,7 +1242,7 @@
           <w:sz w:val="24"/>
           <w:szCs w:val="24"/>
         </w:rPr>
-        <w:t xml:space="preserve">This document presents the Data Flow Diagram (DFD) of FitCore: A Web-Based Gym Management System (Cloud Firestore project fitcoregym-1019f). It contains the Level 0 context diagram, the Level 1 decomposition into nine processes, and the data dictionary of data stores and data flows. Every process, store, and flow below matches the implemented system: five external roles (Guest, Member, Trainer, Staff, and Admin), Firebase Authentication, and eighteen Cloud Firestore collections.</w:t>
+        <w:t xml:space="preserve">This document presents the Data Flow Diagram (DFD) of FitCore: A Web-Based Gym Management System (Cloud Firestore project fitcoregym-1019f). It contains the Level 0 context diagram, the Level 1 decomposition into nine processes, and the data dictionary of data stores and data flows. Every process, store, and flow below matches the implemented system: four user roles (Admin, Staff, Trainer, and Member) plus Guest visitors, Firebase Authentication, and eighteen Cloud Firestore collections.</w:t>
       </w:r>
       <w:r>
         <w:rPr>
@@ -1338,7 +1338,7 @@
     <w:p>
       <w:r>
         <w:drawing>
-          <wp:anchor distT="0" distB="0" distL="114300" distR="114300" simplePos="0" relativeHeight="251679744" behindDoc="0" locked="0" layoutInCell="1" allowOverlap="1" wp14:anchorId="001E848D" wp14:editId="001E848E">
+          <wp:anchor distT="0" distB="0" distL="114300" distR="114300" simplePos="0" relativeHeight="251679744" behindDoc="0" locked="0" layoutInCell="1" allowOverlap="1" wp14:anchorId="002DC6E5" wp14:editId="002DC6E6">
             <wp:simplePos x="0" y="0"/>
             <wp:positionH relativeFrom="column">
               <wp:posOffset>19050</wp:posOffset>
@@ -1349,7 +1349,7 @@
             <wp:extent cx="5700000" cy="3600000"/>
             <wp:effectExtent l="0" t="0" r="0" b="10160"/>
             <wp:wrapTopAndBottom/>
-            <wp:docPr id="2000014" name="DFD Figure"/>
+            <wp:docPr id="3000038" name="DFD Figure"/>
             <wp:cNvGraphicFramePr/>
             <a:graphic xmlns:a="http://schemas.openxmlformats.org/drawingml/2006/main">
               <a:graphicData uri="http://schemas.microsoft.com/office/word/2010/wordprocessingGroup">
@@ -1364,7 +1364,7 @@
                     </a:xfrm>
                   </wpg:grpSpPr>
                   <wps:wsp>
-                    <wps:cNvPr id="2000001" name="Box 2000001"/>
+                    <wps:cNvPr id="3000001" name="Box 3000001"/>
                     <wps:cNvSpPr/>
                     <wps:spPr>
                       <a:xfrm>
@@ -1374,14 +1374,14 @@
                       <a:prstGeom prst="rect">
                         <a:avLst/>
                       </a:prstGeom>
+                      <a:solidFill>
+                        <a:srgbClr val="F2F2F2"/>
+                      </a:solidFill>
                       <a:ln w="19050">
                         <a:solidFill>
                           <a:srgbClr val="404040"/>
                         </a:solidFill>
                       </a:ln>
-                      <a:solidFill>
-                        <a:srgbClr val="F2F2F2"/>
-                      </a:solidFill>
                     </wps:spPr>
                     <wps:txbx>
                       <wps:txbxContent>
@@ -1407,7 +1407,7 @@
                     </wps:bodyPr>
                   </wps:wsp>
                   <wps:wsp>
-                    <wps:cNvPr id="2000002" name="Box 2000002"/>
+                    <wps:cNvPr id="3000002" name="Box 3000002"/>
                     <wps:cNvSpPr/>
                     <wps:spPr>
                       <a:xfrm>
@@ -1417,14 +1417,14 @@
                       <a:prstGeom prst="rect">
                         <a:avLst/>
                       </a:prstGeom>
+                      <a:solidFill>
+                        <a:srgbClr val="F2F2F2"/>
+                      </a:solidFill>
                       <a:ln w="19050">
                         <a:solidFill>
                           <a:srgbClr val="404040"/>
                         </a:solidFill>
                       </a:ln>
-                      <a:solidFill>
-                        <a:srgbClr val="F2F2F2"/>
-                      </a:solidFill>
                     </wps:spPr>
                     <wps:txbx>
                       <wps:txbxContent>
@@ -1450,7 +1450,7 @@
                     </wps:bodyPr>
                   </wps:wsp>
                   <wps:wsp>
-                    <wps:cNvPr id="2000003" name="Box 2000003"/>
+                    <wps:cNvPr id="3000003" name="Box 3000003"/>
                     <wps:cNvSpPr/>
                     <wps:spPr>
                       <a:xfrm>
@@ -1460,14 +1460,14 @@
                       <a:prstGeom prst="rect">
                         <a:avLst/>
                       </a:prstGeom>
+                      <a:solidFill>
+                        <a:srgbClr val="D9EAD3"/>
+                      </a:solidFill>
                       <a:ln w="19050">
                         <a:solidFill>
                           <a:srgbClr val="404040"/>
                         </a:solidFill>
                       </a:ln>
-                      <a:solidFill>
-                        <a:srgbClr val="D9EAD3"/>
-                      </a:solidFill>
                     </wps:spPr>
                     <wps:txbx>
                       <wps:txbxContent>
@@ -1493,7 +1493,7 @@
                     </wps:bodyPr>
                   </wps:wsp>
                   <wps:wsp>
-                    <wps:cNvPr id="2000004" name="Box 2000004"/>
+                    <wps:cNvPr id="3000004" name="Box 3000004"/>
                     <wps:cNvSpPr/>
                     <wps:spPr>
                       <a:xfrm>
@@ -1503,14 +1503,14 @@
                       <a:prstGeom prst="rect">
                         <a:avLst/>
                       </a:prstGeom>
+                      <a:solidFill>
+                        <a:srgbClr val="F2F2F2"/>
+                      </a:solidFill>
                       <a:ln w="19050">
                         <a:solidFill>
                           <a:srgbClr val="404040"/>
                         </a:solidFill>
                       </a:ln>
-                      <a:solidFill>
-                        <a:srgbClr val="F2F2F2"/>
-                      </a:solidFill>
                     </wps:spPr>
                     <wps:txbx>
                       <wps:txbxContent>
@@ -1536,7 +1536,7 @@
                     </wps:bodyPr>
                   </wps:wsp>
                   <wps:wsp>
-                    <wps:cNvPr id="2000005" name="Box 2000005"/>
+                    <wps:cNvPr id="3000005" name="Box 3000005"/>
                     <wps:cNvSpPr/>
                     <wps:spPr>
                       <a:xfrm>
@@ -1546,14 +1546,14 @@
                       <a:prstGeom prst="rect">
                         <a:avLst/>
                       </a:prstGeom>
+                      <a:solidFill>
+                        <a:srgbClr val="F2F2F2"/>
+                      </a:solidFill>
                       <a:ln w="19050">
                         <a:solidFill>
                           <a:srgbClr val="404040"/>
                         </a:solidFill>
                       </a:ln>
-                      <a:solidFill>
-                        <a:srgbClr val="F2F2F2"/>
-                      </a:solidFill>
                     </wps:spPr>
                     <wps:txbx>
                       <wps:txbxContent>
@@ -1579,7 +1579,7 @@
                     </wps:bodyPr>
                   </wps:wsp>
                   <wps:wsp>
-                    <wps:cNvPr id="2000006" name="Box 2000006"/>
+                    <wps:cNvPr id="3000006" name="Box 3000006"/>
                     <wps:cNvSpPr/>
                     <wps:spPr>
                       <a:xfrm>
@@ -1589,14 +1589,14 @@
                       <a:prstGeom prst="rect">
                         <a:avLst/>
                       </a:prstGeom>
+                      <a:solidFill>
+                        <a:srgbClr val="F2F2F2"/>
+                      </a:solidFill>
                       <a:ln w="19050">
                         <a:solidFill>
                           <a:srgbClr val="404040"/>
                         </a:solidFill>
                       </a:ln>
-                      <a:solidFill>
-                        <a:srgbClr val="F2F2F2"/>
-                      </a:solidFill>
                     </wps:spPr>
                     <wps:txbx>
                       <wps:txbxContent>
@@ -1622,7 +1622,7 @@
                     </wps:bodyPr>
                   </wps:wsp>
                   <wps:wsp>
-                    <wps:cNvPr id="2000007" name="Arrow 2000007"/>
+                    <wps:cNvPr id="3000007" name="Arrow 3000007"/>
                     <wps:cNvSpPr/>
                     <wps:spPr>
                       <a:xfrm>
@@ -1657,7 +1657,7 @@
                     <wps:bodyPr/>
                   </wps:wsp>
                   <wps:wsp>
-                    <wps:cNvPr id="2000008" name="Arrow 2000008"/>
+                    <wps:cNvPr id="3000008" name="Arrow 3000008"/>
                     <wps:cNvSpPr/>
                     <wps:spPr>
                       <a:xfrm>
@@ -1692,7 +1692,7 @@
                     <wps:bodyPr/>
                   </wps:wsp>
                   <wps:wsp>
-                    <wps:cNvPr id="2000009" name="Arrow 2000009"/>
+                    <wps:cNvPr id="3000009" name="Arrow 3000009"/>
                     <wps:cNvSpPr/>
                     <wps:spPr>
                       <a:xfrm>
@@ -1727,7 +1727,7 @@
                     <wps:bodyPr/>
                   </wps:wsp>
                   <wps:wsp>
-                    <wps:cNvPr id="2000010" name="Arrow 2000010"/>
+                    <wps:cNvPr id="3000010" name="Arrow 3000010"/>
                     <wps:cNvSpPr/>
                     <wps:spPr>
                       <a:xfrm>
@@ -1762,7 +1762,7 @@
                     <wps:bodyPr/>
                   </wps:wsp>
                   <wps:wsp>
-                    <wps:cNvPr id="2000011" name="Arrow 2000011"/>
+                    <wps:cNvPr id="3000011" name="Arrow 3000011"/>
                     <wps:cNvSpPr/>
                     <wps:spPr>
                       <a:xfrm>
@@ -2515,7 +2515,7 @@
     <w:p>
       <w:r>
         <w:drawing>
-          <wp:anchor distT="0" distB="0" distL="114300" distR="114300" simplePos="0" relativeHeight="251679744" behindDoc="0" locked="0" layoutInCell="1" allowOverlap="1" wp14:anchorId="001E84A8" wp14:editId="001E84A9">
+          <wp:anchor distT="0" distB="0" distL="114300" distR="114300" simplePos="0" relativeHeight="251679744" behindDoc="0" locked="0" layoutInCell="1" allowOverlap="1" wp14:anchorId="002DC6E8" wp14:editId="002DC6E9">
             <wp:simplePos x="0" y="0"/>
             <wp:positionH relativeFrom="column">
               <wp:posOffset>19050</wp:posOffset>
@@ -2526,7 +2526,7 @@
             <wp:extent cx="5700000" cy="4800000"/>
             <wp:effectExtent l="0" t="0" r="0" b="10160"/>
             <wp:wrapTopAndBottom/>
-            <wp:docPr id="2000041" name="DFD Figure"/>
+            <wp:docPr id="3000041" name="DFD Figure"/>
             <wp:cNvGraphicFramePr/>
             <a:graphic xmlns:a="http://schemas.openxmlformats.org/drawingml/2006/main">
               <a:graphicData uri="http://schemas.microsoft.com/office/word/2010/wordprocessingGroup">
@@ -2541,7 +2541,7 @@
                     </a:xfrm>
                   </wpg:grpSpPr>
                   <wps:wsp>
-                    <wps:cNvPr id="2000015" name="Box 2000015"/>
+                    <wps:cNvPr id="3000012" name="Box 3000012"/>
                     <wps:cNvSpPr/>
                     <wps:spPr>
                       <a:xfrm>
@@ -2551,14 +2551,14 @@
                       <a:prstGeom prst="rect">
                         <a:avLst/>
                       </a:prstGeom>
+                      <a:solidFill>
+                        <a:srgbClr val="F2F2F2"/>
+                      </a:solidFill>
                       <a:ln w="19050">
                         <a:solidFill>
                           <a:srgbClr val="404040"/>
                         </a:solidFill>
                       </a:ln>
-                      <a:solidFill>
-                        <a:srgbClr val="F2F2F2"/>
-                      </a:solidFill>
                     </wps:spPr>
                     <wps:txbx>
                       <wps:txbxContent>
@@ -2584,7 +2584,7 @@
                     </wps:bodyPr>
                   </wps:wsp>
                   <wps:wsp>
-                    <wps:cNvPr id="2000016" name="Box 2000016"/>
+                    <wps:cNvPr id="3000013" name="Box 3000013"/>
                     <wps:cNvSpPr/>
                     <wps:spPr>
                       <a:xfrm>
@@ -2594,14 +2594,14 @@
                       <a:prstGeom prst="rect">
                         <a:avLst/>
                       </a:prstGeom>
+                      <a:solidFill>
+                        <a:srgbClr val="F2F2F2"/>
+                      </a:solidFill>
                       <a:ln w="19050">
                         <a:solidFill>
                           <a:srgbClr val="404040"/>
                         </a:solidFill>
                       </a:ln>
-                      <a:solidFill>
-                        <a:srgbClr val="F2F2F2"/>
-                      </a:solidFill>
                     </wps:spPr>
                     <wps:txbx>
                       <wps:txbxContent>
@@ -2627,7 +2627,7 @@
                     </wps:bodyPr>
                   </wps:wsp>
                   <wps:wsp>
-                    <wps:cNvPr id="2000017" name="Box 2000017"/>
+                    <wps:cNvPr id="3000014" name="Box 3000014"/>
                     <wps:cNvSpPr/>
                     <wps:spPr>
                       <a:xfrm>
@@ -2637,14 +2637,14 @@
                       <a:prstGeom prst="rect">
                         <a:avLst/>
                       </a:prstGeom>
+                      <a:solidFill>
+                        <a:srgbClr val="F2F2F2"/>
+                      </a:solidFill>
                       <a:ln w="19050">
                         <a:solidFill>
                           <a:srgbClr val="404040"/>
                         </a:solidFill>
                       </a:ln>
-                      <a:solidFill>
-                        <a:srgbClr val="F2F2F2"/>
-                      </a:solidFill>
                     </wps:spPr>
                     <wps:txbx>
                       <wps:txbxContent>
@@ -2670,7 +2670,7 @@
                     </wps:bodyPr>
                   </wps:wsp>
                   <wps:wsp>
-                    <wps:cNvPr id="2000018" name="Box 2000018"/>
+                    <wps:cNvPr id="3000015" name="Box 3000015"/>
                     <wps:cNvSpPr/>
                     <wps:spPr>
                       <a:xfrm>
@@ -2680,14 +2680,14 @@
                       <a:prstGeom prst="rect">
                         <a:avLst/>
                       </a:prstGeom>
+                      <a:solidFill>
+                        <a:srgbClr val="F2F2F2"/>
+                      </a:solidFill>
                       <a:ln w="19050">
                         <a:solidFill>
                           <a:srgbClr val="404040"/>
                         </a:solidFill>
                       </a:ln>
-                      <a:solidFill>
-                        <a:srgbClr val="F2F2F2"/>
-                      </a:solidFill>
                     </wps:spPr>
                     <wps:txbx>
                       <wps:txbxContent>
@@ -2713,7 +2713,7 @@
                     </wps:bodyPr>
                   </wps:wsp>
                   <wps:wsp>
-                    <wps:cNvPr id="2000019" name="Box 2000019"/>
+                    <wps:cNvPr id="3000016" name="Box 3000016"/>
                     <wps:cNvSpPr/>
                     <wps:spPr>
                       <a:xfrm>
@@ -2723,14 +2723,14 @@
                       <a:prstGeom prst="rect">
                         <a:avLst/>
                       </a:prstGeom>
+                      <a:solidFill>
+                        <a:srgbClr val="D9EAD3"/>
+                      </a:solidFill>
                       <a:ln w="19050">
                         <a:solidFill>
                           <a:srgbClr val="404040"/>
                         </a:solidFill>
                       </a:ln>
-                      <a:solidFill>
-                        <a:srgbClr val="D9EAD3"/>
-                      </a:solidFill>
                     </wps:spPr>
                     <wps:txbx>
                       <wps:txbxContent>
@@ -2756,7 +2756,7 @@
                     </wps:bodyPr>
                   </wps:wsp>
                   <wps:wsp>
-                    <wps:cNvPr id="2000020" name="Box 2000020"/>
+                    <wps:cNvPr id="3000017" name="Box 3000017"/>
                     <wps:cNvSpPr/>
                     <wps:spPr>
                       <a:xfrm>
@@ -2766,14 +2766,14 @@
                       <a:prstGeom prst="rect">
                         <a:avLst/>
                       </a:prstGeom>
+                      <a:solidFill>
+                        <a:srgbClr val="D9EAD3"/>
+                      </a:solidFill>
                       <a:ln w="19050">
                         <a:solidFill>
                           <a:srgbClr val="404040"/>
                         </a:solidFill>
                       </a:ln>
-                      <a:solidFill>
-                        <a:srgbClr val="D9EAD3"/>
-                      </a:solidFill>
                     </wps:spPr>
                     <wps:txbx>
                       <wps:txbxContent>
@@ -2799,7 +2799,7 @@
                     </wps:bodyPr>
                   </wps:wsp>
                   <wps:wsp>
-                    <wps:cNvPr id="2000021" name="Box 2000021"/>
+                    <wps:cNvPr id="3000018" name="Box 3000018"/>
                     <wps:cNvSpPr/>
                     <wps:spPr>
                       <a:xfrm>
@@ -2809,14 +2809,14 @@
                       <a:prstGeom prst="rect">
                         <a:avLst/>
                       </a:prstGeom>
+                      <a:solidFill>
+                        <a:srgbClr val="D9EAD3"/>
+                      </a:solidFill>
                       <a:ln w="19050">
                         <a:solidFill>
                           <a:srgbClr val="404040"/>
                         </a:solidFill>
                       </a:ln>
-                      <a:solidFill>
-                        <a:srgbClr val="D9EAD3"/>
-                      </a:solidFill>
                     </wps:spPr>
                     <wps:txbx>
                       <wps:txbxContent>
@@ -2842,7 +2842,7 @@
                     </wps:bodyPr>
                   </wps:wsp>
                   <wps:wsp>
-                    <wps:cNvPr id="2000022" name="Box 2000022"/>
+                    <wps:cNvPr id="3000019" name="Box 3000019"/>
                     <wps:cNvSpPr/>
                     <wps:spPr>
                       <a:xfrm>
@@ -2852,14 +2852,14 @@
                       <a:prstGeom prst="rect">
                         <a:avLst/>
                       </a:prstGeom>
+                      <a:solidFill>
+                        <a:srgbClr val="D9EAD3"/>
+                      </a:solidFill>
                       <a:ln w="19050">
                         <a:solidFill>
                           <a:srgbClr val="404040"/>
                         </a:solidFill>
                       </a:ln>
-                      <a:solidFill>
-                        <a:srgbClr val="D9EAD3"/>
-                      </a:solidFill>
                     </wps:spPr>
                     <wps:txbx>
                       <wps:txbxContent>
@@ -2885,7 +2885,7 @@
                     </wps:bodyPr>
                   </wps:wsp>
                   <wps:wsp>
-                    <wps:cNvPr id="2000023" name="Box 2000023"/>
+                    <wps:cNvPr id="3000020" name="Box 3000020"/>
                     <wps:cNvSpPr/>
                     <wps:spPr>
                       <a:xfrm>
@@ -2895,14 +2895,14 @@
                       <a:prstGeom prst="rect">
                         <a:avLst/>
                       </a:prstGeom>
+                      <a:solidFill>
+                        <a:srgbClr val="D9EAD3"/>
+                      </a:solidFill>
                       <a:ln w="19050">
                         <a:solidFill>
                           <a:srgbClr val="404040"/>
                         </a:solidFill>
                       </a:ln>
-                      <a:solidFill>
-                        <a:srgbClr val="D9EAD3"/>
-                      </a:solidFill>
                     </wps:spPr>
                     <wps:txbx>
                       <wps:txbxContent>
@@ -2928,7 +2928,7 @@
                     </wps:bodyPr>
                   </wps:wsp>
                   <wps:wsp>
-                    <wps:cNvPr id="2000024" name="Box 2000024"/>
+                    <wps:cNvPr id="3000021" name="Box 3000021"/>
                     <wps:cNvSpPr/>
                     <wps:spPr>
                       <a:xfrm>
@@ -2938,14 +2938,14 @@
                       <a:prstGeom prst="rect">
                         <a:avLst/>
                       </a:prstGeom>
+                      <a:solidFill>
+                        <a:srgbClr val="D9EAD3"/>
+                      </a:solidFill>
                       <a:ln w="19050">
                         <a:solidFill>
                           <a:srgbClr val="404040"/>
                         </a:solidFill>
                       </a:ln>
-                      <a:solidFill>
-                        <a:srgbClr val="D9EAD3"/>
-                      </a:solidFill>
                     </wps:spPr>
                     <wps:txbx>
                       <wps:txbxContent>
@@ -2971,7 +2971,7 @@
                     </wps:bodyPr>
                   </wps:wsp>
                   <wps:wsp>
-                    <wps:cNvPr id="2000025" name="Box 2000025"/>
+                    <wps:cNvPr id="3000022" name="Box 3000022"/>
                     <wps:cNvSpPr/>
                     <wps:spPr>
                       <a:xfrm>
@@ -2981,14 +2981,14 @@
                       <a:prstGeom prst="rect">
                         <a:avLst/>
                       </a:prstGeom>
+                      <a:solidFill>
+                        <a:srgbClr val="D9EAD3"/>
+                      </a:solidFill>
                       <a:ln w="19050">
                         <a:solidFill>
                           <a:srgbClr val="404040"/>
                         </a:solidFill>
                       </a:ln>
-                      <a:solidFill>
-                        <a:srgbClr val="D9EAD3"/>
-                      </a:solidFill>
                     </wps:spPr>
                     <wps:txbx>
                       <wps:txbxContent>
@@ -3014,7 +3014,7 @@
                     </wps:bodyPr>
                   </wps:wsp>
                   <wps:wsp>
-                    <wps:cNvPr id="2000026" name="Box 2000026"/>
+                    <wps:cNvPr id="3000023" name="Box 3000023"/>
                     <wps:cNvSpPr/>
                     <wps:spPr>
                       <a:xfrm>
@@ -3024,14 +3024,14 @@
                       <a:prstGeom prst="rect">
                         <a:avLst/>
                       </a:prstGeom>
+                      <a:solidFill>
+                        <a:srgbClr val="D9EAD3"/>
+                      </a:solidFill>
                       <a:ln w="19050">
                         <a:solidFill>
                           <a:srgbClr val="404040"/>
                         </a:solidFill>
                       </a:ln>
-                      <a:solidFill>
-                        <a:srgbClr val="D9EAD3"/>
-                      </a:solidFill>
                     </wps:spPr>
                     <wps:txbx>
                       <wps:txbxContent>
@@ -3057,7 +3057,7 @@
                     </wps:bodyPr>
                   </wps:wsp>
                   <wps:wsp>
-                    <wps:cNvPr id="2000027" name="Box 2000027"/>
+                    <wps:cNvPr id="3000024" name="Box 3000024"/>
                     <wps:cNvSpPr/>
                     <wps:spPr>
                       <a:xfrm>
@@ -3067,14 +3067,14 @@
                       <a:prstGeom prst="rect">
                         <a:avLst/>
                       </a:prstGeom>
+                      <a:solidFill>
+                        <a:srgbClr val="D9EAD3"/>
+                      </a:solidFill>
                       <a:ln w="19050">
                         <a:solidFill>
                           <a:srgbClr val="404040"/>
                         </a:solidFill>
                       </a:ln>
-                      <a:solidFill>
-                        <a:srgbClr val="D9EAD3"/>
-                      </a:solidFill>
                     </wps:spPr>
                     <wps:txbx>
                       <wps:txbxContent>
@@ -3100,7 +3100,7 @@
                     </wps:bodyPr>
                   </wps:wsp>
                   <wps:wsp>
-                    <wps:cNvPr id="2000028" name="Box 2000028"/>
+                    <wps:cNvPr id="3000025" name="Box 3000025"/>
                     <wps:cNvSpPr/>
                     <wps:spPr>
                       <a:xfrm>
@@ -3110,14 +3110,14 @@
                       <a:prstGeom prst="rect">
                         <a:avLst/>
                       </a:prstGeom>
+                      <a:solidFill>
+                        <a:srgbClr val="F2F2F2"/>
+                      </a:solidFill>
                       <a:ln w="19050">
                         <a:solidFill>
                           <a:srgbClr val="404040"/>
                         </a:solidFill>
                       </a:ln>
-                      <a:solidFill>
-                        <a:srgbClr val="F2F2F2"/>
-                      </a:solidFill>
                     </wps:spPr>
                     <wps:txbx>
                       <wps:txbxContent>
@@ -3143,7 +3143,7 @@
                     </wps:bodyPr>
                   </wps:wsp>
                   <wps:wsp>
-                    <wps:cNvPr id="2000029" name="Box 2000029"/>
+                    <wps:cNvPr id="3000026" name="Box 3000026"/>
                     <wps:cNvSpPr/>
                     <wps:spPr>
                       <a:xfrm>
@@ -3153,14 +3153,14 @@
                       <a:prstGeom prst="rect">
                         <a:avLst/>
                       </a:prstGeom>
+                      <a:solidFill>
+                        <a:srgbClr val="F2F2F2"/>
+                      </a:solidFill>
                       <a:ln w="19050">
                         <a:solidFill>
                           <a:srgbClr val="404040"/>
                         </a:solidFill>
                       </a:ln>
-                      <a:solidFill>
-                        <a:srgbClr val="F2F2F2"/>
-                      </a:solidFill>
                     </wps:spPr>
                     <wps:txbx>
                       <wps:txbxContent>
@@ -3186,7 +3186,7 @@
                     </wps:bodyPr>
                   </wps:wsp>
                   <wps:wsp>
-                    <wps:cNvPr id="2000030" name="Box 2000030"/>
+                    <wps:cNvPr id="3000027" name="Box 3000027"/>
                     <wps:cNvSpPr/>
                     <wps:spPr>
                       <a:xfrm>
@@ -3196,14 +3196,14 @@
                       <a:prstGeom prst="rect">
                         <a:avLst/>
                       </a:prstGeom>
+                      <a:solidFill>
+                        <a:srgbClr val="F2F2F2"/>
+                      </a:solidFill>
                       <a:ln w="19050">
                         <a:solidFill>
                           <a:srgbClr val="404040"/>
                         </a:solidFill>
                       </a:ln>
-                      <a:solidFill>
-                        <a:srgbClr val="F2F2F2"/>
-                      </a:solidFill>
                     </wps:spPr>
                     <wps:txbx>
                       <wps:txbxContent>
@@ -3229,7 +3229,7 @@
                     </wps:bodyPr>
                   </wps:wsp>
                   <wps:wsp>
-                    <wps:cNvPr id="2000031" name="Box 2000031"/>
+                    <wps:cNvPr id="3000028" name="Box 3000028"/>
                     <wps:cNvSpPr/>
                     <wps:spPr>
                       <a:xfrm>
@@ -3239,14 +3239,14 @@
                       <a:prstGeom prst="rect">
                         <a:avLst/>
                       </a:prstGeom>
+                      <a:solidFill>
+                        <a:srgbClr val="F2F2F2"/>
+                      </a:solidFill>
                       <a:ln w="19050">
                         <a:solidFill>
                           <a:srgbClr val="404040"/>
                         </a:solidFill>
                       </a:ln>
-                      <a:solidFill>
-                        <a:srgbClr val="F2F2F2"/>
-                      </a:solidFill>
                     </wps:spPr>
                     <wps:txbx>
                       <wps:txbxContent>
@@ -3272,7 +3272,7 @@
                     </wps:bodyPr>
                   </wps:wsp>
                   <wps:wsp>
-                    <wps:cNvPr id="2000032" name="Arrow 2000032"/>
+                    <wps:cNvPr id="3000029" name="Arrow 3000029"/>
                     <wps:cNvSpPr/>
                     <wps:spPr>
                       <a:xfrm>
@@ -3307,7 +3307,7 @@
                     <wps:bodyPr/>
                   </wps:wsp>
                   <wps:wsp>
-                    <wps:cNvPr id="2000033" name="Arrow 2000033"/>
+                    <wps:cNvPr id="3000030" name="Arrow 3000030"/>
                     <wps:cNvSpPr/>
                     <wps:spPr>
                       <a:xfrm>
@@ -3342,7 +3342,7 @@
                     <wps:bodyPr/>
                   </wps:wsp>
                   <wps:wsp>
-                    <wps:cNvPr id="2000034" name="Arrow 2000034"/>
+                    <wps:cNvPr id="3000031" name="Arrow 3000031"/>
                     <wps:cNvSpPr/>
                     <wps:spPr>
                       <a:xfrm>
@@ -3377,7 +3377,7 @@
                     <wps:bodyPr/>
                   </wps:wsp>
                   <wps:wsp>
-                    <wps:cNvPr id="2000035" name="Arrow 2000035"/>
+                    <wps:cNvPr id="3000032" name="Arrow 3000032"/>
                     <wps:cNvSpPr/>
                     <wps:spPr>
                       <a:xfrm>
@@ -3412,7 +3412,7 @@
                     <wps:bodyPr/>
                   </wps:wsp>
                   <wps:wsp>
-                    <wps:cNvPr id="2000036" name="Arrow 2000036"/>
+                    <wps:cNvPr id="3000033" name="Arrow 3000033"/>
                     <wps:cNvSpPr/>
                     <wps:spPr>
                       <a:xfrm>
@@ -3447,7 +3447,7 @@
                     <wps:bodyPr/>
                   </wps:wsp>
                   <wps:wsp>
-                    <wps:cNvPr id="2000037" name="Arrow 2000037"/>
+                    <wps:cNvPr id="3000034" name="Arrow 3000034"/>
                     <wps:cNvSpPr/>
                     <wps:spPr>
                       <a:xfrm>
@@ -3482,7 +3482,7 @@
                     <wps:bodyPr/>
                   </wps:wsp>
                   <wps:wsp>
-                    <wps:cNvPr id="2000038" name="Arrow 2000038"/>
+                    <wps:cNvPr id="3000035" name="Arrow 3000035"/>
                     <wps:cNvSpPr/>
                     <wps:spPr>
                       <a:xfrm>

</xml_diff>

<commit_message>
Full DFD: 11 processes, Level 2 section with Figure 3 + Table 5, extended dictionary
</commit_message>
<xml_diff>
--- a/FITCORE_DFD.docx
+++ b/FITCORE_DFD.docx
@@ -1242,7 +1242,7 @@
           <w:sz w:val="24"/>
           <w:szCs w:val="24"/>
         </w:rPr>
-        <w:t xml:space="preserve">This document presents the Data Flow Diagram (DFD) of FitCore: A Web-Based Gym Management System (Cloud Firestore project fitcoregym-1019f). It contains the Level 0 context diagram, the Level 1 decomposition into nine processes, and the data dictionary of data stores and data flows. Every process, store, and flow below matches the implemented system: four user roles (Admin, Staff, Trainer, and Member) plus Guest visitors, Firebase Authentication, and eighteen Cloud Firestore collections.</w:t>
+        <w:t xml:space="preserve">This document presents the Data Flow Diagram (DFD) of FitCore: A Web-Based Gym Management System (Cloud Firestore project fitcoregym-1019f). It contains the Level 0 context diagram, the Level 1 decomposition into eleven processes, and the data dictionary of data stores and data flows. Every process, store, and flow below matches the implemented system: four user roles (Admin, Staff, Trainer, and Member) plus Guest visitors, Firebase Authentication, and eighteen Cloud Firestore collections.</w:t>
       </w:r>
       <w:r>
         <w:rPr>
@@ -2515,7 +2515,7 @@
     <w:p>
       <w:r>
         <w:drawing>
-          <wp:anchor distT="0" distB="0" distL="114300" distR="114300" simplePos="0" relativeHeight="251679744" behindDoc="0" locked="0" layoutInCell="1" allowOverlap="1" wp14:anchorId="002DC6E8" wp14:editId="002DC6E9">
+          <wp:anchor distT="0" distB="0" distL="114300" distR="114300" simplePos="0" relativeHeight="251679744" behindDoc="0" locked="0" layoutInCell="1" allowOverlap="1" wp14:anchorId="003D091C" wp14:editId="003D091D">
             <wp:simplePos x="0" y="0"/>
             <wp:positionH relativeFrom="column">
               <wp:posOffset>19050</wp:posOffset>
@@ -2523,10 +2523,10 @@
             <wp:positionV relativeFrom="paragraph">
               <wp:posOffset>179070</wp:posOffset>
             </wp:positionV>
-            <wp:extent cx="5700000" cy="4800000"/>
+            <wp:extent cx="5700000" cy="4600000"/>
             <wp:effectExtent l="0" t="0" r="0" b="10160"/>
             <wp:wrapTopAndBottom/>
-            <wp:docPr id="3000041" name="DFD Figure"/>
+            <wp:docPr id="4000029" name="DFD Figure"/>
             <wp:cNvGraphicFramePr/>
             <a:graphic xmlns:a="http://schemas.openxmlformats.org/drawingml/2006/main">
               <a:graphicData uri="http://schemas.microsoft.com/office/word/2010/wordprocessingGroup">
@@ -2535,13 +2535,13 @@
                   <wpg:grpSpPr>
                     <a:xfrm>
                       <a:off x="0" y="0"/>
-                      <a:ext cx="5700000" cy="4800000"/>
+                      <a:ext cx="5700000" cy="4600000"/>
                       <a:chOff x="0" y="0"/>
-                      <a:chExt cx="5700000" cy="4800000"/>
+                      <a:chExt cx="5700000" cy="4600000"/>
                     </a:xfrm>
                   </wpg:grpSpPr>
                   <wps:wsp>
-                    <wps:cNvPr id="3000012" name="Box 3000012"/>
+                    <wps:cNvPr id="4000001" name="Box 4000001"/>
                     <wps:cNvSpPr/>
                     <wps:spPr>
                       <a:xfrm>
@@ -2584,7 +2584,7 @@
                     </wps:bodyPr>
                   </wps:wsp>
                   <wps:wsp>
-                    <wps:cNvPr id="3000013" name="Box 3000013"/>
+                    <wps:cNvPr id="4000002" name="Box 4000002"/>
                     <wps:cNvSpPr/>
                     <wps:spPr>
                       <a:xfrm>
@@ -2627,7 +2627,7 @@
                     </wps:bodyPr>
                   </wps:wsp>
                   <wps:wsp>
-                    <wps:cNvPr id="3000014" name="Box 3000014"/>
+                    <wps:cNvPr id="4000003" name="Box 4000003"/>
                     <wps:cNvSpPr/>
                     <wps:spPr>
                       <a:xfrm>
@@ -2670,7 +2670,7 @@
                     </wps:bodyPr>
                   </wps:wsp>
                   <wps:wsp>
-                    <wps:cNvPr id="3000015" name="Box 3000015"/>
+                    <wps:cNvPr id="4000004" name="Box 4000004"/>
                     <wps:cNvSpPr/>
                     <wps:spPr>
                       <a:xfrm>
@@ -2713,12 +2713,12 @@
                     </wps:bodyPr>
                   </wps:wsp>
                   <wps:wsp>
-                    <wps:cNvPr id="3000016" name="Box 3000016"/>
+                    <wps:cNvPr id="4000005" name="Box 4000005"/>
                     <wps:cNvSpPr/>
                     <wps:spPr>
                       <a:xfrm>
-                        <a:off x="50000" y="1100000"/>
-                        <a:ext cx="1750000" cy="650000"/>
+                        <a:off x="50000" y="1000000"/>
+                        <a:ext cx="1300000" cy="620000"/>
                       </a:xfrm>
                       <a:prstGeom prst="rect">
                         <a:avLst/>
@@ -2743,8 +2743,8 @@
                               <w:rFonts w:ascii="Arial" w:eastAsia="Arial" w:hAnsi="Arial" w:cs="Arial"/>
                               <w:b/>
                               <w:bCs/>
-                              <w:sz w:val="16"/>
-                              <w:szCs w:val="16"/>
+                              <w:sz w:val="14"/>
+                              <w:szCs w:val="14"/>
                             </w:rPr>
                             <w:t xml:space="preserve">1.0 Auth + Registration</w:t>
                           </w:r>
@@ -2756,12 +2756,12 @@
                     </wps:bodyPr>
                   </wps:wsp>
                   <wps:wsp>
-                    <wps:cNvPr id="3000017" name="Box 3000017"/>
+                    <wps:cNvPr id="4000006" name="Box 4000006"/>
                     <wps:cNvSpPr/>
                     <wps:spPr>
                       <a:xfrm>
-                        <a:off x="1975000" y="1100000"/>
-                        <a:ext cx="1750000" cy="650000"/>
+                        <a:off x="1475000" y="1000000"/>
+                        <a:ext cx="1300000" cy="620000"/>
                       </a:xfrm>
                       <a:prstGeom prst="rect">
                         <a:avLst/>
@@ -2786,8 +2786,8 @@
                               <w:rFonts w:ascii="Arial" w:eastAsia="Arial" w:hAnsi="Arial" w:cs="Arial"/>
                               <w:b/>
                               <w:bCs/>
-                              <w:sz w:val="16"/>
-                              <w:szCs w:val="16"/>
+                              <w:sz w:val="14"/>
+                              <w:szCs w:val="14"/>
                             </w:rPr>
                             <w:t xml:space="preserve">2.0 Member Management</w:t>
                           </w:r>
@@ -2799,12 +2799,12 @@
                     </wps:bodyPr>
                   </wps:wsp>
                   <wps:wsp>
-                    <wps:cNvPr id="3000018" name="Box 3000018"/>
+                    <wps:cNvPr id="4000007" name="Box 4000007"/>
                     <wps:cNvSpPr/>
                     <wps:spPr>
                       <a:xfrm>
-                        <a:off x="3900000" y="1100000"/>
-                        <a:ext cx="1750000" cy="650000"/>
+                        <a:off x="2900000" y="1000000"/>
+                        <a:ext cx="1300000" cy="620000"/>
                       </a:xfrm>
                       <a:prstGeom prst="rect">
                         <a:avLst/>
@@ -2829,8 +2829,8 @@
                               <w:rFonts w:ascii="Arial" w:eastAsia="Arial" w:hAnsi="Arial" w:cs="Arial"/>
                               <w:b/>
                               <w:bCs/>
-                              <w:sz w:val="16"/>
-                              <w:szCs w:val="16"/>
+                              <w:sz w:val="14"/>
+                              <w:szCs w:val="14"/>
                             </w:rPr>
                             <w:t xml:space="preserve">3.0 Plans Management</w:t>
                           </w:r>
@@ -2842,12 +2842,12 @@
                     </wps:bodyPr>
                   </wps:wsp>
                   <wps:wsp>
-                    <wps:cNvPr id="3000019" name="Box 3000019"/>
+                    <wps:cNvPr id="4000008" name="Box 4000008"/>
                     <wps:cNvSpPr/>
                     <wps:spPr>
                       <a:xfrm>
-                        <a:off x="50000" y="1950000"/>
-                        <a:ext cx="1750000" cy="650000"/>
+                        <a:off x="4325000" y="1000000"/>
+                        <a:ext cx="1300000" cy="620000"/>
                       </a:xfrm>
                       <a:prstGeom prst="rect">
                         <a:avLst/>
@@ -2872,8 +2872,8 @@
                               <w:rFonts w:ascii="Arial" w:eastAsia="Arial" w:hAnsi="Arial" w:cs="Arial"/>
                               <w:b/>
                               <w:bCs/>
-                              <w:sz w:val="16"/>
-                              <w:szCs w:val="16"/>
+                              <w:sz w:val="14"/>
+                              <w:szCs w:val="14"/>
                             </w:rPr>
                             <w:t xml:space="preserve">4.0 Billing + Payments</w:t>
                           </w:r>
@@ -2885,12 +2885,12 @@
                     </wps:bodyPr>
                   </wps:wsp>
                   <wps:wsp>
-                    <wps:cNvPr id="3000020" name="Box 3000020"/>
+                    <wps:cNvPr id="4000009" name="Box 4000009"/>
                     <wps:cNvSpPr/>
                     <wps:spPr>
                       <a:xfrm>
-                        <a:off x="1975000" y="1950000"/>
-                        <a:ext cx="1750000" cy="650000"/>
+                        <a:off x="50000" y="1800000"/>
+                        <a:ext cx="1300000" cy="620000"/>
                       </a:xfrm>
                       <a:prstGeom prst="rect">
                         <a:avLst/>
@@ -2915,10 +2915,10 @@
                               <w:rFonts w:ascii="Arial" w:eastAsia="Arial" w:hAnsi="Arial" w:cs="Arial"/>
                               <w:b/>
                               <w:bCs/>
-                              <w:sz w:val="16"/>
-                              <w:szCs w:val="16"/>
+                              <w:sz w:val="14"/>
+                              <w:szCs w:val="14"/>
                             </w:rPr>
-                            <w:t xml:space="preserve">5.0 Attendance (QR)</w:t>
+                            <w:t xml:space="preserve">5.0 Attendance + QR/Queue</w:t>
                           </w:r>
                         </w:p>
                       </wps:txbxContent>
@@ -2928,12 +2928,12 @@
                     </wps:bodyPr>
                   </wps:wsp>
                   <wps:wsp>
-                    <wps:cNvPr id="3000021" name="Box 3000021"/>
+                    <wps:cNvPr id="4000010" name="Box 4000010"/>
                     <wps:cNvSpPr/>
                     <wps:spPr>
                       <a:xfrm>
-                        <a:off x="3900000" y="1950000"/>
-                        <a:ext cx="1750000" cy="650000"/>
+                        <a:off x="1475000" y="1800000"/>
+                        <a:ext cx="1300000" cy="620000"/>
                       </a:xfrm>
                       <a:prstGeom prst="rect">
                         <a:avLst/>
@@ -2958,8 +2958,8 @@
                               <w:rFonts w:ascii="Arial" w:eastAsia="Arial" w:hAnsi="Arial" w:cs="Arial"/>
                               <w:b/>
                               <w:bCs/>
-                              <w:sz w:val="16"/>
-                              <w:szCs w:val="16"/>
+                              <w:sz w:val="14"/>
+                              <w:szCs w:val="14"/>
                             </w:rPr>
                             <w:t xml:space="preserve">6.0 Walk-In + Fee</w:t>
                           </w:r>
@@ -2971,12 +2971,12 @@
                     </wps:bodyPr>
                   </wps:wsp>
                   <wps:wsp>
-                    <wps:cNvPr id="3000022" name="Box 3000022"/>
+                    <wps:cNvPr id="4000011" name="Box 4000011"/>
                     <wps:cNvSpPr/>
                     <wps:spPr>
                       <a:xfrm>
-                        <a:off x="50000" y="2800000"/>
-                        <a:ext cx="1750000" cy="650000"/>
+                        <a:off x="2900000" y="1800000"/>
+                        <a:ext cx="1300000" cy="620000"/>
                       </a:xfrm>
                       <a:prstGeom prst="rect">
                         <a:avLst/>
@@ -3001,8 +3001,8 @@
                               <w:rFonts w:ascii="Arial" w:eastAsia="Arial" w:hAnsi="Arial" w:cs="Arial"/>
                               <w:b/>
                               <w:bCs/>
-                              <w:sz w:val="16"/>
-                              <w:szCs w:val="16"/>
+                              <w:sz w:val="14"/>
+                              <w:szCs w:val="14"/>
                             </w:rPr>
                             <w:t xml:space="preserve">7.0 Trainer + Sessions</w:t>
                           </w:r>
@@ -3014,12 +3014,12 @@
                     </wps:bodyPr>
                   </wps:wsp>
                   <wps:wsp>
-                    <wps:cNvPr id="3000023" name="Box 3000023"/>
+                    <wps:cNvPr id="4000012" name="Box 4000012"/>
                     <wps:cNvSpPr/>
                     <wps:spPr>
                       <a:xfrm>
-                        <a:off x="1975000" y="2800000"/>
-                        <a:ext cx="1750000" cy="650000"/>
+                        <a:off x="4325000" y="1800000"/>
+                        <a:ext cx="1300000" cy="620000"/>
                       </a:xfrm>
                       <a:prstGeom prst="rect">
                         <a:avLst/>
@@ -3044,10 +3044,10 @@
                               <w:rFonts w:ascii="Arial" w:eastAsia="Arial" w:hAnsi="Arial" w:cs="Arial"/>
                               <w:b/>
                               <w:bCs/>
-                              <w:sz w:val="16"/>
-                              <w:szCs w:val="16"/>
+                              <w:sz w:val="14"/>
+                              <w:szCs w:val="14"/>
                             </w:rPr>
-                            <w:t xml:space="preserve">8.0 Announce + Msg</w:t>
+                            <w:t xml:space="preserve">8.0 Workout + Fitness</w:t>
                           </w:r>
                         </w:p>
                       </wps:txbxContent>
@@ -3057,12 +3057,12 @@
                     </wps:bodyPr>
                   </wps:wsp>
                   <wps:wsp>
-                    <wps:cNvPr id="3000024" name="Box 3000024"/>
+                    <wps:cNvPr id="4000013" name="Box 4000013"/>
                     <wps:cNvSpPr/>
                     <wps:spPr>
                       <a:xfrm>
-                        <a:off x="3900000" y="2800000"/>
-                        <a:ext cx="1750000" cy="650000"/>
+                        <a:off x="52500" y="2600000"/>
+                        <a:ext cx="1830000" cy="620000"/>
                       </a:xfrm>
                       <a:prstGeom prst="rect">
                         <a:avLst/>
@@ -3087,10 +3087,10 @@
                               <w:rFonts w:ascii="Arial" w:eastAsia="Arial" w:hAnsi="Arial" w:cs="Arial"/>
                               <w:b/>
                               <w:bCs/>
-                              <w:sz w:val="16"/>
-                              <w:szCs w:val="16"/>
+                              <w:sz w:val="14"/>
+                              <w:szCs w:val="14"/>
                             </w:rPr>
-                            <w:t xml:space="preserve">9.0 Reports</w:t>
+                            <w:t xml:space="preserve">9.0 Announce + Msg</w:t>
                           </w:r>
                         </w:p>
                       </wps:txbxContent>
@@ -3100,11 +3100,97 @@
                     </wps:bodyPr>
                   </wps:wsp>
                   <wps:wsp>
-                    <wps:cNvPr id="3000025" name="Box 3000025"/>
+                    <wps:cNvPr id="4000014" name="Box 4000014"/>
                     <wps:cNvSpPr/>
                     <wps:spPr>
                       <a:xfrm>
-                        <a:off x="50000" y="3900000"/>
+                        <a:off x="1935000" y="2600000"/>
+                        <a:ext cx="1830000" cy="620000"/>
+                      </a:xfrm>
+                      <a:prstGeom prst="rect">
+                        <a:avLst/>
+                      </a:prstGeom>
+                      <a:solidFill>
+                        <a:srgbClr val="D9EAD3"/>
+                      </a:solidFill>
+                      <a:ln w="19050">
+                        <a:solidFill>
+                          <a:srgbClr val="404040"/>
+                        </a:solidFill>
+                      </a:ln>
+                    </wps:spPr>
+                    <wps:txbx>
+                      <wps:txbxContent>
+                        <w:p>
+                          <w:pPr>
+                            <w:jc w:val="center"/>
+                          </w:pPr>
+                          <w:r>
+                            <w:rPr>
+                              <w:rFonts w:ascii="Arial" w:eastAsia="Arial" w:hAnsi="Arial" w:cs="Arial"/>
+                              <w:b/>
+                              <w:bCs/>
+                              <w:sz w:val="14"/>
+                              <w:szCs w:val="14"/>
+                            </w:rPr>
+                            <w:t xml:space="preserve">10.0 User Management</w:t>
+                          </w:r>
+                        </w:p>
+                      </wps:txbxContent>
+                    </wps:txbx>
+                    <wps:bodyPr horzOverflow="overflow" vert="horz" lIns="0" tIns="0" rIns="0" bIns="0" rtlCol="0">
+                      <a:noAutofit/>
+                    </wps:bodyPr>
+                  </wps:wsp>
+                  <wps:wsp>
+                    <wps:cNvPr id="4000015" name="Box 4000015"/>
+                    <wps:cNvSpPr/>
+                    <wps:spPr>
+                      <a:xfrm>
+                        <a:off x="3817500" y="2600000"/>
+                        <a:ext cx="1830000" cy="620000"/>
+                      </a:xfrm>
+                      <a:prstGeom prst="rect">
+                        <a:avLst/>
+                      </a:prstGeom>
+                      <a:solidFill>
+                        <a:srgbClr val="D9EAD3"/>
+                      </a:solidFill>
+                      <a:ln w="19050">
+                        <a:solidFill>
+                          <a:srgbClr val="404040"/>
+                        </a:solidFill>
+                      </a:ln>
+                    </wps:spPr>
+                    <wps:txbx>
+                      <wps:txbxContent>
+                        <w:p>
+                          <w:pPr>
+                            <w:jc w:val="center"/>
+                          </w:pPr>
+                          <w:r>
+                            <w:rPr>
+                              <w:rFonts w:ascii="Arial" w:eastAsia="Arial" w:hAnsi="Arial" w:cs="Arial"/>
+                              <w:b/>
+                              <w:bCs/>
+                              <w:sz w:val="14"/>
+                              <w:szCs w:val="14"/>
+                            </w:rPr>
+                            <w:t xml:space="preserve">11.0 Reports</w:t>
+                          </w:r>
+                        </w:p>
+                      </wps:txbxContent>
+                    </wps:txbx>
+                    <wps:bodyPr horzOverflow="overflow" vert="horz" lIns="0" tIns="0" rIns="0" bIns="0" rtlCol="0">
+                      <a:noAutofit/>
+                    </wps:bodyPr>
+                  </wps:wsp>
+                  <wps:wsp>
+                    <wps:cNvPr id="4000016" name="Box 4000016"/>
+                    <wps:cNvSpPr/>
+                    <wps:spPr>
+                      <a:xfrm>
+                        <a:off x="50000" y="3600000"/>
                         <a:ext cx="1300000" cy="600000"/>
                       </a:xfrm>
                       <a:prstGeom prst="rect">
@@ -3143,11 +3229,11 @@
                     </wps:bodyPr>
                   </wps:wsp>
                   <wps:wsp>
-                    <wps:cNvPr id="3000026" name="Box 3000026"/>
+                    <wps:cNvPr id="4000017" name="Box 4000017"/>
                     <wps:cNvSpPr/>
                     <wps:spPr>
                       <a:xfrm>
-                        <a:off x="1475000" y="3900000"/>
+                        <a:off x="1475000" y="3600000"/>
                         <a:ext cx="1300000" cy="600000"/>
                       </a:xfrm>
                       <a:prstGeom prst="rect">
@@ -3186,11 +3272,11 @@
                     </wps:bodyPr>
                   </wps:wsp>
                   <wps:wsp>
-                    <wps:cNvPr id="3000027" name="Box 3000027"/>
+                    <wps:cNvPr id="4000018" name="Box 4000018"/>
                     <wps:cNvSpPr/>
                     <wps:spPr>
                       <a:xfrm>
-                        <a:off x="2900000" y="3900000"/>
+                        <a:off x="2900000" y="3600000"/>
                         <a:ext cx="1300000" cy="600000"/>
                       </a:xfrm>
                       <a:prstGeom prst="rect">
@@ -3229,11 +3315,11 @@
                     </wps:bodyPr>
                   </wps:wsp>
                   <wps:wsp>
-                    <wps:cNvPr id="3000028" name="Box 3000028"/>
+                    <wps:cNvPr id="4000019" name="Box 4000019"/>
                     <wps:cNvSpPr/>
                     <wps:spPr>
                       <a:xfrm>
-                        <a:off x="4325000" y="3900000"/>
+                        <a:off x="4325000" y="3600000"/>
                         <a:ext cx="1300000" cy="600000"/>
                       </a:xfrm>
                       <a:prstGeom prst="rect">
@@ -3272,12 +3358,12 @@
                     </wps:bodyPr>
                   </wps:wsp>
                   <wps:wsp>
-                    <wps:cNvPr id="3000029" name="Arrow 3000029"/>
+                    <wps:cNvPr id="4000020" name="Arrow 4000020"/>
                     <wps:cNvSpPr/>
                     <wps:spPr>
                       <a:xfrm>
                         <a:off x="700000" y="650000"/>
-                        <a:ext cx="0" cy="450000"/>
+                        <a:ext cx="0" cy="350000"/>
                       </a:xfrm>
                       <a:custGeom>
                         <a:avLst/>
@@ -3286,12 +3372,12 @@
                         <a:cxnLst/>
                         <a:rect l="0" t="0" r="0" b="0"/>
                         <a:pathLst>
-                          <a:path h="450000" w="450000">
+                          <a:path h="350000" w="350000">
                             <a:moveTo>
                               <a:pt x="0" y="0"/>
                             </a:moveTo>
                             <a:lnTo>
-                              <a:pt x="0" y="450000"/>
+                              <a:pt x="0" y="350000"/>
                             </a:lnTo>
                           </a:path>
                         </a:pathLst>
@@ -3307,12 +3393,12 @@
                     <wps:bodyPr/>
                   </wps:wsp>
                   <wps:wsp>
-                    <wps:cNvPr id="3000030" name="Arrow 3000030"/>
+                    <wps:cNvPr id="4000021" name="Arrow 4000021"/>
                     <wps:cNvSpPr/>
                     <wps:spPr>
                       <a:xfrm>
                         <a:off x="2125000" y="650000"/>
-                        <a:ext cx="0" cy="450000"/>
+                        <a:ext cx="0" cy="350000"/>
                       </a:xfrm>
                       <a:custGeom>
                         <a:avLst/>
@@ -3321,12 +3407,12 @@
                         <a:cxnLst/>
                         <a:rect l="0" t="0" r="0" b="0"/>
                         <a:pathLst>
-                          <a:path h="450000" w="450000">
+                          <a:path h="350000" w="350000">
                             <a:moveTo>
                               <a:pt x="0" y="0"/>
                             </a:moveTo>
                             <a:lnTo>
-                              <a:pt x="0" y="450000"/>
+                              <a:pt x="0" y="350000"/>
                             </a:lnTo>
                           </a:path>
                         </a:pathLst>
@@ -3342,12 +3428,12 @@
                     <wps:bodyPr/>
                   </wps:wsp>
                   <wps:wsp>
-                    <wps:cNvPr id="3000031" name="Arrow 3000031"/>
+                    <wps:cNvPr id="4000022" name="Arrow 4000022"/>
                     <wps:cNvSpPr/>
                     <wps:spPr>
                       <a:xfrm>
                         <a:off x="3550000" y="650000"/>
-                        <a:ext cx="0" cy="450000"/>
+                        <a:ext cx="0" cy="350000"/>
                       </a:xfrm>
                       <a:custGeom>
                         <a:avLst/>
@@ -3356,12 +3442,12 @@
                         <a:cxnLst/>
                         <a:rect l="0" t="0" r="0" b="0"/>
                         <a:pathLst>
-                          <a:path h="450000" w="450000">
+                          <a:path h="350000" w="350000">
                             <a:moveTo>
                               <a:pt x="0" y="0"/>
                             </a:moveTo>
                             <a:lnTo>
-                              <a:pt x="0" y="450000"/>
+                              <a:pt x="0" y="350000"/>
                             </a:lnTo>
                           </a:path>
                         </a:pathLst>
@@ -3377,12 +3463,12 @@
                     <wps:bodyPr/>
                   </wps:wsp>
                   <wps:wsp>
-                    <wps:cNvPr id="3000032" name="Arrow 3000032"/>
+                    <wps:cNvPr id="4000023" name="Arrow 4000023"/>
                     <wps:cNvSpPr/>
                     <wps:spPr>
                       <a:xfrm>
                         <a:off x="4975000" y="650000"/>
-                        <a:ext cx="0" cy="450000"/>
+                        <a:ext cx="0" cy="350000"/>
                       </a:xfrm>
                       <a:custGeom>
                         <a:avLst/>
@@ -3391,12 +3477,12 @@
                         <a:cxnLst/>
                         <a:rect l="0" t="0" r="0" b="0"/>
                         <a:pathLst>
-                          <a:path h="450000" w="450000">
+                          <a:path h="350000" w="350000">
                             <a:moveTo>
                               <a:pt x="0" y="0"/>
                             </a:moveTo>
                             <a:lnTo>
-                              <a:pt x="0" y="450000"/>
+                              <a:pt x="0" y="350000"/>
                             </a:lnTo>
                           </a:path>
                         </a:pathLst>
@@ -3412,12 +3498,12 @@
                     <wps:bodyPr/>
                   </wps:wsp>
                   <wps:wsp>
-                    <wps:cNvPr id="3000033" name="Arrow 3000033"/>
+                    <wps:cNvPr id="4000024" name="Arrow 4000024"/>
                     <wps:cNvSpPr/>
                     <wps:spPr>
                       <a:xfrm>
-                        <a:off x="925000" y="3450000"/>
-                        <a:ext cx="0" cy="450000"/>
+                        <a:off x="700000" y="3220000"/>
+                        <a:ext cx="267500" cy="380000"/>
                       </a:xfrm>
                       <a:custGeom>
                         <a:avLst/>
@@ -3426,12 +3512,12 @@
                         <a:cxnLst/>
                         <a:rect l="0" t="0" r="0" b="0"/>
                         <a:pathLst>
-                          <a:path h="450000" w="450000">
+                          <a:path h="380000" w="380000">
                             <a:moveTo>
-                              <a:pt x="0" y="0"/>
+                              <a:pt x="267500" y="0"/>
                             </a:moveTo>
                             <a:lnTo>
-                              <a:pt x="0" y="450000"/>
+                              <a:pt x="0" y="380000"/>
                             </a:lnTo>
                           </a:path>
                         </a:pathLst>
@@ -3447,12 +3533,12 @@
                     <wps:bodyPr/>
                   </wps:wsp>
                   <wps:wsp>
-                    <wps:cNvPr id="3000034" name="Arrow 3000034"/>
+                    <wps:cNvPr id="4000025" name="Arrow 4000025"/>
                     <wps:cNvSpPr/>
                     <wps:spPr>
                       <a:xfrm>
-                        <a:off x="2850000" y="3450000"/>
-                        <a:ext cx="0" cy="450000"/>
+                        <a:off x="2850000" y="3220000"/>
+                        <a:ext cx="0" cy="380000"/>
                       </a:xfrm>
                       <a:custGeom>
                         <a:avLst/>
@@ -3461,12 +3547,12 @@
                         <a:cxnLst/>
                         <a:rect l="0" t="0" r="0" b="0"/>
                         <a:pathLst>
-                          <a:path h="450000" w="450000">
+                          <a:path h="380000" w="380000">
                             <a:moveTo>
                               <a:pt x="0" y="0"/>
                             </a:moveTo>
                             <a:lnTo>
-                              <a:pt x="0" y="450000"/>
+                              <a:pt x="0" y="380000"/>
                             </a:lnTo>
                           </a:path>
                         </a:pathLst>
@@ -3482,12 +3568,12 @@
                     <wps:bodyPr/>
                   </wps:wsp>
                   <wps:wsp>
-                    <wps:cNvPr id="3000035" name="Arrow 3000035"/>
+                    <wps:cNvPr id="4000026" name="Arrow 4000026"/>
                     <wps:cNvSpPr/>
                     <wps:spPr>
                       <a:xfrm>
-                        <a:off x="4775000" y="3450000"/>
-                        <a:ext cx="0" cy="450000"/>
+                        <a:off x="4732500" y="3220000"/>
+                        <a:ext cx="242500" cy="380000"/>
                       </a:xfrm>
                       <a:custGeom>
                         <a:avLst/>
@@ -3496,12 +3582,12 @@
                         <a:cxnLst/>
                         <a:rect l="0" t="0" r="0" b="0"/>
                         <a:pathLst>
-                          <a:path h="450000" w="450000">
+                          <a:path h="380000" w="380000">
                             <a:moveTo>
                               <a:pt x="0" y="0"/>
                             </a:moveTo>
                             <a:lnTo>
-                              <a:pt x="0" y="450000"/>
+                              <a:pt x="242500" y="380000"/>
                             </a:lnTo>
                           </a:path>
                         </a:pathLst>
@@ -3537,7 +3623,7 @@
           <w:sz w:val="24"/>
           <w:szCs w:val="24"/>
         </w:rPr>
-        <w:t xml:space="preserve">At Level 1, Process 0 is decomposed into nine processes. Each process reads or writes specific Cloud Firestore collections, as summarized in Table 2.</w:t>
+        <w:t xml:space="preserve">At Level 1, Process 0 is decomposed into eleven processes. Each process reads or writes specific Cloud Firestore collections, as summarized in Table 2.</w:t>
       </w:r>
       <w:r>
         <w:rPr>
@@ -3694,7 +3780,7 @@
                 <w:sz w:val="24"/>
                 <w:szCs w:val="24"/>
               </w:rPr>
-              <w:t>Nine processes handle authentication, records, transactions, and reporting.</w:t>
+              <w:t>Eleven processes handle authentication, records, transactions, coaching, and reporting.</w:t>
             </w:r>
           </w:p>
         </w:tc>
@@ -3770,7 +3856,7 @@
                 <w:sz w:val="24"/>
                 <w:szCs w:val="24"/>
               </w:rPr>
-              <w:t>D1 users, D2 members, Firebase Authentication.</w:t>
+              <w:t>D1 users, D2 members, Firebase Authentication. Includes login, registration, and forgot-password OTP.</w:t>
             </w:r>
           </w:p>
         </w:tc>
@@ -4039,7 +4125,7 @@
                 <w:sz w:val="24"/>
                 <w:szCs w:val="24"/>
               </w:rPr>
-              <w:t>5.0 Attendance (Check-In/Check-Out, QR)</w:t>
+              <w:t>5.0 Attendance (Check-In/Check-Out, QR Scanner, Queue)</w:t>
             </w:r>
           </w:p>
         </w:tc>
@@ -4267,7 +4353,83 @@
                 <w:sz w:val="24"/>
                 <w:szCs w:val="24"/>
               </w:rPr>
-              <w:t>8.0 Announcements and Messaging</w:t>
+              <w:t>8.0 Workout and Fitness Tracking</w:t>
+            </w:r>
+          </w:p>
+        </w:tc>
+        <w:tc>
+          <w:tcPr>
+            <w:tcW w:w="6400" w:type="dxa"/>
+            <w:tcBorders>
+              <w:top w:val="single" w:sz="4" w:space="0" w:color="000000"/>
+              <w:left w:val="single" w:sz="4" w:space="0" w:color="000000"/>
+              <w:bottom w:val="single" w:sz="4" w:space="0" w:color="000000"/>
+              <w:right w:val="single" w:sz="4" w:space="0" w:color="000000"/>
+            </w:tcBorders>
+            <w:shd w:val="clear" w:color="auto" w:fill="FFFFFF"/>
+            <w:tcMar>
+              <w:top w:w="80" w:type="dxa"/>
+              <w:left w:w="120" w:type="dxa"/>
+              <w:bottom w:w="80" w:type="dxa"/>
+              <w:right w:w="120" w:type="dxa"/>
+            </w:tcMar>
+          </w:tcPr>
+          <w:p>
+            <w:pPr>
+              <w:jc w:val="center"/>
+              <w:rPr>
+                <w:sz w:val="24"/>
+                <w:szCs w:val="24"/>
+              </w:rPr>
+            </w:pPr>
+            <w:r>
+              <w:rPr>
+                <w:rFonts w:eastAsia="Arial"/>
+                <w:sz w:val="24"/>
+                <w:szCs w:val="24"/>
+              </w:rPr>
+              <w:t>D10 workouts, workout plans, measurements, goals, and exercise library.</w:t>
+            </w:r>
+          </w:p>
+        </w:tc>
+      </w:tr>
+      <w:tr>
+        <w:tc>
+          <w:tcPr>
+            <w:tcW w:w="2600" w:type="dxa"/>
+            <w:tcBorders>
+              <w:top w:val="single" w:sz="4" w:space="0" w:color="000000"/>
+              <w:left w:val="single" w:sz="4" w:space="0" w:color="000000"/>
+              <w:bottom w:val="single" w:sz="4" w:space="0" w:color="000000"/>
+              <w:right w:val="single" w:sz="4" w:space="0" w:color="000000"/>
+            </w:tcBorders>
+            <w:shd w:val="clear" w:color="auto" w:fill="FFFFFF"/>
+            <w:tcMar>
+              <w:top w:w="80" w:type="dxa"/>
+              <w:left w:w="120" w:type="dxa"/>
+              <w:bottom w:w="80" w:type="dxa"/>
+              <w:right w:w="120" w:type="dxa"/>
+            </w:tcMar>
+          </w:tcPr>
+          <w:p>
+            <w:pPr>
+              <w:jc w:val="center"/>
+              <w:rPr>
+                <w:b/>
+                <w:bCs/>
+                <w:sz w:val="24"/>
+                <w:szCs w:val="24"/>
+              </w:rPr>
+            </w:pPr>
+            <w:r>
+              <w:rPr>
+                <w:rFonts w:eastAsia="Arial"/>
+                <w:b/>
+                <w:bCs/>
+                <w:sz w:val="24"/>
+                <w:szCs w:val="24"/>
+              </w:rPr>
+              <w:t>9.0 Announcements and Messaging</w:t>
             </w:r>
           </w:p>
         </w:tc>
@@ -4343,7 +4505,7 @@
                 <w:sz w:val="24"/>
                 <w:szCs w:val="24"/>
               </w:rPr>
-              <w:t>9.0 Reports and Dashboard</w:t>
+              <w:t>10.0 User Management</w:t>
             </w:r>
           </w:p>
         </w:tc>
@@ -4378,6 +4540,82 @@
                 <w:sz w:val="24"/>
                 <w:szCs w:val="24"/>
               </w:rPr>
+              <w:t>D1 users. Admin approves registrations and locks or resets accounts.</w:t>
+            </w:r>
+          </w:p>
+        </w:tc>
+      </w:tr>
+      <w:tr>
+        <w:tc>
+          <w:tcPr>
+            <w:tcW w:w="2600" w:type="dxa"/>
+            <w:tcBorders>
+              <w:top w:val="single" w:sz="4" w:space="0" w:color="000000"/>
+              <w:left w:val="single" w:sz="4" w:space="0" w:color="000000"/>
+              <w:bottom w:val="single" w:sz="4" w:space="0" w:color="000000"/>
+              <w:right w:val="single" w:sz="4" w:space="0" w:color="000000"/>
+            </w:tcBorders>
+            <w:shd w:val="clear" w:color="auto" w:fill="FFFFFF"/>
+            <w:tcMar>
+              <w:top w:w="80" w:type="dxa"/>
+              <w:left w:w="120" w:type="dxa"/>
+              <w:bottom w:w="80" w:type="dxa"/>
+              <w:right w:w="120" w:type="dxa"/>
+            </w:tcMar>
+          </w:tcPr>
+          <w:p>
+            <w:pPr>
+              <w:jc w:val="center"/>
+              <w:rPr>
+                <w:b/>
+                <w:bCs/>
+                <w:sz w:val="24"/>
+                <w:szCs w:val="24"/>
+              </w:rPr>
+            </w:pPr>
+            <w:r>
+              <w:rPr>
+                <w:rFonts w:eastAsia="Arial"/>
+                <w:b/>
+                <w:bCs/>
+                <w:sz w:val="24"/>
+                <w:szCs w:val="24"/>
+              </w:rPr>
+              <w:t>11.0 Reports and Dashboard</w:t>
+            </w:r>
+          </w:p>
+        </w:tc>
+        <w:tc>
+          <w:tcPr>
+            <w:tcW w:w="6400" w:type="dxa"/>
+            <w:tcBorders>
+              <w:top w:val="single" w:sz="4" w:space="0" w:color="000000"/>
+              <w:left w:val="single" w:sz="4" w:space="0" w:color="000000"/>
+              <w:bottom w:val="single" w:sz="4" w:space="0" w:color="000000"/>
+              <w:right w:val="single" w:sz="4" w:space="0" w:color="000000"/>
+            </w:tcBorders>
+            <w:shd w:val="clear" w:color="auto" w:fill="FFFFFF"/>
+            <w:tcMar>
+              <w:top w:w="80" w:type="dxa"/>
+              <w:left w:w="120" w:type="dxa"/>
+              <w:bottom w:w="80" w:type="dxa"/>
+              <w:right w:w="120" w:type="dxa"/>
+            </w:tcMar>
+          </w:tcPr>
+          <w:p>
+            <w:pPr>
+              <w:jc w:val="center"/>
+              <w:rPr>
+                <w:sz w:val="24"/>
+                <w:szCs w:val="24"/>
+              </w:rPr>
+            </w:pPr>
+            <w:r>
+              <w:rPr>
+                <w:rFonts w:eastAsia="Arial"/>
+                <w:sz w:val="24"/>
+                <w:szCs w:val="24"/>
+              </w:rPr>
               <w:t>Reads D2 members, D4 payments, D5 attendance, D6 walkins, and D7 sessions.</w:t>
             </w:r>
           </w:p>
@@ -4401,7 +4639,7 @@
           <w:sz w:val="24"/>
           <w:szCs w:val="24"/>
         </w:rPr>
-        <w:t xml:space="preserve">3. Data Dictionary</w:t>
+        <w:t xml:space="preserve">3. Level 2 - Key Decompositions</w:t>
       </w:r>
       <w:r>
         <w:rPr>
@@ -4430,7 +4668,765 @@
           <w:sz w:val="24"/>
           <w:szCs w:val="24"/>
         </w:rPr>
-        <w:t xml:space="preserve">Table 3: Data Stores D1 - D12</w:t>
+        <w:t xml:space="preserve">Figure 3: DFD Level 2 - Key Decompositions</w:t>
+      </w:r>
+      <w:r>
+        <w:rPr>
+          <w:b/>
+          <w:bCs/>
+          <w:sz w:val="24"/>
+          <w:szCs w:val="24"/>
+        </w:rPr>
+        <w:t/>
+      </w:r>
+      <w:r>
+        <w:rPr>
+          <w:b/>
+          <w:bCs/>
+          <w:sz w:val="24"/>
+          <w:szCs w:val="24"/>
+        </w:rPr>
+        <w:t xml:space="preserve"/>
+      </w:r>
+      <w:r>
+        <w:rPr>
+          <w:b/>
+          <w:bCs/>
+          <w:sz w:val="24"/>
+          <w:szCs w:val="24"/>
+        </w:rPr>
+        <w:t/>
+      </w:r>
+    </w:p>
+    <w:p>
+      <w:r>
+        <w:drawing>
+          <wp:anchor distT="0" distB="0" distL="114300" distR="114300" simplePos="0" relativeHeight="251679744" behindDoc="0" locked="0" layoutInCell="1" allowOverlap="1" wp14:anchorId="003D092E" wp14:editId="003D092F">
+            <wp:simplePos x="0" y="0"/>
+            <wp:positionH relativeFrom="column">
+              <wp:posOffset>19050</wp:posOffset>
+            </wp:positionH>
+            <wp:positionV relativeFrom="paragraph">
+              <wp:posOffset>179070</wp:posOffset>
+            </wp:positionV>
+            <wp:extent cx="5700000" cy="3800000"/>
+            <wp:effectExtent l="0" t="0" r="0" b="10160"/>
+            <wp:wrapTopAndBottom/>
+            <wp:docPr id="4000047" name="DFD Figure"/>
+            <wp:cNvGraphicFramePr/>
+            <a:graphic xmlns:a="http://schemas.openxmlformats.org/drawingml/2006/main">
+              <a:graphicData uri="http://schemas.microsoft.com/office/word/2010/wordprocessingGroup">
+                <wpg:wgp>
+                  <wpg:cNvGrpSpPr/>
+                  <wpg:grpSpPr>
+                    <a:xfrm>
+                      <a:off x="0" y="0"/>
+                      <a:ext cx="5700000" cy="3800000"/>
+                      <a:chOff x="0" y="0"/>
+                      <a:chExt cx="5700000" cy="3800000"/>
+                    </a:xfrm>
+                  </wpg:grpSpPr>
+                  <wps:wsp>
+                    <wps:cNvPr id="4000030" name="Box 4000030"/>
+                    <wps:cNvSpPr/>
+                    <wps:spPr>
+                      <a:xfrm>
+                        <a:off x="50000" y="100000"/>
+                        <a:ext cx="1750000" cy="600000"/>
+                      </a:xfrm>
+                      <a:prstGeom prst="rect">
+                        <a:avLst/>
+                      </a:prstGeom>
+                      <a:solidFill>
+                        <a:srgbClr val="D9EAD3"/>
+                      </a:solidFill>
+                      <a:ln w="19050">
+                        <a:solidFill>
+                          <a:srgbClr val="404040"/>
+                        </a:solidFill>
+                      </a:ln>
+                    </wps:spPr>
+                    <wps:txbx>
+                      <wps:txbxContent>
+                        <w:p>
+                          <w:pPr>
+                            <w:jc w:val="center"/>
+                          </w:pPr>
+                          <w:r>
+                            <w:rPr>
+                              <w:rFonts w:ascii="Arial" w:eastAsia="Arial" w:hAnsi="Arial" w:cs="Arial"/>
+                              <w:b/>
+                              <w:bCs/>
+                              <w:sz w:val="15"/>
+                              <w:szCs w:val="15"/>
+                            </w:rPr>
+                            <w:t xml:space="preserve">1.1 Login</w:t>
+                          </w:r>
+                        </w:p>
+                      </wps:txbxContent>
+                    </wps:txbx>
+                    <wps:bodyPr horzOverflow="overflow" vert="horz" lIns="0" tIns="0" rIns="0" bIns="0" rtlCol="0">
+                      <a:noAutofit/>
+                    </wps:bodyPr>
+                  </wps:wsp>
+                  <wps:wsp>
+                    <wps:cNvPr id="4000031" name="Box 4000031"/>
+                    <wps:cNvSpPr/>
+                    <wps:spPr>
+                      <a:xfrm>
+                        <a:off x="1925000" y="100000"/>
+                        <a:ext cx="1750000" cy="600000"/>
+                      </a:xfrm>
+                      <a:prstGeom prst="rect">
+                        <a:avLst/>
+                      </a:prstGeom>
+                      <a:solidFill>
+                        <a:srgbClr val="D9EAD3"/>
+                      </a:solidFill>
+                      <a:ln w="19050">
+                        <a:solidFill>
+                          <a:srgbClr val="404040"/>
+                        </a:solidFill>
+                      </a:ln>
+                    </wps:spPr>
+                    <wps:txbx>
+                      <wps:txbxContent>
+                        <w:p>
+                          <w:pPr>
+                            <w:jc w:val="center"/>
+                          </w:pPr>
+                          <w:r>
+                            <w:rPr>
+                              <w:rFonts w:ascii="Arial" w:eastAsia="Arial" w:hAnsi="Arial" w:cs="Arial"/>
+                              <w:b/>
+                              <w:bCs/>
+                              <w:sz w:val="15"/>
+                              <w:szCs w:val="15"/>
+                            </w:rPr>
+                            <w:t xml:space="preserve">1.2 Register</w:t>
+                          </w:r>
+                        </w:p>
+                      </wps:txbxContent>
+                    </wps:txbx>
+                    <wps:bodyPr horzOverflow="overflow" vert="horz" lIns="0" tIns="0" rIns="0" bIns="0" rtlCol="0">
+                      <a:noAutofit/>
+                    </wps:bodyPr>
+                  </wps:wsp>
+                  <wps:wsp>
+                    <wps:cNvPr id="4000032" name="Box 4000032"/>
+                    <wps:cNvSpPr/>
+                    <wps:spPr>
+                      <a:xfrm>
+                        <a:off x="3800000" y="100000"/>
+                        <a:ext cx="1750000" cy="600000"/>
+                      </a:xfrm>
+                      <a:prstGeom prst="rect">
+                        <a:avLst/>
+                      </a:prstGeom>
+                      <a:solidFill>
+                        <a:srgbClr val="D9EAD3"/>
+                      </a:solidFill>
+                      <a:ln w="19050">
+                        <a:solidFill>
+                          <a:srgbClr val="404040"/>
+                        </a:solidFill>
+                      </a:ln>
+                    </wps:spPr>
+                    <wps:txbx>
+                      <wps:txbxContent>
+                        <w:p>
+                          <w:pPr>
+                            <w:jc w:val="center"/>
+                          </w:pPr>
+                          <w:r>
+                            <w:rPr>
+                              <w:rFonts w:ascii="Arial" w:eastAsia="Arial" w:hAnsi="Arial" w:cs="Arial"/>
+                              <w:b/>
+                              <w:bCs/>
+                              <w:sz w:val="15"/>
+                              <w:szCs w:val="15"/>
+                            </w:rPr>
+                            <w:t xml:space="preserve">1.3 Forgot-OTP</w:t>
+                          </w:r>
+                        </w:p>
+                      </wps:txbxContent>
+                    </wps:txbx>
+                    <wps:bodyPr horzOverflow="overflow" vert="horz" lIns="0" tIns="0" rIns="0" bIns="0" rtlCol="0">
+                      <a:noAutofit/>
+                    </wps:bodyPr>
+                  </wps:wsp>
+                  <wps:wsp>
+                    <wps:cNvPr id="4000033" name="Box 4000033"/>
+                    <wps:cNvSpPr/>
+                    <wps:spPr>
+                      <a:xfrm>
+                        <a:off x="50000" y="800000"/>
+                        <a:ext cx="1750000" cy="600000"/>
+                      </a:xfrm>
+                      <a:prstGeom prst="rect">
+                        <a:avLst/>
+                      </a:prstGeom>
+                      <a:solidFill>
+                        <a:srgbClr val="D9EAD3"/>
+                      </a:solidFill>
+                      <a:ln w="19050">
+                        <a:solidFill>
+                          <a:srgbClr val="404040"/>
+                        </a:solidFill>
+                      </a:ln>
+                    </wps:spPr>
+                    <wps:txbx>
+                      <wps:txbxContent>
+                        <w:p>
+                          <w:pPr>
+                            <w:jc w:val="center"/>
+                          </w:pPr>
+                          <w:r>
+                            <w:rPr>
+                              <w:rFonts w:ascii="Arial" w:eastAsia="Arial" w:hAnsi="Arial" w:cs="Arial"/>
+                              <w:b/>
+                              <w:bCs/>
+                              <w:sz w:val="15"/>
+                              <w:szCs w:val="15"/>
+                            </w:rPr>
+                            <w:t xml:space="preserve">4.1 Record Payment</w:t>
+                          </w:r>
+                        </w:p>
+                      </wps:txbxContent>
+                    </wps:txbx>
+                    <wps:bodyPr horzOverflow="overflow" vert="horz" lIns="0" tIns="0" rIns="0" bIns="0" rtlCol="0">
+                      <a:noAutofit/>
+                    </wps:bodyPr>
+                  </wps:wsp>
+                  <wps:wsp>
+                    <wps:cNvPr id="4000034" name="Box 4000034"/>
+                    <wps:cNvSpPr/>
+                    <wps:spPr>
+                      <a:xfrm>
+                        <a:off x="1925000" y="800000"/>
+                        <a:ext cx="1750000" cy="600000"/>
+                      </a:xfrm>
+                      <a:prstGeom prst="rect">
+                        <a:avLst/>
+                      </a:prstGeom>
+                      <a:solidFill>
+                        <a:srgbClr val="D9EAD3"/>
+                      </a:solidFill>
+                      <a:ln w="19050">
+                        <a:solidFill>
+                          <a:srgbClr val="404040"/>
+                        </a:solidFill>
+                      </a:ln>
+                    </wps:spPr>
+                    <wps:txbx>
+                      <wps:txbxContent>
+                        <w:p>
+                          <w:pPr>
+                            <w:jc w:val="center"/>
+                          </w:pPr>
+                          <w:r>
+                            <w:rPr>
+                              <w:rFonts w:ascii="Arial" w:eastAsia="Arial" w:hAnsi="Arial" w:cs="Arial"/>
+                              <w:b/>
+                              <w:bCs/>
+                              <w:sz w:val="15"/>
+                              <w:szCs w:val="15"/>
+                            </w:rPr>
+                            <w:t xml:space="preserve">4.2 Confirm + Activate</w:t>
+                          </w:r>
+                        </w:p>
+                      </wps:txbxContent>
+                    </wps:txbx>
+                    <wps:bodyPr horzOverflow="overflow" vert="horz" lIns="0" tIns="0" rIns="0" bIns="0" rtlCol="0">
+                      <a:noAutofit/>
+                    </wps:bodyPr>
+                  </wps:wsp>
+                  <wps:wsp>
+                    <wps:cNvPr id="4000035" name="Box 4000035"/>
+                    <wps:cNvSpPr/>
+                    <wps:spPr>
+                      <a:xfrm>
+                        <a:off x="3800000" y="800000"/>
+                        <a:ext cx="1750000" cy="600000"/>
+                      </a:xfrm>
+                      <a:prstGeom prst="rect">
+                        <a:avLst/>
+                      </a:prstGeom>
+                      <a:solidFill>
+                        <a:srgbClr val="D9EAD3"/>
+                      </a:solidFill>
+                      <a:ln w="19050">
+                        <a:solidFill>
+                          <a:srgbClr val="404040"/>
+                        </a:solidFill>
+                      </a:ln>
+                    </wps:spPr>
+                    <wps:txbx>
+                      <wps:txbxContent>
+                        <w:p>
+                          <w:pPr>
+                            <w:jc w:val="center"/>
+                          </w:pPr>
+                          <w:r>
+                            <w:rPr>
+                              <w:rFonts w:ascii="Arial" w:eastAsia="Arial" w:hAnsi="Arial" w:cs="Arial"/>
+                              <w:b/>
+                              <w:bCs/>
+                              <w:sz w:val="15"/>
+                              <w:szCs w:val="15"/>
+                            </w:rPr>
+                            <w:t xml:space="preserve">4.3 Print Receipt</w:t>
+                          </w:r>
+                        </w:p>
+                      </wps:txbxContent>
+                    </wps:txbx>
+                    <wps:bodyPr horzOverflow="overflow" vert="horz" lIns="0" tIns="0" rIns="0" bIns="0" rtlCol="0">
+                      <a:noAutofit/>
+                    </wps:bodyPr>
+                  </wps:wsp>
+                  <wps:wsp>
+                    <wps:cNvPr id="4000036" name="Box 4000036"/>
+                    <wps:cNvSpPr/>
+                    <wps:spPr>
+                      <a:xfrm>
+                        <a:off x="50000" y="1500000"/>
+                        <a:ext cx="1750000" cy="600000"/>
+                      </a:xfrm>
+                      <a:prstGeom prst="rect">
+                        <a:avLst/>
+                      </a:prstGeom>
+                      <a:solidFill>
+                        <a:srgbClr val="D9EAD3"/>
+                      </a:solidFill>
+                      <a:ln w="19050">
+                        <a:solidFill>
+                          <a:srgbClr val="404040"/>
+                        </a:solidFill>
+                      </a:ln>
+                    </wps:spPr>
+                    <wps:txbx>
+                      <wps:txbxContent>
+                        <w:p>
+                          <w:pPr>
+                            <w:jc w:val="center"/>
+                          </w:pPr>
+                          <w:r>
+                            <w:rPr>
+                              <w:rFonts w:ascii="Arial" w:eastAsia="Arial" w:hAnsi="Arial" w:cs="Arial"/>
+                              <w:b/>
+                              <w:bCs/>
+                              <w:sz w:val="15"/>
+                              <w:szCs w:val="15"/>
+                            </w:rPr>
+                            <w:t xml:space="preserve">5.1 Check-In</w:t>
+                          </w:r>
+                        </w:p>
+                      </wps:txbxContent>
+                    </wps:txbx>
+                    <wps:bodyPr horzOverflow="overflow" vert="horz" lIns="0" tIns="0" rIns="0" bIns="0" rtlCol="0">
+                      <a:noAutofit/>
+                    </wps:bodyPr>
+                  </wps:wsp>
+                  <wps:wsp>
+                    <wps:cNvPr id="4000037" name="Box 4000037"/>
+                    <wps:cNvSpPr/>
+                    <wps:spPr>
+                      <a:xfrm>
+                        <a:off x="1925000" y="1500000"/>
+                        <a:ext cx="1750000" cy="600000"/>
+                      </a:xfrm>
+                      <a:prstGeom prst="rect">
+                        <a:avLst/>
+                      </a:prstGeom>
+                      <a:solidFill>
+                        <a:srgbClr val="D9EAD3"/>
+                      </a:solidFill>
+                      <a:ln w="19050">
+                        <a:solidFill>
+                          <a:srgbClr val="404040"/>
+                        </a:solidFill>
+                      </a:ln>
+                    </wps:spPr>
+                    <wps:txbx>
+                      <wps:txbxContent>
+                        <w:p>
+                          <w:pPr>
+                            <w:jc w:val="center"/>
+                          </w:pPr>
+                          <w:r>
+                            <w:rPr>
+                              <w:rFonts w:ascii="Arial" w:eastAsia="Arial" w:hAnsi="Arial" w:cs="Arial"/>
+                              <w:b/>
+                              <w:bCs/>
+                              <w:sz w:val="15"/>
+                              <w:szCs w:val="15"/>
+                            </w:rPr>
+                            <w:t xml:space="preserve">5.2 Check-Out</w:t>
+                          </w:r>
+                        </w:p>
+                      </wps:txbxContent>
+                    </wps:txbx>
+                    <wps:bodyPr horzOverflow="overflow" vert="horz" lIns="0" tIns="0" rIns="0" bIns="0" rtlCol="0">
+                      <a:noAutofit/>
+                    </wps:bodyPr>
+                  </wps:wsp>
+                  <wps:wsp>
+                    <wps:cNvPr id="4000038" name="Box 4000038"/>
+                    <wps:cNvSpPr/>
+                    <wps:spPr>
+                      <a:xfrm>
+                        <a:off x="3800000" y="1500000"/>
+                        <a:ext cx="1750000" cy="600000"/>
+                      </a:xfrm>
+                      <a:prstGeom prst="rect">
+                        <a:avLst/>
+                      </a:prstGeom>
+                      <a:solidFill>
+                        <a:srgbClr val="D9EAD3"/>
+                      </a:solidFill>
+                      <a:ln w="19050">
+                        <a:solidFill>
+                          <a:srgbClr val="404040"/>
+                        </a:solidFill>
+                      </a:ln>
+                    </wps:spPr>
+                    <wps:txbx>
+                      <wps:txbxContent>
+                        <w:p>
+                          <w:pPr>
+                            <w:jc w:val="center"/>
+                          </w:pPr>
+                          <w:r>
+                            <w:rPr>
+                              <w:rFonts w:ascii="Arial" w:eastAsia="Arial" w:hAnsi="Arial" w:cs="Arial"/>
+                              <w:b/>
+                              <w:bCs/>
+                              <w:sz w:val="15"/>
+                              <w:szCs w:val="15"/>
+                            </w:rPr>
+                            <w:t xml:space="preserve">5.3 QR Scan</w:t>
+                          </w:r>
+                        </w:p>
+                      </wps:txbxContent>
+                    </wps:txbx>
+                    <wps:bodyPr horzOverflow="overflow" vert="horz" lIns="0" tIns="0" rIns="0" bIns="0" rtlCol="0">
+                      <a:noAutofit/>
+                    </wps:bodyPr>
+                  </wps:wsp>
+                  <wps:wsp>
+                    <wps:cNvPr id="4000039" name="Box 4000039"/>
+                    <wps:cNvSpPr/>
+                    <wps:spPr>
+                      <a:xfrm>
+                        <a:off x="50000" y="2200000"/>
+                        <a:ext cx="1750000" cy="600000"/>
+                      </a:xfrm>
+                      <a:prstGeom prst="rect">
+                        <a:avLst/>
+                      </a:prstGeom>
+                      <a:solidFill>
+                        <a:srgbClr val="D9EAD3"/>
+                      </a:solidFill>
+                      <a:ln w="19050">
+                        <a:solidFill>
+                          <a:srgbClr val="404040"/>
+                        </a:solidFill>
+                      </a:ln>
+                    </wps:spPr>
+                    <wps:txbx>
+                      <wps:txbxContent>
+                        <w:p>
+                          <w:pPr>
+                            <w:jc w:val="center"/>
+                          </w:pPr>
+                          <w:r>
+                            <w:rPr>
+                              <w:rFonts w:ascii="Arial" w:eastAsia="Arial" w:hAnsi="Arial" w:cs="Arial"/>
+                              <w:b/>
+                              <w:bCs/>
+                              <w:sz w:val="15"/>
+                              <w:szCs w:val="15"/>
+                            </w:rPr>
+                            <w:t xml:space="preserve">7.1 Manage Schedule</w:t>
+                          </w:r>
+                        </w:p>
+                      </wps:txbxContent>
+                    </wps:txbx>
+                    <wps:bodyPr horzOverflow="overflow" vert="horz" lIns="0" tIns="0" rIns="0" bIns="0" rtlCol="0">
+                      <a:noAutofit/>
+                    </wps:bodyPr>
+                  </wps:wsp>
+                  <wps:wsp>
+                    <wps:cNvPr id="4000040" name="Box 4000040"/>
+                    <wps:cNvSpPr/>
+                    <wps:spPr>
+                      <a:xfrm>
+                        <a:off x="1925000" y="2200000"/>
+                        <a:ext cx="1750000" cy="600000"/>
+                      </a:xfrm>
+                      <a:prstGeom prst="rect">
+                        <a:avLst/>
+                      </a:prstGeom>
+                      <a:solidFill>
+                        <a:srgbClr val="D9EAD3"/>
+                      </a:solidFill>
+                      <a:ln w="19050">
+                        <a:solidFill>
+                          <a:srgbClr val="404040"/>
+                        </a:solidFill>
+                      </a:ln>
+                    </wps:spPr>
+                    <wps:txbx>
+                      <wps:txbxContent>
+                        <w:p>
+                          <w:pPr>
+                            <w:jc w:val="center"/>
+                          </w:pPr>
+                          <w:r>
+                            <w:rPr>
+                              <w:rFonts w:ascii="Arial" w:eastAsia="Arial" w:hAnsi="Arial" w:cs="Arial"/>
+                              <w:b/>
+                              <w:bCs/>
+                              <w:sz w:val="15"/>
+                              <w:szCs w:val="15"/>
+                            </w:rPr>
+                            <w:t xml:space="preserve">7.2 Book Session</w:t>
+                          </w:r>
+                        </w:p>
+                      </wps:txbxContent>
+                    </wps:txbx>
+                    <wps:bodyPr horzOverflow="overflow" vert="horz" lIns="0" tIns="0" rIns="0" bIns="0" rtlCol="0">
+                      <a:noAutofit/>
+                    </wps:bodyPr>
+                  </wps:wsp>
+                  <wps:wsp>
+                    <wps:cNvPr id="4000041" name="Box 4000041"/>
+                    <wps:cNvSpPr/>
+                    <wps:spPr>
+                      <a:xfrm>
+                        <a:off x="3800000" y="2200000"/>
+                        <a:ext cx="1750000" cy="600000"/>
+                      </a:xfrm>
+                      <a:prstGeom prst="rect">
+                        <a:avLst/>
+                      </a:prstGeom>
+                      <a:solidFill>
+                        <a:srgbClr val="D9EAD3"/>
+                      </a:solidFill>
+                      <a:ln w="19050">
+                        <a:solidFill>
+                          <a:srgbClr val="404040"/>
+                        </a:solidFill>
+                      </a:ln>
+                    </wps:spPr>
+                    <wps:txbx>
+                      <wps:txbxContent>
+                        <w:p>
+                          <w:pPr>
+                            <w:jc w:val="center"/>
+                          </w:pPr>
+                          <w:r>
+                            <w:rPr>
+                              <w:rFonts w:ascii="Arial" w:eastAsia="Arial" w:hAnsi="Arial" w:cs="Arial"/>
+                              <w:b/>
+                              <w:bCs/>
+                              <w:sz w:val="15"/>
+                              <w:szCs w:val="15"/>
+                            </w:rPr>
+                            <w:t xml:space="preserve">7.3 Complete / Cancel</w:t>
+                          </w:r>
+                        </w:p>
+                      </wps:txbxContent>
+                    </wps:txbx>
+                    <wps:bodyPr horzOverflow="overflow" vert="horz" lIns="0" tIns="0" rIns="0" bIns="0" rtlCol="0">
+                      <a:noAutofit/>
+                    </wps:bodyPr>
+                  </wps:wsp>
+                  <wps:wsp>
+                    <wps:cNvPr id="4000042" name="Box 4000042"/>
+                    <wps:cNvSpPr/>
+                    <wps:spPr>
+                      <a:xfrm>
+                        <a:off x="50000" y="2900000"/>
+                        <a:ext cx="1750000" cy="600000"/>
+                      </a:xfrm>
+                      <a:prstGeom prst="rect">
+                        <a:avLst/>
+                      </a:prstGeom>
+                      <a:solidFill>
+                        <a:srgbClr val="D9EAD3"/>
+                      </a:solidFill>
+                      <a:ln w="19050">
+                        <a:solidFill>
+                          <a:srgbClr val="404040"/>
+                        </a:solidFill>
+                      </a:ln>
+                    </wps:spPr>
+                    <wps:txbx>
+                      <wps:txbxContent>
+                        <w:p>
+                          <w:pPr>
+                            <w:jc w:val="center"/>
+                          </w:pPr>
+                          <w:r>
+                            <w:rPr>
+                              <w:rFonts w:ascii="Arial" w:eastAsia="Arial" w:hAnsi="Arial" w:cs="Arial"/>
+                              <w:b/>
+                              <w:bCs/>
+                              <w:sz w:val="15"/>
+                              <w:szCs w:val="15"/>
+                            </w:rPr>
+                            <w:t xml:space="preserve">8.1 Exercise Library</w:t>
+                          </w:r>
+                        </w:p>
+                      </wps:txbxContent>
+                    </wps:txbx>
+                    <wps:bodyPr horzOverflow="overflow" vert="horz" lIns="0" tIns="0" rIns="0" bIns="0" rtlCol="0">
+                      <a:noAutofit/>
+                    </wps:bodyPr>
+                  </wps:wsp>
+                  <wps:wsp>
+                    <wps:cNvPr id="4000043" name="Box 4000043"/>
+                    <wps:cNvSpPr/>
+                    <wps:spPr>
+                      <a:xfrm>
+                        <a:off x="1925000" y="2900000"/>
+                        <a:ext cx="1750000" cy="600000"/>
+                      </a:xfrm>
+                      <a:prstGeom prst="rect">
+                        <a:avLst/>
+                      </a:prstGeom>
+                      <a:solidFill>
+                        <a:srgbClr val="D9EAD3"/>
+                      </a:solidFill>
+                      <a:ln w="19050">
+                        <a:solidFill>
+                          <a:srgbClr val="404040"/>
+                        </a:solidFill>
+                      </a:ln>
+                    </wps:spPr>
+                    <wps:txbx>
+                      <wps:txbxContent>
+                        <w:p>
+                          <w:pPr>
+                            <w:jc w:val="center"/>
+                          </w:pPr>
+                          <w:r>
+                            <w:rPr>
+                              <w:rFonts w:ascii="Arial" w:eastAsia="Arial" w:hAnsi="Arial" w:cs="Arial"/>
+                              <w:b/>
+                              <w:bCs/>
+                              <w:sz w:val="15"/>
+                              <w:szCs w:val="15"/>
+                            </w:rPr>
+                            <w:t xml:space="preserve">8.2 Build Workout Plan</w:t>
+                          </w:r>
+                        </w:p>
+                      </wps:txbxContent>
+                    </wps:txbx>
+                    <wps:bodyPr horzOverflow="overflow" vert="horz" lIns="0" tIns="0" rIns="0" bIns="0" rtlCol="0">
+                      <a:noAutofit/>
+                    </wps:bodyPr>
+                  </wps:wsp>
+                  <wps:wsp>
+                    <wps:cNvPr id="4000044" name="Box 4000044"/>
+                    <wps:cNvSpPr/>
+                    <wps:spPr>
+                      <a:xfrm>
+                        <a:off x="3800000" y="2900000"/>
+                        <a:ext cx="1750000" cy="600000"/>
+                      </a:xfrm>
+                      <a:prstGeom prst="rect">
+                        <a:avLst/>
+                      </a:prstGeom>
+                      <a:solidFill>
+                        <a:srgbClr val="D9EAD3"/>
+                      </a:solidFill>
+                      <a:ln w="19050">
+                        <a:solidFill>
+                          <a:srgbClr val="404040"/>
+                        </a:solidFill>
+                      </a:ln>
+                    </wps:spPr>
+                    <wps:txbx>
+                      <wps:txbxContent>
+                        <w:p>
+                          <w:pPr>
+                            <w:jc w:val="center"/>
+                          </w:pPr>
+                          <w:r>
+                            <w:rPr>
+                              <w:rFonts w:ascii="Arial" w:eastAsia="Arial" w:hAnsi="Arial" w:cs="Arial"/>
+                              <w:b/>
+                              <w:bCs/>
+                              <w:sz w:val="15"/>
+                              <w:szCs w:val="15"/>
+                            </w:rPr>
+                            <w:t xml:space="preserve">8.3 Log + Track Goals</w:t>
+                          </w:r>
+                        </w:p>
+                      </wps:txbxContent>
+                    </wps:txbx>
+                    <wps:bodyPr horzOverflow="overflow" vert="horz" lIns="0" tIns="0" rIns="0" bIns="0" rtlCol="0">
+                      <a:noAutofit/>
+                    </wps:bodyPr>
+                  </wps:wsp>
+                </wpg:wgp>
+              </a:graphicData>
+            </a:graphic>
+          </wp:anchor>
+        </w:drawing>
+      </w:r>
+    </w:p>
+    <w:p>
+      <w:pPr>
+        <w:spacing w:line="360" w:lineRule="auto"/>
+        <w:jc w:val="both"/>
+        <w:rPr>
+          <w:sz w:val="24"/>
+          <w:szCs w:val="24"/>
+        </w:rPr>
+      </w:pPr>
+      <w:r>
+        <w:rPr>
+          <w:sz w:val="24"/>
+          <w:szCs w:val="24"/>
+        </w:rPr>
+        <w:t xml:space="preserve">Level 2 decomposes the most transaction-heavy Level 1 processes into concrete sub-processes. Flows between a parent process and its children inherit the parent data stores.</w:t>
+      </w:r>
+      <w:r>
+        <w:rPr>
+          <w:sz w:val="24"/>
+          <w:szCs w:val="24"/>
+        </w:rPr>
+        <w:t/>
+      </w:r>
+      <w:r>
+        <w:rPr>
+          <w:sz w:val="24"/>
+          <w:szCs w:val="24"/>
+        </w:rPr>
+        <w:t/>
+      </w:r>
+    </w:p>
+    <w:p>
+      <w:pPr>
+        <w:jc w:val="center"/>
+        <w:rPr>
+          <w:b/>
+          <w:bCs/>
+          <w:sz w:val="24"/>
+          <w:szCs w:val="24"/>
+        </w:rPr>
+      </w:pPr>
+      <w:r>
+        <w:rPr>
+          <w:b/>
+          <w:bCs/>
+          <w:sz w:val="24"/>
+          <w:szCs w:val="24"/>
+        </w:rPr>
+        <w:t xml:space="preserve">Table 5: DFD Level 2 - Sub-Processes</w:t>
       </w:r>
       <w:r>
         <w:rPr>
@@ -4518,7 +5514,7 @@
                 <w:sz w:val="24"/>
                 <w:szCs w:val="24"/>
               </w:rPr>
-              <w:t>D1 users</w:t>
+              <w:t>Overview</w:t>
             </w:r>
           </w:p>
         </w:tc>
@@ -4553,7 +5549,7 @@
                 <w:sz w:val="24"/>
                 <w:szCs w:val="24"/>
               </w:rPr>
-              <w:t>Staff, trainer, and admin accounts with roles. Authentication required.</w:t>
+              <w:t>Sub-processes of processes 1.0, 4.0, 5.0, 7.0, and 8.0. Flows inherit parent data stores.</w:t>
             </w:r>
           </w:p>
         </w:tc>
@@ -4594,7 +5590,7 @@
                 <w:sz w:val="24"/>
                 <w:szCs w:val="24"/>
               </w:rPr>
-              <w:t>D2 members</w:t>
+              <w:t>1.1 Login</w:t>
             </w:r>
           </w:p>
         </w:tc>
@@ -4629,7 +5625,7 @@
                 <w:sz w:val="24"/>
                 <w:szCs w:val="24"/>
               </w:rPr>
-              <w:t>Member profiles (custom IDs such as MEM-0001). Public read for login lookup; writes require authentication.</w:t>
+              <w:t>Verifies credentials with Firebase Authentication and opens the role dashboard.</w:t>
             </w:r>
           </w:p>
         </w:tc>
@@ -4670,7 +5666,7 @@
                 <w:sz w:val="24"/>
                 <w:szCs w:val="24"/>
               </w:rPr>
-              <w:t>D3 plans</w:t>
+              <w:t>1.2 Register</w:t>
             </w:r>
           </w:p>
         </w:tc>
@@ -4705,7 +5701,7 @@
                 <w:sz w:val="24"/>
                 <w:szCs w:val="24"/>
               </w:rPr>
-              <w:t>Membership plans catalogue. Public read; writes require authentication.</w:t>
+              <w:t>Creates Auth accounts and member/staff profiles pending approval.</w:t>
             </w:r>
           </w:p>
         </w:tc>
@@ -4746,7 +5742,7 @@
                 <w:sz w:val="24"/>
                 <w:szCs w:val="24"/>
               </w:rPr>
-              <w:t>D4 payments</w:t>
+              <w:t>1.3 Forgot-OTP</w:t>
             </w:r>
           </w:p>
         </w:tc>
@@ -4781,7 +5777,7 @@
                 <w:sz w:val="24"/>
                 <w:szCs w:val="24"/>
               </w:rPr>
-              <w:t>Billing transactions and receipts. Authentication required.</w:t>
+              <w:t>Sends a one-time code and accepts a verified new password.</w:t>
             </w:r>
           </w:p>
         </w:tc>
@@ -4822,7 +5818,7 @@
                 <w:sz w:val="24"/>
                 <w:szCs w:val="24"/>
               </w:rPr>
-              <w:t>D5 attendance</w:t>
+              <w:t>4.1 Record Payment</w:t>
             </w:r>
           </w:p>
         </w:tc>
@@ -4857,7 +5853,7 @@
                 <w:sz w:val="24"/>
                 <w:szCs w:val="24"/>
               </w:rPr>
-              <w:t>Check-in and check-out logs. Authentication required.</w:t>
+              <w:t>Saves Cash, GCash, or Bank Transfer payments to D4.</w:t>
             </w:r>
           </w:p>
         </w:tc>
@@ -4898,7 +5894,7 @@
                 <w:sz w:val="24"/>
                 <w:szCs w:val="24"/>
               </w:rPr>
-              <w:t>D6 walkins</w:t>
+              <w:t>4.2 Confirm and Activate</w:t>
             </w:r>
           </w:p>
         </w:tc>
@@ -4933,7 +5929,7 @@
                 <w:sz w:val="24"/>
                 <w:szCs w:val="24"/>
               </w:rPr>
-              <w:t>Walk-in visitor entries. Authentication required.</w:t>
+              <w:t>Confirms payment and updates member expiry in D2.</w:t>
             </w:r>
           </w:p>
         </w:tc>
@@ -4974,7 +5970,7 @@
                 <w:sz w:val="24"/>
                 <w:szCs w:val="24"/>
               </w:rPr>
-              <w:t>D7 sessions</w:t>
+              <w:t>4.3 Print Receipt</w:t>
             </w:r>
           </w:p>
         </w:tc>
@@ -5009,7 +6005,7 @@
                 <w:sz w:val="24"/>
                 <w:szCs w:val="24"/>
               </w:rPr>
-              <w:t>Trainer session bookings. Authentication required.</w:t>
+              <w:t>Generates the printable receipt from D4.</w:t>
             </w:r>
           </w:p>
         </w:tc>
@@ -5050,7 +6046,7 @@
                 <w:sz w:val="24"/>
                 <w:szCs w:val="24"/>
               </w:rPr>
-              <w:t>D8 announcements</w:t>
+              <w:t>5.1 Check-In</w:t>
             </w:r>
           </w:p>
         </w:tc>
@@ -5085,7 +6081,7 @@
                 <w:sz w:val="24"/>
                 <w:szCs w:val="24"/>
               </w:rPr>
-              <w:t>Gym announcements. Authentication required.</w:t>
+              <w:t>Records member ID and timestamp in D5.</w:t>
             </w:r>
           </w:p>
         </w:tc>
@@ -5126,7 +6122,7 @@
                 <w:sz w:val="24"/>
                 <w:szCs w:val="24"/>
               </w:rPr>
-              <w:t>D9 messages + notifications</w:t>
+              <w:t>5.2 Check-Out</w:t>
             </w:r>
           </w:p>
         </w:tc>
@@ -5161,7 +6157,7 @@
                 <w:sz w:val="24"/>
                 <w:szCs w:val="24"/>
               </w:rPr>
-              <w:t>Member threads and in-app notifications. Authentication required.</w:t>
+              <w:t>Adds checkout time and computes duration in D5.</w:t>
             </w:r>
           </w:p>
         </w:tc>
@@ -5202,7 +6198,7 @@
                 <w:sz w:val="24"/>
                 <w:szCs w:val="24"/>
               </w:rPr>
-              <w:t>D10 workouts + plans + goals</w:t>
+              <w:t>5.3 QR Scan</w:t>
             </w:r>
           </w:p>
         </w:tc>
@@ -5237,7 +6233,7 @@
                 <w:sz w:val="24"/>
                 <w:szCs w:val="24"/>
               </w:rPr>
-              <w:t>Workout logs, assigned plans, measurements, and goals. Authentication required.</w:t>
+              <w:t>Decodes daily rotating member tokens at the scanner.</w:t>
             </w:r>
           </w:p>
         </w:tc>
@@ -5278,7 +6274,7 @@
                 <w:sz w:val="24"/>
                 <w:szCs w:val="24"/>
               </w:rPr>
-              <w:t>D11 settings</w:t>
+              <w:t>7.1 Manage Schedule</w:t>
             </w:r>
           </w:p>
         </w:tc>
@@ -5313,7 +6309,7 @@
                 <w:sz w:val="24"/>
                 <w:szCs w:val="24"/>
               </w:rPr>
-              <w:t>Gym configuration and walk-in fee. Public read; writes require authentication.</w:t>
+              <w:t>Staff creates, edits, or cancels sessions in D7 with conflict checks.</w:t>
             </w:r>
           </w:p>
         </w:tc>
@@ -5354,7 +6350,7 @@
                 <w:sz w:val="24"/>
                 <w:szCs w:val="24"/>
               </w:rPr>
-              <w:t>D12 activitylog</w:t>
+              <w:t>7.2 Book Session</w:t>
             </w:r>
           </w:p>
         </w:tc>
@@ -5389,7 +6385,311 @@
                 <w:sz w:val="24"/>
                 <w:szCs w:val="24"/>
               </w:rPr>
-              <w:t>Audit trail of system actions. Authentication required.</w:t>
+              <w:t>Members book trainers into D7 sessions.</w:t>
+            </w:r>
+          </w:p>
+        </w:tc>
+      </w:tr>
+      <w:tr>
+        <w:tc>
+          <w:tcPr>
+            <w:tcW w:w="2600" w:type="dxa"/>
+            <w:tcBorders>
+              <w:top w:val="single" w:sz="4" w:space="0" w:color="000000"/>
+              <w:left w:val="single" w:sz="4" w:space="0" w:color="000000"/>
+              <w:bottom w:val="single" w:sz="4" w:space="0" w:color="000000"/>
+              <w:right w:val="single" w:sz="4" w:space="0" w:color="000000"/>
+            </w:tcBorders>
+            <w:shd w:val="clear" w:color="auto" w:fill="FFFFFF"/>
+            <w:tcMar>
+              <w:top w:w="80" w:type="dxa"/>
+              <w:left w:w="120" w:type="dxa"/>
+              <w:bottom w:w="80" w:type="dxa"/>
+              <w:right w:w="120" w:type="dxa"/>
+            </w:tcMar>
+          </w:tcPr>
+          <w:p>
+            <w:pPr>
+              <w:jc w:val="center"/>
+              <w:rPr>
+                <w:b/>
+                <w:bCs/>
+                <w:sz w:val="24"/>
+                <w:szCs w:val="24"/>
+              </w:rPr>
+            </w:pPr>
+            <w:r>
+              <w:rPr>
+                <w:rFonts w:eastAsia="Arial"/>
+                <w:b/>
+                <w:bCs/>
+                <w:sz w:val="24"/>
+                <w:szCs w:val="24"/>
+              </w:rPr>
+              <w:t>7.3 Complete or Cancel</w:t>
+            </w:r>
+          </w:p>
+        </w:tc>
+        <w:tc>
+          <w:tcPr>
+            <w:tcW w:w="6400" w:type="dxa"/>
+            <w:tcBorders>
+              <w:top w:val="single" w:sz="4" w:space="0" w:color="000000"/>
+              <w:left w:val="single" w:sz="4" w:space="0" w:color="000000"/>
+              <w:bottom w:val="single" w:sz="4" w:space="0" w:color="000000"/>
+              <w:right w:val="single" w:sz="4" w:space="0" w:color="000000"/>
+            </w:tcBorders>
+            <w:shd w:val="clear" w:color="auto" w:fill="FFFFFF"/>
+            <w:tcMar>
+              <w:top w:w="80" w:type="dxa"/>
+              <w:left w:w="120" w:type="dxa"/>
+              <w:bottom w:w="80" w:type="dxa"/>
+              <w:right w:w="120" w:type="dxa"/>
+            </w:tcMar>
+          </w:tcPr>
+          <w:p>
+            <w:pPr>
+              <w:jc w:val="center"/>
+              <w:rPr>
+                <w:sz w:val="24"/>
+                <w:szCs w:val="24"/>
+              </w:rPr>
+            </w:pPr>
+            <w:r>
+              <w:rPr>
+                <w:rFonts w:eastAsia="Arial"/>
+                <w:sz w:val="24"/>
+                <w:szCs w:val="24"/>
+              </w:rPr>
+              <w:t>Trainers mark session outcomes in D7.</w:t>
+            </w:r>
+          </w:p>
+        </w:tc>
+      </w:tr>
+      <w:tr>
+        <w:tc>
+          <w:tcPr>
+            <w:tcW w:w="2600" w:type="dxa"/>
+            <w:tcBorders>
+              <w:top w:val="single" w:sz="4" w:space="0" w:color="000000"/>
+              <w:left w:val="single" w:sz="4" w:space="0" w:color="000000"/>
+              <w:bottom w:val="single" w:sz="4" w:space="0" w:color="000000"/>
+              <w:right w:val="single" w:sz="4" w:space="0" w:color="000000"/>
+            </w:tcBorders>
+            <w:shd w:val="clear" w:color="auto" w:fill="FFFFFF"/>
+            <w:tcMar>
+              <w:top w:w="80" w:type="dxa"/>
+              <w:left w:w="120" w:type="dxa"/>
+              <w:bottom w:w="80" w:type="dxa"/>
+              <w:right w:w="120" w:type="dxa"/>
+            </w:tcMar>
+          </w:tcPr>
+          <w:p>
+            <w:pPr>
+              <w:jc w:val="center"/>
+              <w:rPr>
+                <w:b/>
+                <w:bCs/>
+                <w:sz w:val="24"/>
+                <w:szCs w:val="24"/>
+              </w:rPr>
+            </w:pPr>
+            <w:r>
+              <w:rPr>
+                <w:rFonts w:eastAsia="Arial"/>
+                <w:b/>
+                <w:bCs/>
+                <w:sz w:val="24"/>
+                <w:szCs w:val="24"/>
+              </w:rPr>
+              <w:t>8.1 Exercise Library</w:t>
+            </w:r>
+          </w:p>
+        </w:tc>
+        <w:tc>
+          <w:tcPr>
+            <w:tcW w:w="6400" w:type="dxa"/>
+            <w:tcBorders>
+              <w:top w:val="single" w:sz="4" w:space="0" w:color="000000"/>
+              <w:left w:val="single" w:sz="4" w:space="0" w:color="000000"/>
+              <w:bottom w:val="single" w:sz="4" w:space="0" w:color="000000"/>
+              <w:right w:val="single" w:sz="4" w:space="0" w:color="000000"/>
+            </w:tcBorders>
+            <w:shd w:val="clear" w:color="auto" w:fill="FFFFFF"/>
+            <w:tcMar>
+              <w:top w:w="80" w:type="dxa"/>
+              <w:left w:w="120" w:type="dxa"/>
+              <w:bottom w:w="80" w:type="dxa"/>
+              <w:right w:w="120" w:type="dxa"/>
+            </w:tcMar>
+          </w:tcPr>
+          <w:p>
+            <w:pPr>
+              <w:jc w:val="center"/>
+              <w:rPr>
+                <w:sz w:val="24"/>
+                <w:szCs w:val="24"/>
+              </w:rPr>
+            </w:pPr>
+            <w:r>
+              <w:rPr>
+                <w:rFonts w:eastAsia="Arial"/>
+                <w:sz w:val="24"/>
+                <w:szCs w:val="24"/>
+              </w:rPr>
+              <w:t>Public catalogue of exercises used in plans.</w:t>
+            </w:r>
+          </w:p>
+        </w:tc>
+      </w:tr>
+      <w:tr>
+        <w:tc>
+          <w:tcPr>
+            <w:tcW w:w="2600" w:type="dxa"/>
+            <w:tcBorders>
+              <w:top w:val="single" w:sz="4" w:space="0" w:color="000000"/>
+              <w:left w:val="single" w:sz="4" w:space="0" w:color="000000"/>
+              <w:bottom w:val="single" w:sz="4" w:space="0" w:color="000000"/>
+              <w:right w:val="single" w:sz="4" w:space="0" w:color="000000"/>
+            </w:tcBorders>
+            <w:shd w:val="clear" w:color="auto" w:fill="FFFFFF"/>
+            <w:tcMar>
+              <w:top w:w="80" w:type="dxa"/>
+              <w:left w:w="120" w:type="dxa"/>
+              <w:bottom w:w="80" w:type="dxa"/>
+              <w:right w:w="120" w:type="dxa"/>
+            </w:tcMar>
+          </w:tcPr>
+          <w:p>
+            <w:pPr>
+              <w:jc w:val="center"/>
+              <w:rPr>
+                <w:b/>
+                <w:bCs/>
+                <w:sz w:val="24"/>
+                <w:szCs w:val="24"/>
+              </w:rPr>
+            </w:pPr>
+            <w:r>
+              <w:rPr>
+                <w:rFonts w:eastAsia="Arial"/>
+                <w:b/>
+                <w:bCs/>
+                <w:sz w:val="24"/>
+                <w:szCs w:val="24"/>
+              </w:rPr>
+              <w:t>8.2 Build Workout Plan</w:t>
+            </w:r>
+          </w:p>
+        </w:tc>
+        <w:tc>
+          <w:tcPr>
+            <w:tcW w:w="6400" w:type="dxa"/>
+            <w:tcBorders>
+              <w:top w:val="single" w:sz="4" w:space="0" w:color="000000"/>
+              <w:left w:val="single" w:sz="4" w:space="0" w:color="000000"/>
+              <w:bottom w:val="single" w:sz="4" w:space="0" w:color="000000"/>
+              <w:right w:val="single" w:sz="4" w:space="0" w:color="000000"/>
+            </w:tcBorders>
+            <w:shd w:val="clear" w:color="auto" w:fill="FFFFFF"/>
+            <w:tcMar>
+              <w:top w:w="80" w:type="dxa"/>
+              <w:left w:w="120" w:type="dxa"/>
+              <w:bottom w:w="80" w:type="dxa"/>
+              <w:right w:w="120" w:type="dxa"/>
+            </w:tcMar>
+          </w:tcPr>
+          <w:p>
+            <w:pPr>
+              <w:jc w:val="center"/>
+              <w:rPr>
+                <w:sz w:val="24"/>
+                <w:szCs w:val="24"/>
+              </w:rPr>
+            </w:pPr>
+            <w:r>
+              <w:rPr>
+                <w:rFonts w:eastAsia="Arial"/>
+                <w:sz w:val="24"/>
+                <w:szCs w:val="24"/>
+              </w:rPr>
+              <w:t>Trainers assemble and assign workout plans.</w:t>
+            </w:r>
+          </w:p>
+        </w:tc>
+      </w:tr>
+      <w:tr>
+        <w:tc>
+          <w:tcPr>
+            <w:tcW w:w="2600" w:type="dxa"/>
+            <w:tcBorders>
+              <w:top w:val="single" w:sz="4" w:space="0" w:color="000000"/>
+              <w:left w:val="single" w:sz="4" w:space="0" w:color="000000"/>
+              <w:bottom w:val="single" w:sz="4" w:space="0" w:color="000000"/>
+              <w:right w:val="single" w:sz="4" w:space="0" w:color="000000"/>
+            </w:tcBorders>
+            <w:shd w:val="clear" w:color="auto" w:fill="FFFFFF"/>
+            <w:tcMar>
+              <w:top w:w="80" w:type="dxa"/>
+              <w:left w:w="120" w:type="dxa"/>
+              <w:bottom w:w="80" w:type="dxa"/>
+              <w:right w:w="120" w:type="dxa"/>
+            </w:tcMar>
+          </w:tcPr>
+          <w:p>
+            <w:pPr>
+              <w:jc w:val="center"/>
+              <w:rPr>
+                <w:b/>
+                <w:bCs/>
+                <w:sz w:val="24"/>
+                <w:szCs w:val="24"/>
+              </w:rPr>
+            </w:pPr>
+            <w:r>
+              <w:rPr>
+                <w:rFonts w:eastAsia="Arial"/>
+                <w:b/>
+                <w:bCs/>
+                <w:sz w:val="24"/>
+                <w:szCs w:val="24"/>
+              </w:rPr>
+              <w:t>8.3 Log and Track Goals</w:t>
+            </w:r>
+          </w:p>
+        </w:tc>
+        <w:tc>
+          <w:tcPr>
+            <w:tcW w:w="6400" w:type="dxa"/>
+            <w:tcBorders>
+              <w:top w:val="single" w:sz="4" w:space="0" w:color="000000"/>
+              <w:left w:val="single" w:sz="4" w:space="0" w:color="000000"/>
+              <w:bottom w:val="single" w:sz="4" w:space="0" w:color="000000"/>
+              <w:right w:val="single" w:sz="4" w:space="0" w:color="000000"/>
+            </w:tcBorders>
+            <w:shd w:val="clear" w:color="auto" w:fill="FFFFFF"/>
+            <w:tcMar>
+              <w:top w:w="80" w:type="dxa"/>
+              <w:left w:w="120" w:type="dxa"/>
+              <w:bottom w:w="80" w:type="dxa"/>
+              <w:right w:w="120" w:type="dxa"/>
+            </w:tcMar>
+          </w:tcPr>
+          <w:p>
+            <w:pPr>
+              <w:jc w:val="center"/>
+              <w:rPr>
+                <w:sz w:val="24"/>
+                <w:szCs w:val="24"/>
+              </w:rPr>
+            </w:pPr>
+            <w:r>
+              <w:rPr>
+                <w:rFonts w:eastAsia="Arial"/>
+                <w:sz w:val="24"/>
+                <w:szCs w:val="24"/>
+              </w:rPr>
+              <w:t>Members log workouts, measurements, and goal progress.</w:t>
             </w:r>
           </w:p>
         </w:tc>
@@ -5397,7 +6697,7 @@
     </w:tbl>
     <w:p>
       <w:pPr>
-        <w:jc w:val="center"/>
+        <w:spacing w:line="360" w:lineRule="auto"/>
         <w:rPr>
           <w:b/>
           <w:bCs/>
@@ -5412,7 +6712,36 @@
           <w:sz w:val="24"/>
           <w:szCs w:val="24"/>
         </w:rPr>
-        <w:t xml:space="preserve">Table 4: Data Flows</w:t>
+        <w:t xml:space="preserve">4. Data Dictionary</w:t>
+      </w:r>
+      <w:r>
+        <w:rPr>
+          <w:b/>
+          <w:bCs/>
+          <w:sz w:val="24"/>
+          <w:szCs w:val="24"/>
+        </w:rPr>
+        <w:t/>
+      </w:r>
+    </w:p>
+    <w:p>
+      <w:pPr>
+        <w:jc w:val="center"/>
+        <w:rPr>
+          <w:b/>
+          <w:bCs/>
+          <w:sz w:val="24"/>
+          <w:szCs w:val="24"/>
+        </w:rPr>
+      </w:pPr>
+      <w:r>
+        <w:rPr>
+          <w:b/>
+          <w:bCs/>
+          <w:sz w:val="24"/>
+          <w:szCs w:val="24"/>
+        </w:rPr>
+        <w:t xml:space="preserve">Table 3: Data Stores D1 - D12</w:t>
       </w:r>
       <w:r>
         <w:rPr>
@@ -5500,6 +6829,988 @@
                 <w:sz w:val="24"/>
                 <w:szCs w:val="24"/>
               </w:rPr>
+              <w:t>D1 users</w:t>
+            </w:r>
+          </w:p>
+        </w:tc>
+        <w:tc>
+          <w:tcPr>
+            <w:tcW w:w="6400" w:type="dxa"/>
+            <w:tcBorders>
+              <w:top w:val="single" w:sz="4" w:space="0" w:color="000000"/>
+              <w:left w:val="single" w:sz="4" w:space="0" w:color="000000"/>
+              <w:bottom w:val="single" w:sz="4" w:space="0" w:color="000000"/>
+              <w:right w:val="single" w:sz="4" w:space="0" w:color="000000"/>
+            </w:tcBorders>
+            <w:shd w:val="clear" w:color="auto" w:fill="FFFFFF"/>
+            <w:tcMar>
+              <w:top w:w="80" w:type="dxa"/>
+              <w:left w:w="120" w:type="dxa"/>
+              <w:bottom w:w="80" w:type="dxa"/>
+              <w:right w:w="120" w:type="dxa"/>
+            </w:tcMar>
+          </w:tcPr>
+          <w:p>
+            <w:pPr>
+              <w:jc w:val="center"/>
+              <w:rPr>
+                <w:sz w:val="24"/>
+                <w:szCs w:val="24"/>
+              </w:rPr>
+            </w:pPr>
+            <w:r>
+              <w:rPr>
+                <w:rFonts w:eastAsia="Arial"/>
+                <w:sz w:val="24"/>
+                <w:szCs w:val="24"/>
+              </w:rPr>
+              <w:t>Staff, trainer, and admin accounts with roles. Authentication required.</w:t>
+            </w:r>
+          </w:p>
+        </w:tc>
+      </w:tr>
+      <w:tr>
+        <w:tc>
+          <w:tcPr>
+            <w:tcW w:w="2600" w:type="dxa"/>
+            <w:tcBorders>
+              <w:top w:val="single" w:sz="4" w:space="0" w:color="000000"/>
+              <w:left w:val="single" w:sz="4" w:space="0" w:color="000000"/>
+              <w:bottom w:val="single" w:sz="4" w:space="0" w:color="000000"/>
+              <w:right w:val="single" w:sz="4" w:space="0" w:color="000000"/>
+            </w:tcBorders>
+            <w:shd w:val="clear" w:color="auto" w:fill="FFFFFF"/>
+            <w:tcMar>
+              <w:top w:w="80" w:type="dxa"/>
+              <w:left w:w="120" w:type="dxa"/>
+              <w:bottom w:w="80" w:type="dxa"/>
+              <w:right w:w="120" w:type="dxa"/>
+            </w:tcMar>
+          </w:tcPr>
+          <w:p>
+            <w:pPr>
+              <w:jc w:val="center"/>
+              <w:rPr>
+                <w:b/>
+                <w:bCs/>
+                <w:sz w:val="24"/>
+                <w:szCs w:val="24"/>
+              </w:rPr>
+            </w:pPr>
+            <w:r>
+              <w:rPr>
+                <w:rFonts w:eastAsia="Arial"/>
+                <w:b/>
+                <w:bCs/>
+                <w:sz w:val="24"/>
+                <w:szCs w:val="24"/>
+              </w:rPr>
+              <w:t>D2 members</w:t>
+            </w:r>
+          </w:p>
+        </w:tc>
+        <w:tc>
+          <w:tcPr>
+            <w:tcW w:w="6400" w:type="dxa"/>
+            <w:tcBorders>
+              <w:top w:val="single" w:sz="4" w:space="0" w:color="000000"/>
+              <w:left w:val="single" w:sz="4" w:space="0" w:color="000000"/>
+              <w:bottom w:val="single" w:sz="4" w:space="0" w:color="000000"/>
+              <w:right w:val="single" w:sz="4" w:space="0" w:color="000000"/>
+            </w:tcBorders>
+            <w:shd w:val="clear" w:color="auto" w:fill="FFFFFF"/>
+            <w:tcMar>
+              <w:top w:w="80" w:type="dxa"/>
+              <w:left w:w="120" w:type="dxa"/>
+              <w:bottom w:w="80" w:type="dxa"/>
+              <w:right w:w="120" w:type="dxa"/>
+            </w:tcMar>
+          </w:tcPr>
+          <w:p>
+            <w:pPr>
+              <w:jc w:val="center"/>
+              <w:rPr>
+                <w:sz w:val="24"/>
+                <w:szCs w:val="24"/>
+              </w:rPr>
+            </w:pPr>
+            <w:r>
+              <w:rPr>
+                <w:rFonts w:eastAsia="Arial"/>
+                <w:sz w:val="24"/>
+                <w:szCs w:val="24"/>
+              </w:rPr>
+              <w:t>Member profiles (custom IDs such as MEM-0001). Public read for login lookup; writes require authentication.</w:t>
+            </w:r>
+          </w:p>
+        </w:tc>
+      </w:tr>
+      <w:tr>
+        <w:tc>
+          <w:tcPr>
+            <w:tcW w:w="2600" w:type="dxa"/>
+            <w:tcBorders>
+              <w:top w:val="single" w:sz="4" w:space="0" w:color="000000"/>
+              <w:left w:val="single" w:sz="4" w:space="0" w:color="000000"/>
+              <w:bottom w:val="single" w:sz="4" w:space="0" w:color="000000"/>
+              <w:right w:val="single" w:sz="4" w:space="0" w:color="000000"/>
+            </w:tcBorders>
+            <w:shd w:val="clear" w:color="auto" w:fill="FFFFFF"/>
+            <w:tcMar>
+              <w:top w:w="80" w:type="dxa"/>
+              <w:left w:w="120" w:type="dxa"/>
+              <w:bottom w:w="80" w:type="dxa"/>
+              <w:right w:w="120" w:type="dxa"/>
+            </w:tcMar>
+          </w:tcPr>
+          <w:p>
+            <w:pPr>
+              <w:jc w:val="center"/>
+              <w:rPr>
+                <w:b/>
+                <w:bCs/>
+                <w:sz w:val="24"/>
+                <w:szCs w:val="24"/>
+              </w:rPr>
+            </w:pPr>
+            <w:r>
+              <w:rPr>
+                <w:rFonts w:eastAsia="Arial"/>
+                <w:b/>
+                <w:bCs/>
+                <w:sz w:val="24"/>
+                <w:szCs w:val="24"/>
+              </w:rPr>
+              <w:t>D3 plans</w:t>
+            </w:r>
+          </w:p>
+        </w:tc>
+        <w:tc>
+          <w:tcPr>
+            <w:tcW w:w="6400" w:type="dxa"/>
+            <w:tcBorders>
+              <w:top w:val="single" w:sz="4" w:space="0" w:color="000000"/>
+              <w:left w:val="single" w:sz="4" w:space="0" w:color="000000"/>
+              <w:bottom w:val="single" w:sz="4" w:space="0" w:color="000000"/>
+              <w:right w:val="single" w:sz="4" w:space="0" w:color="000000"/>
+            </w:tcBorders>
+            <w:shd w:val="clear" w:color="auto" w:fill="FFFFFF"/>
+            <w:tcMar>
+              <w:top w:w="80" w:type="dxa"/>
+              <w:left w:w="120" w:type="dxa"/>
+              <w:bottom w:w="80" w:type="dxa"/>
+              <w:right w:w="120" w:type="dxa"/>
+            </w:tcMar>
+          </w:tcPr>
+          <w:p>
+            <w:pPr>
+              <w:jc w:val="center"/>
+              <w:rPr>
+                <w:sz w:val="24"/>
+                <w:szCs w:val="24"/>
+              </w:rPr>
+            </w:pPr>
+            <w:r>
+              <w:rPr>
+                <w:rFonts w:eastAsia="Arial"/>
+                <w:sz w:val="24"/>
+                <w:szCs w:val="24"/>
+              </w:rPr>
+              <w:t>Membership plans catalogue. Public read; writes require authentication.</w:t>
+            </w:r>
+          </w:p>
+        </w:tc>
+      </w:tr>
+      <w:tr>
+        <w:tc>
+          <w:tcPr>
+            <w:tcW w:w="2600" w:type="dxa"/>
+            <w:tcBorders>
+              <w:top w:val="single" w:sz="4" w:space="0" w:color="000000"/>
+              <w:left w:val="single" w:sz="4" w:space="0" w:color="000000"/>
+              <w:bottom w:val="single" w:sz="4" w:space="0" w:color="000000"/>
+              <w:right w:val="single" w:sz="4" w:space="0" w:color="000000"/>
+            </w:tcBorders>
+            <w:shd w:val="clear" w:color="auto" w:fill="FFFFFF"/>
+            <w:tcMar>
+              <w:top w:w="80" w:type="dxa"/>
+              <w:left w:w="120" w:type="dxa"/>
+              <w:bottom w:w="80" w:type="dxa"/>
+              <w:right w:w="120" w:type="dxa"/>
+            </w:tcMar>
+          </w:tcPr>
+          <w:p>
+            <w:pPr>
+              <w:jc w:val="center"/>
+              <w:rPr>
+                <w:b/>
+                <w:bCs/>
+                <w:sz w:val="24"/>
+                <w:szCs w:val="24"/>
+              </w:rPr>
+            </w:pPr>
+            <w:r>
+              <w:rPr>
+                <w:rFonts w:eastAsia="Arial"/>
+                <w:b/>
+                <w:bCs/>
+                <w:sz w:val="24"/>
+                <w:szCs w:val="24"/>
+              </w:rPr>
+              <w:t>D4 payments</w:t>
+            </w:r>
+          </w:p>
+        </w:tc>
+        <w:tc>
+          <w:tcPr>
+            <w:tcW w:w="6400" w:type="dxa"/>
+            <w:tcBorders>
+              <w:top w:val="single" w:sz="4" w:space="0" w:color="000000"/>
+              <w:left w:val="single" w:sz="4" w:space="0" w:color="000000"/>
+              <w:bottom w:val="single" w:sz="4" w:space="0" w:color="000000"/>
+              <w:right w:val="single" w:sz="4" w:space="0" w:color="000000"/>
+            </w:tcBorders>
+            <w:shd w:val="clear" w:color="auto" w:fill="FFFFFF"/>
+            <w:tcMar>
+              <w:top w:w="80" w:type="dxa"/>
+              <w:left w:w="120" w:type="dxa"/>
+              <w:bottom w:w="80" w:type="dxa"/>
+              <w:right w:w="120" w:type="dxa"/>
+            </w:tcMar>
+          </w:tcPr>
+          <w:p>
+            <w:pPr>
+              <w:jc w:val="center"/>
+              <w:rPr>
+                <w:sz w:val="24"/>
+                <w:szCs w:val="24"/>
+              </w:rPr>
+            </w:pPr>
+            <w:r>
+              <w:rPr>
+                <w:rFonts w:eastAsia="Arial"/>
+                <w:sz w:val="24"/>
+                <w:szCs w:val="24"/>
+              </w:rPr>
+              <w:t>Billing transactions and receipts. Authentication required.</w:t>
+            </w:r>
+          </w:p>
+        </w:tc>
+      </w:tr>
+      <w:tr>
+        <w:tc>
+          <w:tcPr>
+            <w:tcW w:w="2600" w:type="dxa"/>
+            <w:tcBorders>
+              <w:top w:val="single" w:sz="4" w:space="0" w:color="000000"/>
+              <w:left w:val="single" w:sz="4" w:space="0" w:color="000000"/>
+              <w:bottom w:val="single" w:sz="4" w:space="0" w:color="000000"/>
+              <w:right w:val="single" w:sz="4" w:space="0" w:color="000000"/>
+            </w:tcBorders>
+            <w:shd w:val="clear" w:color="auto" w:fill="FFFFFF"/>
+            <w:tcMar>
+              <w:top w:w="80" w:type="dxa"/>
+              <w:left w:w="120" w:type="dxa"/>
+              <w:bottom w:w="80" w:type="dxa"/>
+              <w:right w:w="120" w:type="dxa"/>
+            </w:tcMar>
+          </w:tcPr>
+          <w:p>
+            <w:pPr>
+              <w:jc w:val="center"/>
+              <w:rPr>
+                <w:b/>
+                <w:bCs/>
+                <w:sz w:val="24"/>
+                <w:szCs w:val="24"/>
+              </w:rPr>
+            </w:pPr>
+            <w:r>
+              <w:rPr>
+                <w:rFonts w:eastAsia="Arial"/>
+                <w:b/>
+                <w:bCs/>
+                <w:sz w:val="24"/>
+                <w:szCs w:val="24"/>
+              </w:rPr>
+              <w:t>D5 attendance</w:t>
+            </w:r>
+          </w:p>
+        </w:tc>
+        <w:tc>
+          <w:tcPr>
+            <w:tcW w:w="6400" w:type="dxa"/>
+            <w:tcBorders>
+              <w:top w:val="single" w:sz="4" w:space="0" w:color="000000"/>
+              <w:left w:val="single" w:sz="4" w:space="0" w:color="000000"/>
+              <w:bottom w:val="single" w:sz="4" w:space="0" w:color="000000"/>
+              <w:right w:val="single" w:sz="4" w:space="0" w:color="000000"/>
+            </w:tcBorders>
+            <w:shd w:val="clear" w:color="auto" w:fill="FFFFFF"/>
+            <w:tcMar>
+              <w:top w:w="80" w:type="dxa"/>
+              <w:left w:w="120" w:type="dxa"/>
+              <w:bottom w:w="80" w:type="dxa"/>
+              <w:right w:w="120" w:type="dxa"/>
+            </w:tcMar>
+          </w:tcPr>
+          <w:p>
+            <w:pPr>
+              <w:jc w:val="center"/>
+              <w:rPr>
+                <w:sz w:val="24"/>
+                <w:szCs w:val="24"/>
+              </w:rPr>
+            </w:pPr>
+            <w:r>
+              <w:rPr>
+                <w:rFonts w:eastAsia="Arial"/>
+                <w:sz w:val="24"/>
+                <w:szCs w:val="24"/>
+              </w:rPr>
+              <w:t>Check-in and check-out logs. Authentication required.</w:t>
+            </w:r>
+          </w:p>
+        </w:tc>
+      </w:tr>
+      <w:tr>
+        <w:tc>
+          <w:tcPr>
+            <w:tcW w:w="2600" w:type="dxa"/>
+            <w:tcBorders>
+              <w:top w:val="single" w:sz="4" w:space="0" w:color="000000"/>
+              <w:left w:val="single" w:sz="4" w:space="0" w:color="000000"/>
+              <w:bottom w:val="single" w:sz="4" w:space="0" w:color="000000"/>
+              <w:right w:val="single" w:sz="4" w:space="0" w:color="000000"/>
+            </w:tcBorders>
+            <w:shd w:val="clear" w:color="auto" w:fill="FFFFFF"/>
+            <w:tcMar>
+              <w:top w:w="80" w:type="dxa"/>
+              <w:left w:w="120" w:type="dxa"/>
+              <w:bottom w:w="80" w:type="dxa"/>
+              <w:right w:w="120" w:type="dxa"/>
+            </w:tcMar>
+          </w:tcPr>
+          <w:p>
+            <w:pPr>
+              <w:jc w:val="center"/>
+              <w:rPr>
+                <w:b/>
+                <w:bCs/>
+                <w:sz w:val="24"/>
+                <w:szCs w:val="24"/>
+              </w:rPr>
+            </w:pPr>
+            <w:r>
+              <w:rPr>
+                <w:rFonts w:eastAsia="Arial"/>
+                <w:b/>
+                <w:bCs/>
+                <w:sz w:val="24"/>
+                <w:szCs w:val="24"/>
+              </w:rPr>
+              <w:t>D6 walkins</w:t>
+            </w:r>
+          </w:p>
+        </w:tc>
+        <w:tc>
+          <w:tcPr>
+            <w:tcW w:w="6400" w:type="dxa"/>
+            <w:tcBorders>
+              <w:top w:val="single" w:sz="4" w:space="0" w:color="000000"/>
+              <w:left w:val="single" w:sz="4" w:space="0" w:color="000000"/>
+              <w:bottom w:val="single" w:sz="4" w:space="0" w:color="000000"/>
+              <w:right w:val="single" w:sz="4" w:space="0" w:color="000000"/>
+            </w:tcBorders>
+            <w:shd w:val="clear" w:color="auto" w:fill="FFFFFF"/>
+            <w:tcMar>
+              <w:top w:w="80" w:type="dxa"/>
+              <w:left w:w="120" w:type="dxa"/>
+              <w:bottom w:w="80" w:type="dxa"/>
+              <w:right w:w="120" w:type="dxa"/>
+            </w:tcMar>
+          </w:tcPr>
+          <w:p>
+            <w:pPr>
+              <w:jc w:val="center"/>
+              <w:rPr>
+                <w:sz w:val="24"/>
+                <w:szCs w:val="24"/>
+              </w:rPr>
+            </w:pPr>
+            <w:r>
+              <w:rPr>
+                <w:rFonts w:eastAsia="Arial"/>
+                <w:sz w:val="24"/>
+                <w:szCs w:val="24"/>
+              </w:rPr>
+              <w:t>Walk-in visitor entries. Authentication required.</w:t>
+            </w:r>
+          </w:p>
+        </w:tc>
+      </w:tr>
+      <w:tr>
+        <w:tc>
+          <w:tcPr>
+            <w:tcW w:w="2600" w:type="dxa"/>
+            <w:tcBorders>
+              <w:top w:val="single" w:sz="4" w:space="0" w:color="000000"/>
+              <w:left w:val="single" w:sz="4" w:space="0" w:color="000000"/>
+              <w:bottom w:val="single" w:sz="4" w:space="0" w:color="000000"/>
+              <w:right w:val="single" w:sz="4" w:space="0" w:color="000000"/>
+            </w:tcBorders>
+            <w:shd w:val="clear" w:color="auto" w:fill="FFFFFF"/>
+            <w:tcMar>
+              <w:top w:w="80" w:type="dxa"/>
+              <w:left w:w="120" w:type="dxa"/>
+              <w:bottom w:w="80" w:type="dxa"/>
+              <w:right w:w="120" w:type="dxa"/>
+            </w:tcMar>
+          </w:tcPr>
+          <w:p>
+            <w:pPr>
+              <w:jc w:val="center"/>
+              <w:rPr>
+                <w:b/>
+                <w:bCs/>
+                <w:sz w:val="24"/>
+                <w:szCs w:val="24"/>
+              </w:rPr>
+            </w:pPr>
+            <w:r>
+              <w:rPr>
+                <w:rFonts w:eastAsia="Arial"/>
+                <w:b/>
+                <w:bCs/>
+                <w:sz w:val="24"/>
+                <w:szCs w:val="24"/>
+              </w:rPr>
+              <w:t>D7 sessions</w:t>
+            </w:r>
+          </w:p>
+        </w:tc>
+        <w:tc>
+          <w:tcPr>
+            <w:tcW w:w="6400" w:type="dxa"/>
+            <w:tcBorders>
+              <w:top w:val="single" w:sz="4" w:space="0" w:color="000000"/>
+              <w:left w:val="single" w:sz="4" w:space="0" w:color="000000"/>
+              <w:bottom w:val="single" w:sz="4" w:space="0" w:color="000000"/>
+              <w:right w:val="single" w:sz="4" w:space="0" w:color="000000"/>
+            </w:tcBorders>
+            <w:shd w:val="clear" w:color="auto" w:fill="FFFFFF"/>
+            <w:tcMar>
+              <w:top w:w="80" w:type="dxa"/>
+              <w:left w:w="120" w:type="dxa"/>
+              <w:bottom w:w="80" w:type="dxa"/>
+              <w:right w:w="120" w:type="dxa"/>
+            </w:tcMar>
+          </w:tcPr>
+          <w:p>
+            <w:pPr>
+              <w:jc w:val="center"/>
+              <w:rPr>
+                <w:sz w:val="24"/>
+                <w:szCs w:val="24"/>
+              </w:rPr>
+            </w:pPr>
+            <w:r>
+              <w:rPr>
+                <w:rFonts w:eastAsia="Arial"/>
+                <w:sz w:val="24"/>
+                <w:szCs w:val="24"/>
+              </w:rPr>
+              <w:t>Trainer session bookings. Authentication required.</w:t>
+            </w:r>
+          </w:p>
+        </w:tc>
+      </w:tr>
+      <w:tr>
+        <w:tc>
+          <w:tcPr>
+            <w:tcW w:w="2600" w:type="dxa"/>
+            <w:tcBorders>
+              <w:top w:val="single" w:sz="4" w:space="0" w:color="000000"/>
+              <w:left w:val="single" w:sz="4" w:space="0" w:color="000000"/>
+              <w:bottom w:val="single" w:sz="4" w:space="0" w:color="000000"/>
+              <w:right w:val="single" w:sz="4" w:space="0" w:color="000000"/>
+            </w:tcBorders>
+            <w:shd w:val="clear" w:color="auto" w:fill="FFFFFF"/>
+            <w:tcMar>
+              <w:top w:w="80" w:type="dxa"/>
+              <w:left w:w="120" w:type="dxa"/>
+              <w:bottom w:w="80" w:type="dxa"/>
+              <w:right w:w="120" w:type="dxa"/>
+            </w:tcMar>
+          </w:tcPr>
+          <w:p>
+            <w:pPr>
+              <w:jc w:val="center"/>
+              <w:rPr>
+                <w:b/>
+                <w:bCs/>
+                <w:sz w:val="24"/>
+                <w:szCs w:val="24"/>
+              </w:rPr>
+            </w:pPr>
+            <w:r>
+              <w:rPr>
+                <w:rFonts w:eastAsia="Arial"/>
+                <w:b/>
+                <w:bCs/>
+                <w:sz w:val="24"/>
+                <w:szCs w:val="24"/>
+              </w:rPr>
+              <w:t>D8 announcements</w:t>
+            </w:r>
+          </w:p>
+        </w:tc>
+        <w:tc>
+          <w:tcPr>
+            <w:tcW w:w="6400" w:type="dxa"/>
+            <w:tcBorders>
+              <w:top w:val="single" w:sz="4" w:space="0" w:color="000000"/>
+              <w:left w:val="single" w:sz="4" w:space="0" w:color="000000"/>
+              <w:bottom w:val="single" w:sz="4" w:space="0" w:color="000000"/>
+              <w:right w:val="single" w:sz="4" w:space="0" w:color="000000"/>
+            </w:tcBorders>
+            <w:shd w:val="clear" w:color="auto" w:fill="FFFFFF"/>
+            <w:tcMar>
+              <w:top w:w="80" w:type="dxa"/>
+              <w:left w:w="120" w:type="dxa"/>
+              <w:bottom w:w="80" w:type="dxa"/>
+              <w:right w:w="120" w:type="dxa"/>
+            </w:tcMar>
+          </w:tcPr>
+          <w:p>
+            <w:pPr>
+              <w:jc w:val="center"/>
+              <w:rPr>
+                <w:sz w:val="24"/>
+                <w:szCs w:val="24"/>
+              </w:rPr>
+            </w:pPr>
+            <w:r>
+              <w:rPr>
+                <w:rFonts w:eastAsia="Arial"/>
+                <w:sz w:val="24"/>
+                <w:szCs w:val="24"/>
+              </w:rPr>
+              <w:t>Gym announcements. Authentication required.</w:t>
+            </w:r>
+          </w:p>
+        </w:tc>
+      </w:tr>
+      <w:tr>
+        <w:tc>
+          <w:tcPr>
+            <w:tcW w:w="2600" w:type="dxa"/>
+            <w:tcBorders>
+              <w:top w:val="single" w:sz="4" w:space="0" w:color="000000"/>
+              <w:left w:val="single" w:sz="4" w:space="0" w:color="000000"/>
+              <w:bottom w:val="single" w:sz="4" w:space="0" w:color="000000"/>
+              <w:right w:val="single" w:sz="4" w:space="0" w:color="000000"/>
+            </w:tcBorders>
+            <w:shd w:val="clear" w:color="auto" w:fill="FFFFFF"/>
+            <w:tcMar>
+              <w:top w:w="80" w:type="dxa"/>
+              <w:left w:w="120" w:type="dxa"/>
+              <w:bottom w:w="80" w:type="dxa"/>
+              <w:right w:w="120" w:type="dxa"/>
+            </w:tcMar>
+          </w:tcPr>
+          <w:p>
+            <w:pPr>
+              <w:jc w:val="center"/>
+              <w:rPr>
+                <w:b/>
+                <w:bCs/>
+                <w:sz w:val="24"/>
+                <w:szCs w:val="24"/>
+              </w:rPr>
+            </w:pPr>
+            <w:r>
+              <w:rPr>
+                <w:rFonts w:eastAsia="Arial"/>
+                <w:b/>
+                <w:bCs/>
+                <w:sz w:val="24"/>
+                <w:szCs w:val="24"/>
+              </w:rPr>
+              <w:t>D9 messages + notifications</w:t>
+            </w:r>
+          </w:p>
+        </w:tc>
+        <w:tc>
+          <w:tcPr>
+            <w:tcW w:w="6400" w:type="dxa"/>
+            <w:tcBorders>
+              <w:top w:val="single" w:sz="4" w:space="0" w:color="000000"/>
+              <w:left w:val="single" w:sz="4" w:space="0" w:color="000000"/>
+              <w:bottom w:val="single" w:sz="4" w:space="0" w:color="000000"/>
+              <w:right w:val="single" w:sz="4" w:space="0" w:color="000000"/>
+            </w:tcBorders>
+            <w:shd w:val="clear" w:color="auto" w:fill="FFFFFF"/>
+            <w:tcMar>
+              <w:top w:w="80" w:type="dxa"/>
+              <w:left w:w="120" w:type="dxa"/>
+              <w:bottom w:w="80" w:type="dxa"/>
+              <w:right w:w="120" w:type="dxa"/>
+            </w:tcMar>
+          </w:tcPr>
+          <w:p>
+            <w:pPr>
+              <w:jc w:val="center"/>
+              <w:rPr>
+                <w:sz w:val="24"/>
+                <w:szCs w:val="24"/>
+              </w:rPr>
+            </w:pPr>
+            <w:r>
+              <w:rPr>
+                <w:rFonts w:eastAsia="Arial"/>
+                <w:sz w:val="24"/>
+                <w:szCs w:val="24"/>
+              </w:rPr>
+              <w:t>Member threads and in-app notifications. Authentication required.</w:t>
+            </w:r>
+          </w:p>
+        </w:tc>
+      </w:tr>
+      <w:tr>
+        <w:tc>
+          <w:tcPr>
+            <w:tcW w:w="2600" w:type="dxa"/>
+            <w:tcBorders>
+              <w:top w:val="single" w:sz="4" w:space="0" w:color="000000"/>
+              <w:left w:val="single" w:sz="4" w:space="0" w:color="000000"/>
+              <w:bottom w:val="single" w:sz="4" w:space="0" w:color="000000"/>
+              <w:right w:val="single" w:sz="4" w:space="0" w:color="000000"/>
+            </w:tcBorders>
+            <w:shd w:val="clear" w:color="auto" w:fill="FFFFFF"/>
+            <w:tcMar>
+              <w:top w:w="80" w:type="dxa"/>
+              <w:left w:w="120" w:type="dxa"/>
+              <w:bottom w:w="80" w:type="dxa"/>
+              <w:right w:w="120" w:type="dxa"/>
+            </w:tcMar>
+          </w:tcPr>
+          <w:p>
+            <w:pPr>
+              <w:jc w:val="center"/>
+              <w:rPr>
+                <w:b/>
+                <w:bCs/>
+                <w:sz w:val="24"/>
+                <w:szCs w:val="24"/>
+              </w:rPr>
+            </w:pPr>
+            <w:r>
+              <w:rPr>
+                <w:rFonts w:eastAsia="Arial"/>
+                <w:b/>
+                <w:bCs/>
+                <w:sz w:val="24"/>
+                <w:szCs w:val="24"/>
+              </w:rPr>
+              <w:t>D10 workouts + plans + goals</w:t>
+            </w:r>
+          </w:p>
+        </w:tc>
+        <w:tc>
+          <w:tcPr>
+            <w:tcW w:w="6400" w:type="dxa"/>
+            <w:tcBorders>
+              <w:top w:val="single" w:sz="4" w:space="0" w:color="000000"/>
+              <w:left w:val="single" w:sz="4" w:space="0" w:color="000000"/>
+              <w:bottom w:val="single" w:sz="4" w:space="0" w:color="000000"/>
+              <w:right w:val="single" w:sz="4" w:space="0" w:color="000000"/>
+            </w:tcBorders>
+            <w:shd w:val="clear" w:color="auto" w:fill="FFFFFF"/>
+            <w:tcMar>
+              <w:top w:w="80" w:type="dxa"/>
+              <w:left w:w="120" w:type="dxa"/>
+              <w:bottom w:w="80" w:type="dxa"/>
+              <w:right w:w="120" w:type="dxa"/>
+            </w:tcMar>
+          </w:tcPr>
+          <w:p>
+            <w:pPr>
+              <w:jc w:val="center"/>
+              <w:rPr>
+                <w:sz w:val="24"/>
+                <w:szCs w:val="24"/>
+              </w:rPr>
+            </w:pPr>
+            <w:r>
+              <w:rPr>
+                <w:rFonts w:eastAsia="Arial"/>
+                <w:sz w:val="24"/>
+                <w:szCs w:val="24"/>
+              </w:rPr>
+              <w:t>Exercise library, workout builder, workout logs, assigned plans, measurements, and goals. Authentication required.</w:t>
+            </w:r>
+          </w:p>
+        </w:tc>
+      </w:tr>
+      <w:tr>
+        <w:tc>
+          <w:tcPr>
+            <w:tcW w:w="2600" w:type="dxa"/>
+            <w:tcBorders>
+              <w:top w:val="single" w:sz="4" w:space="0" w:color="000000"/>
+              <w:left w:val="single" w:sz="4" w:space="0" w:color="000000"/>
+              <w:bottom w:val="single" w:sz="4" w:space="0" w:color="000000"/>
+              <w:right w:val="single" w:sz="4" w:space="0" w:color="000000"/>
+            </w:tcBorders>
+            <w:shd w:val="clear" w:color="auto" w:fill="FFFFFF"/>
+            <w:tcMar>
+              <w:top w:w="80" w:type="dxa"/>
+              <w:left w:w="120" w:type="dxa"/>
+              <w:bottom w:w="80" w:type="dxa"/>
+              <w:right w:w="120" w:type="dxa"/>
+            </w:tcMar>
+          </w:tcPr>
+          <w:p>
+            <w:pPr>
+              <w:jc w:val="center"/>
+              <w:rPr>
+                <w:b/>
+                <w:bCs/>
+                <w:sz w:val="24"/>
+                <w:szCs w:val="24"/>
+              </w:rPr>
+            </w:pPr>
+            <w:r>
+              <w:rPr>
+                <w:rFonts w:eastAsia="Arial"/>
+                <w:b/>
+                <w:bCs/>
+                <w:sz w:val="24"/>
+                <w:szCs w:val="24"/>
+              </w:rPr>
+              <w:t>D11 settings</w:t>
+            </w:r>
+          </w:p>
+        </w:tc>
+        <w:tc>
+          <w:tcPr>
+            <w:tcW w:w="6400" w:type="dxa"/>
+            <w:tcBorders>
+              <w:top w:val="single" w:sz="4" w:space="0" w:color="000000"/>
+              <w:left w:val="single" w:sz="4" w:space="0" w:color="000000"/>
+              <w:bottom w:val="single" w:sz="4" w:space="0" w:color="000000"/>
+              <w:right w:val="single" w:sz="4" w:space="0" w:color="000000"/>
+            </w:tcBorders>
+            <w:shd w:val="clear" w:color="auto" w:fill="FFFFFF"/>
+            <w:tcMar>
+              <w:top w:w="80" w:type="dxa"/>
+              <w:left w:w="120" w:type="dxa"/>
+              <w:bottom w:w="80" w:type="dxa"/>
+              <w:right w:w="120" w:type="dxa"/>
+            </w:tcMar>
+          </w:tcPr>
+          <w:p>
+            <w:pPr>
+              <w:jc w:val="center"/>
+              <w:rPr>
+                <w:sz w:val="24"/>
+                <w:szCs w:val="24"/>
+              </w:rPr>
+            </w:pPr>
+            <w:r>
+              <w:rPr>
+                <w:rFonts w:eastAsia="Arial"/>
+                <w:sz w:val="24"/>
+                <w:szCs w:val="24"/>
+              </w:rPr>
+              <w:t>Gym configuration and walk-in fee. Public read; writes require authentication.</w:t>
+            </w:r>
+          </w:p>
+        </w:tc>
+      </w:tr>
+      <w:tr>
+        <w:tc>
+          <w:tcPr>
+            <w:tcW w:w="2600" w:type="dxa"/>
+            <w:tcBorders>
+              <w:top w:val="single" w:sz="4" w:space="0" w:color="000000"/>
+              <w:left w:val="single" w:sz="4" w:space="0" w:color="000000"/>
+              <w:bottom w:val="single" w:sz="4" w:space="0" w:color="000000"/>
+              <w:right w:val="single" w:sz="4" w:space="0" w:color="000000"/>
+            </w:tcBorders>
+            <w:shd w:val="clear" w:color="auto" w:fill="FFFFFF"/>
+            <w:tcMar>
+              <w:top w:w="80" w:type="dxa"/>
+              <w:left w:w="120" w:type="dxa"/>
+              <w:bottom w:w="80" w:type="dxa"/>
+              <w:right w:w="120" w:type="dxa"/>
+            </w:tcMar>
+          </w:tcPr>
+          <w:p>
+            <w:pPr>
+              <w:jc w:val="center"/>
+              <w:rPr>
+                <w:b/>
+                <w:bCs/>
+                <w:sz w:val="24"/>
+                <w:szCs w:val="24"/>
+              </w:rPr>
+            </w:pPr>
+            <w:r>
+              <w:rPr>
+                <w:rFonts w:eastAsia="Arial"/>
+                <w:b/>
+                <w:bCs/>
+                <w:sz w:val="24"/>
+                <w:szCs w:val="24"/>
+              </w:rPr>
+              <w:t>D12 activitylog</w:t>
+            </w:r>
+          </w:p>
+        </w:tc>
+        <w:tc>
+          <w:tcPr>
+            <w:tcW w:w="6400" w:type="dxa"/>
+            <w:tcBorders>
+              <w:top w:val="single" w:sz="4" w:space="0" w:color="000000"/>
+              <w:left w:val="single" w:sz="4" w:space="0" w:color="000000"/>
+              <w:bottom w:val="single" w:sz="4" w:space="0" w:color="000000"/>
+              <w:right w:val="single" w:sz="4" w:space="0" w:color="000000"/>
+            </w:tcBorders>
+            <w:shd w:val="clear" w:color="auto" w:fill="FFFFFF"/>
+            <w:tcMar>
+              <w:top w:w="80" w:type="dxa"/>
+              <w:left w:w="120" w:type="dxa"/>
+              <w:bottom w:w="80" w:type="dxa"/>
+              <w:right w:w="120" w:type="dxa"/>
+            </w:tcMar>
+          </w:tcPr>
+          <w:p>
+            <w:pPr>
+              <w:jc w:val="center"/>
+              <w:rPr>
+                <w:sz w:val="24"/>
+                <w:szCs w:val="24"/>
+              </w:rPr>
+            </w:pPr>
+            <w:r>
+              <w:rPr>
+                <w:rFonts w:eastAsia="Arial"/>
+                <w:sz w:val="24"/>
+                <w:szCs w:val="24"/>
+              </w:rPr>
+              <w:t>Audit trail of system actions. Authentication required.</w:t>
+            </w:r>
+          </w:p>
+        </w:tc>
+      </w:tr>
+    </w:tbl>
+    <w:p>
+      <w:pPr>
+        <w:jc w:val="center"/>
+        <w:rPr>
+          <w:b/>
+          <w:bCs/>
+          <w:sz w:val="24"/>
+          <w:szCs w:val="24"/>
+        </w:rPr>
+      </w:pPr>
+      <w:r>
+        <w:rPr>
+          <w:b/>
+          <w:bCs/>
+          <w:sz w:val="24"/>
+          <w:szCs w:val="24"/>
+        </w:rPr>
+        <w:t xml:space="preserve">Table 4: Data Flows</w:t>
+      </w:r>
+      <w:r>
+        <w:rPr>
+          <w:b/>
+          <w:bCs/>
+          <w:sz w:val="24"/>
+          <w:szCs w:val="24"/>
+        </w:rPr>
+        <w:t/>
+      </w:r>
+      <w:r>
+        <w:rPr>
+          <w:b/>
+          <w:bCs/>
+          <w:sz w:val="24"/>
+          <w:szCs w:val="24"/>
+        </w:rPr>
+        <w:t xml:space="preserve"/>
+      </w:r>
+      <w:r>
+        <w:rPr>
+          <w:b/>
+          <w:bCs/>
+          <w:sz w:val="24"/>
+          <w:szCs w:val="24"/>
+        </w:rPr>
+        <w:t/>
+      </w:r>
+    </w:p>
+    <w:tbl>
+      <w:tblPr>
+        <w:tblW w:w="9000" w:type="dxa"/>
+        <w:jc w:val="center"/>
+        <w:tblBorders>
+          <w:top w:val="single" w:sz="4" w:space="0" w:color="auto"/>
+          <w:left w:val="single" w:sz="4" w:space="0" w:color="auto"/>
+          <w:bottom w:val="single" w:sz="4" w:space="0" w:color="auto"/>
+          <w:right w:val="single" w:sz="4" w:space="0" w:color="auto"/>
+          <w:insideH w:val="single" w:sz="4" w:space="0" w:color="auto"/>
+          <w:insideV w:val="single" w:sz="4" w:space="0" w:color="auto"/>
+        </w:tblBorders>
+        <w:tblCellMar>
+          <w:left w:w="10" w:type="dxa"/>
+          <w:right w:w="10" w:type="dxa"/>
+        </w:tblCellMar>
+        <w:tblLook w:val="04A0" w:firstRow="1" w:lastRow="0" w:firstColumn="1" w:lastColumn="0" w:noHBand="0" w:noVBand="1"/>
+      </w:tblPr>
+      <w:tblGrid>
+        <w:gridCol w:w="2600"/>
+        <w:gridCol w:w="6400"/>
+      </w:tblGrid>
+      <w:tr>
+        <w:tc>
+          <w:tcPr>
+            <w:tcW w:w="2600" w:type="dxa"/>
+            <w:tcBorders>
+              <w:top w:val="single" w:sz="4" w:space="0" w:color="000000"/>
+              <w:left w:val="single" w:sz="4" w:space="0" w:color="000000"/>
+              <w:bottom w:val="single" w:sz="4" w:space="0" w:color="000000"/>
+              <w:right w:val="single" w:sz="4" w:space="0" w:color="000000"/>
+            </w:tcBorders>
+            <w:shd w:val="clear" w:color="auto" w:fill="FFFFFF"/>
+            <w:tcMar>
+              <w:top w:w="80" w:type="dxa"/>
+              <w:left w:w="120" w:type="dxa"/>
+              <w:bottom w:w="80" w:type="dxa"/>
+              <w:right w:w="120" w:type="dxa"/>
+            </w:tcMar>
+          </w:tcPr>
+          <w:p>
+            <w:pPr>
+              <w:jc w:val="center"/>
+              <w:rPr>
+                <w:b/>
+                <w:bCs/>
+                <w:sz w:val="24"/>
+                <w:szCs w:val="24"/>
+              </w:rPr>
+            </w:pPr>
+            <w:r>
+              <w:rPr>
+                <w:rFonts w:eastAsia="Arial"/>
+                <w:b/>
+                <w:bCs/>
+                <w:sz w:val="24"/>
+                <w:szCs w:val="24"/>
+              </w:rPr>
               <w:t>Guest and System</w:t>
             </w:r>
           </w:p>
@@ -6224,6 +8535,158 @@
           </w:p>
         </w:tc>
       </w:tr>
+      <w:tr>
+        <w:tc>
+          <w:tcPr>
+            <w:tcW w:w="2600" w:type="dxa"/>
+            <w:tcBorders>
+              <w:top w:val="single" w:sz="4" w:space="0" w:color="000000"/>
+              <w:left w:val="single" w:sz="4" w:space="0" w:color="000000"/>
+              <w:bottom w:val="single" w:sz="4" w:space="0" w:color="000000"/>
+              <w:right w:val="single" w:sz="4" w:space="0" w:color="000000"/>
+            </w:tcBorders>
+            <w:shd w:val="clear" w:color="auto" w:fill="FFFFFF"/>
+            <w:tcMar>
+              <w:top w:w="80" w:type="dxa"/>
+              <w:left w:w="120" w:type="dxa"/>
+              <w:bottom w:w="80" w:type="dxa"/>
+              <w:right w:w="120" w:type="dxa"/>
+            </w:tcMar>
+          </w:tcPr>
+          <w:p>
+            <w:pPr>
+              <w:jc w:val="center"/>
+              <w:rPr>
+                <w:b/>
+                <w:bCs/>
+                <w:sz w:val="24"/>
+                <w:szCs w:val="24"/>
+              </w:rPr>
+            </w:pPr>
+            <w:r>
+              <w:rPr>
+                <w:rFonts w:eastAsia="Arial"/>
+                <w:b/>
+                <w:bCs/>
+                <w:sz w:val="24"/>
+                <w:szCs w:val="24"/>
+              </w:rPr>
+              <w:t>Members to Workouts</w:t>
+            </w:r>
+          </w:p>
+        </w:tc>
+        <w:tc>
+          <w:tcPr>
+            <w:tcW w:w="6400" w:type="dxa"/>
+            <w:tcBorders>
+              <w:top w:val="single" w:sz="4" w:space="0" w:color="000000"/>
+              <w:left w:val="single" w:sz="4" w:space="0" w:color="000000"/>
+              <w:bottom w:val="single" w:sz="4" w:space="0" w:color="000000"/>
+              <w:right w:val="single" w:sz="4" w:space="0" w:color="000000"/>
+            </w:tcBorders>
+            <w:shd w:val="clear" w:color="auto" w:fill="FFFFFF"/>
+            <w:tcMar>
+              <w:top w:w="80" w:type="dxa"/>
+              <w:left w:w="120" w:type="dxa"/>
+              <w:bottom w:w="80" w:type="dxa"/>
+              <w:right w:w="120" w:type="dxa"/>
+            </w:tcMar>
+          </w:tcPr>
+          <w:p>
+            <w:pPr>
+              <w:jc w:val="center"/>
+              <w:rPr>
+                <w:sz w:val="24"/>
+                <w:szCs w:val="24"/>
+              </w:rPr>
+            </w:pPr>
+            <w:r>
+              <w:rPr>
+                <w:rFonts w:eastAsia="Arial"/>
+                <w:sz w:val="24"/>
+                <w:szCs w:val="24"/>
+              </w:rPr>
+              <w:t>Each log, measurement, and goal links to one member; trainers assign workout plans.</w:t>
+            </w:r>
+          </w:p>
+        </w:tc>
+      </w:tr>
+      <w:tr>
+        <w:tc>
+          <w:tcPr>
+            <w:tcW w:w="2600" w:type="dxa"/>
+            <w:tcBorders>
+              <w:top w:val="single" w:sz="4" w:space="0" w:color="000000"/>
+              <w:left w:val="single" w:sz="4" w:space="0" w:color="000000"/>
+              <w:bottom w:val="single" w:sz="4" w:space="0" w:color="000000"/>
+              <w:right w:val="single" w:sz="4" w:space="0" w:color="000000"/>
+            </w:tcBorders>
+            <w:shd w:val="clear" w:color="auto" w:fill="FFFFFF"/>
+            <w:tcMar>
+              <w:top w:w="80" w:type="dxa"/>
+              <w:left w:w="120" w:type="dxa"/>
+              <w:bottom w:w="80" w:type="dxa"/>
+              <w:right w:w="120" w:type="dxa"/>
+            </w:tcMar>
+          </w:tcPr>
+          <w:p>
+            <w:pPr>
+              <w:jc w:val="center"/>
+              <w:rPr>
+                <w:b/>
+                <w:bCs/>
+                <w:sz w:val="24"/>
+                <w:szCs w:val="24"/>
+              </w:rPr>
+            </w:pPr>
+            <w:r>
+              <w:rPr>
+                <w:rFonts w:eastAsia="Arial"/>
+                <w:b/>
+                <w:bCs/>
+                <w:sz w:val="24"/>
+                <w:szCs w:val="24"/>
+              </w:rPr>
+              <w:t>Admin to Users</w:t>
+            </w:r>
+          </w:p>
+        </w:tc>
+        <w:tc>
+          <w:tcPr>
+            <w:tcW w:w="6400" w:type="dxa"/>
+            <w:tcBorders>
+              <w:top w:val="single" w:sz="4" w:space="0" w:color="000000"/>
+              <w:left w:val="single" w:sz="4" w:space="0" w:color="000000"/>
+              <w:bottom w:val="single" w:sz="4" w:space="0" w:color="000000"/>
+              <w:right w:val="single" w:sz="4" w:space="0" w:color="000000"/>
+            </w:tcBorders>
+            <w:shd w:val="clear" w:color="auto" w:fill="FFFFFF"/>
+            <w:tcMar>
+              <w:top w:w="80" w:type="dxa"/>
+              <w:left w:w="120" w:type="dxa"/>
+              <w:bottom w:w="80" w:type="dxa"/>
+              <w:right w:w="120" w:type="dxa"/>
+            </w:tcMar>
+          </w:tcPr>
+          <w:p>
+            <w:pPr>
+              <w:jc w:val="center"/>
+              <w:rPr>
+                <w:sz w:val="24"/>
+                <w:szCs w:val="24"/>
+              </w:rPr>
+            </w:pPr>
+            <w:r>
+              <w:rPr>
+                <w:rFonts w:eastAsia="Arial"/>
+                <w:sz w:val="24"/>
+                <w:szCs w:val="24"/>
+              </w:rPr>
+              <w:t>Admins approve registrations and lock, unlock, or reset user accounts.</w:t>
+            </w:r>
+          </w:p>
+        </w:tc>
+      </w:tr>
     </w:tbl>
     <w:p>
       <w:pPr>
@@ -6242,7 +8705,7 @@
           <w:sz w:val="24"/>
           <w:szCs w:val="24"/>
         </w:rPr>
-        <w:t xml:space="preserve">4. Notes</w:t>
+        <w:t xml:space="preserve">5. Notes</w:t>
       </w:r>
       <w:r>
         <w:rPr>

</xml_diff>

<commit_message>
Add parent/guardian consent waiver for underage members (papers use-case + DFD)
</commit_message>
<xml_diff>
--- a/FITCORE_DFD.docx
+++ b/FITCORE_DFD.docx
@@ -3932,7 +3932,7 @@
                 <w:sz w:val="24"/>
                 <w:szCs w:val="24"/>
               </w:rPr>
-              <w:t>D2 members.</w:t>
+              <w:t>D2 members, with date of birth and parent or guardian consent waiver for underage members.</w:t>
             </w:r>
           </w:p>
         </w:tc>
@@ -5701,7 +5701,7 @@
                 <w:sz w:val="24"/>
                 <w:szCs w:val="24"/>
               </w:rPr>
-              <w:t>Creates Auth accounts and member/staff profiles pending approval.</w:t>
+              <w:t>Creates Auth accounts and member/staff profiles pending approval, collecting parent or guardian consent and waiver for underage members.</w:t>
             </w:r>
           </w:p>
         </w:tc>

</xml_diff>

<commit_message>
Fix DFD diagrams: template-faithful text in all boxes
</commit_message>
<xml_diff>
--- a/FITCORE_DFD.docx
+++ b/FITCORE_DFD.docx
@@ -1338,7 +1338,7 @@
     <w:p>
       <w:r>
         <w:drawing>
-          <wp:anchor distT="0" distB="0" distL="114300" distR="114300" simplePos="0" relativeHeight="251679744" behindDoc="0" locked="0" layoutInCell="1" allowOverlap="1" wp14:anchorId="002DC6E5" wp14:editId="002DC6E6">
+          <wp:anchor distT="0" distB="0" distL="114300" distR="114300" simplePos="0" relativeHeight="251679744" behindDoc="0" locked="0" layoutInCell="1" allowOverlap="1" wp14:anchorId="004C4B76" wp14:editId="004C4B77">
             <wp:simplePos x="0" y="0"/>
             <wp:positionH relativeFrom="column">
               <wp:posOffset>19050</wp:posOffset>
@@ -1349,7 +1349,7 @@
             <wp:extent cx="5700000" cy="3600000"/>
             <wp:effectExtent l="0" t="0" r="0" b="10160"/>
             <wp:wrapTopAndBottom/>
-            <wp:docPr id="3000038" name="DFD Figure"/>
+            <wp:docPr id="5000055" name="DFD Figure"/>
             <wp:cNvGraphicFramePr/>
             <a:graphic xmlns:a="http://schemas.openxmlformats.org/drawingml/2006/main">
               <a:graphicData uri="http://schemas.microsoft.com/office/word/2010/wordprocessingGroup">
@@ -1364,7 +1364,7 @@
                     </a:xfrm>
                   </wpg:grpSpPr>
                   <wps:wsp>
-                    <wps:cNvPr id="3000001" name="Box 3000001"/>
+                    <wps:cNvPr id="5000001" name="Box 5000001"/>
                     <wps:cNvSpPr/>
                     <wps:spPr>
                       <a:xfrm>
@@ -1386,18 +1386,12 @@
                     <wps:txbx>
                       <wps:txbxContent>
                         <w:p>
-                          <w:pPr>
-                            <w:jc w:val="center"/>
-                          </w:pPr>
                           <w:r>
                             <w:rPr>
                               <w:rFonts w:ascii="Arial" w:eastAsia="Arial" w:hAnsi="Arial" w:cs="Arial"/>
-                              <w:b/>
-                              <w:bCs/>
                               <w:sz w:val="20"/>
-                              <w:szCs w:val="20"/>
                             </w:rPr>
-                            <w:t xml:space="preserve">Trainer</w:t>
+                            <w:t>Trainer</w:t>
                           </w:r>
                         </w:p>
                       </wps:txbxContent>
@@ -1407,7 +1401,7 @@
                     </wps:bodyPr>
                   </wps:wsp>
                   <wps:wsp>
-                    <wps:cNvPr id="3000002" name="Box 3000002"/>
+                    <wps:cNvPr id="5000002" name="Box 5000002"/>
                     <wps:cNvSpPr/>
                     <wps:spPr>
                       <a:xfrm>
@@ -1429,18 +1423,12 @@
                     <wps:txbx>
                       <wps:txbxContent>
                         <w:p>
-                          <w:pPr>
-                            <w:jc w:val="center"/>
-                          </w:pPr>
                           <w:r>
                             <w:rPr>
                               <w:rFonts w:ascii="Arial" w:eastAsia="Arial" w:hAnsi="Arial" w:cs="Arial"/>
-                              <w:b/>
-                              <w:bCs/>
                               <w:sz w:val="20"/>
-                              <w:szCs w:val="20"/>
                             </w:rPr>
-                            <w:t xml:space="preserve">Guest</w:t>
+                            <w:t>Guest</w:t>
                           </w:r>
                         </w:p>
                       </wps:txbxContent>
@@ -1450,7 +1438,7 @@
                     </wps:bodyPr>
                   </wps:wsp>
                   <wps:wsp>
-                    <wps:cNvPr id="3000003" name="Box 3000003"/>
+                    <wps:cNvPr id="5000003" name="Box 5000003"/>
                     <wps:cNvSpPr/>
                     <wps:spPr>
                       <a:xfrm>
@@ -1472,18 +1460,12 @@
                     <wps:txbx>
                       <wps:txbxContent>
                         <w:p>
-                          <w:pPr>
-                            <w:jc w:val="center"/>
-                          </w:pPr>
                           <w:r>
                             <w:rPr>
                               <w:rFonts w:ascii="Arial" w:eastAsia="Arial" w:hAnsi="Arial" w:cs="Arial"/>
-                              <w:b/>
-                              <w:bCs/>
                               <w:sz w:val="22"/>
-                              <w:szCs w:val="22"/>
                             </w:rPr>
-                            <w:t xml:space="preserve">0. FitCore GMS</w:t>
+                            <w:t>0. FitCore GMS</w:t>
                           </w:r>
                         </w:p>
                       </wps:txbxContent>
@@ -1493,7 +1475,7 @@
                     </wps:bodyPr>
                   </wps:wsp>
                   <wps:wsp>
-                    <wps:cNvPr id="3000004" name="Box 3000004"/>
+                    <wps:cNvPr id="5000004" name="Box 5000004"/>
                     <wps:cNvSpPr/>
                     <wps:spPr>
                       <a:xfrm>
@@ -1515,18 +1497,12 @@
                     <wps:txbx>
                       <wps:txbxContent>
                         <w:p>
-                          <w:pPr>
-                            <w:jc w:val="center"/>
-                          </w:pPr>
                           <w:r>
                             <w:rPr>
                               <w:rFonts w:ascii="Arial" w:eastAsia="Arial" w:hAnsi="Arial" w:cs="Arial"/>
-                              <w:b/>
-                              <w:bCs/>
                               <w:sz w:val="20"/>
-                              <w:szCs w:val="20"/>
                             </w:rPr>
-                            <w:t xml:space="preserve">Member</w:t>
+                            <w:t>Member</w:t>
                           </w:r>
                         </w:p>
                       </wps:txbxContent>
@@ -1536,7 +1512,7 @@
                     </wps:bodyPr>
                   </wps:wsp>
                   <wps:wsp>
-                    <wps:cNvPr id="3000005" name="Box 3000005"/>
+                    <wps:cNvPr id="5000005" name="Box 5000005"/>
                     <wps:cNvSpPr/>
                     <wps:spPr>
                       <a:xfrm>
@@ -1558,18 +1534,12 @@
                     <wps:txbx>
                       <wps:txbxContent>
                         <w:p>
-                          <w:pPr>
-                            <w:jc w:val="center"/>
-                          </w:pPr>
                           <w:r>
                             <w:rPr>
                               <w:rFonts w:ascii="Arial" w:eastAsia="Arial" w:hAnsi="Arial" w:cs="Arial"/>
-                              <w:b/>
-                              <w:bCs/>
                               <w:sz w:val="20"/>
-                              <w:szCs w:val="20"/>
                             </w:rPr>
-                            <w:t xml:space="preserve">Staff / Admin</w:t>
+                            <w:t>Staff / Admin</w:t>
                           </w:r>
                         </w:p>
                       </wps:txbxContent>
@@ -1579,7 +1549,7 @@
                     </wps:bodyPr>
                   </wps:wsp>
                   <wps:wsp>
-                    <wps:cNvPr id="3000006" name="Box 3000006"/>
+                    <wps:cNvPr id="5000006" name="Box 5000006"/>
                     <wps:cNvSpPr/>
                     <wps:spPr>
                       <a:xfrm>
@@ -1601,18 +1571,12 @@
                     <wps:txbx>
                       <wps:txbxContent>
                         <w:p>
-                          <w:pPr>
-                            <w:jc w:val="center"/>
-                          </w:pPr>
                           <w:r>
                             <w:rPr>
                               <w:rFonts w:ascii="Arial" w:eastAsia="Arial" w:hAnsi="Arial" w:cs="Arial"/>
-                              <w:b/>
-                              <w:bCs/>
                               <w:sz w:val="18"/>
-                              <w:szCs w:val="18"/>
                             </w:rPr>
-                            <w:t xml:space="preserve">Firebase Auth + Firestore</w:t>
+                            <w:t>Firebase Auth + Firestore</w:t>
                           </w:r>
                         </w:p>
                       </wps:txbxContent>
@@ -1622,7 +1586,7 @@
                     </wps:bodyPr>
                   </wps:wsp>
                   <wps:wsp>
-                    <wps:cNvPr id="3000007" name="Arrow 3000007"/>
+                    <wps:cNvPr id="5000007" name="Arrow 5000007"/>
                     <wps:cNvSpPr/>
                     <wps:spPr>
                       <a:xfrm>
@@ -1652,12 +1616,27 @@
                         </a:solidFill>
                         <a:headEnd ty="triangle" w="med" len="med"/>
                         <a:tailEnd ty="triangle" w="med" len="med"/>
+                        <a:miter lim="100000"/>
                       </a:ln>
                     </wps:spPr>
+                    <wps:style>
+                      <a:lnRef idx="1">
+                        <a:srgbClr val="181818"/>
+                      </a:lnRef>
+                      <a:fillRef idx="0">
+                        <a:srgbClr val="000000">
+                          <a:alpha val="0"/>
+                        </a:srgbClr>
+                      </a:fillRef>
+                      <a:effectRef idx="0">
+                        <a:scrgbClr r="0" g="0" b="0"/>
+                      </a:effectRef>
+                      <a:fontRef idx="none"/>
+                    </wps:style>
                     <wps:bodyPr/>
                   </wps:wsp>
                   <wps:wsp>
-                    <wps:cNvPr id="3000008" name="Arrow 3000008"/>
+                    <wps:cNvPr id="5000008" name="Arrow 5000008"/>
                     <wps:cNvSpPr/>
                     <wps:spPr>
                       <a:xfrm>
@@ -1687,12 +1666,27 @@
                         </a:solidFill>
                         <a:headEnd ty="triangle" w="med" len="med"/>
                         <a:tailEnd ty="triangle" w="med" len="med"/>
+                        <a:miter lim="100000"/>
                       </a:ln>
                     </wps:spPr>
+                    <wps:style>
+                      <a:lnRef idx="1">
+                        <a:srgbClr val="181818"/>
+                      </a:lnRef>
+                      <a:fillRef idx="0">
+                        <a:srgbClr val="000000">
+                          <a:alpha val="0"/>
+                        </a:srgbClr>
+                      </a:fillRef>
+                      <a:effectRef idx="0">
+                        <a:scrgbClr r="0" g="0" b="0"/>
+                      </a:effectRef>
+                      <a:fontRef idx="none"/>
+                    </wps:style>
                     <wps:bodyPr/>
                   </wps:wsp>
                   <wps:wsp>
-                    <wps:cNvPr id="3000009" name="Arrow 3000009"/>
+                    <wps:cNvPr id="5000009" name="Arrow 5000009"/>
                     <wps:cNvSpPr/>
                     <wps:spPr>
                       <a:xfrm>
@@ -1722,12 +1716,27 @@
                         </a:solidFill>
                         <a:headEnd ty="triangle" w="med" len="med"/>
                         <a:tailEnd ty="triangle" w="med" len="med"/>
+                        <a:miter lim="100000"/>
                       </a:ln>
                     </wps:spPr>
+                    <wps:style>
+                      <a:lnRef idx="1">
+                        <a:srgbClr val="181818"/>
+                      </a:lnRef>
+                      <a:fillRef idx="0">
+                        <a:srgbClr val="000000">
+                          <a:alpha val="0"/>
+                        </a:srgbClr>
+                      </a:fillRef>
+                      <a:effectRef idx="0">
+                        <a:scrgbClr r="0" g="0" b="0"/>
+                      </a:effectRef>
+                      <a:fontRef idx="none"/>
+                    </wps:style>
                     <wps:bodyPr/>
                   </wps:wsp>
                   <wps:wsp>
-                    <wps:cNvPr id="3000010" name="Arrow 3000010"/>
+                    <wps:cNvPr id="5000010" name="Arrow 5000010"/>
                     <wps:cNvSpPr/>
                     <wps:spPr>
                       <a:xfrm>
@@ -1757,12 +1766,27 @@
                         </a:solidFill>
                         <a:headEnd ty="triangle" w="med" len="med"/>
                         <a:tailEnd ty="triangle" w="med" len="med"/>
+                        <a:miter lim="100000"/>
                       </a:ln>
                     </wps:spPr>
+                    <wps:style>
+                      <a:lnRef idx="1">
+                        <a:srgbClr val="181818"/>
+                      </a:lnRef>
+                      <a:fillRef idx="0">
+                        <a:srgbClr val="000000">
+                          <a:alpha val="0"/>
+                        </a:srgbClr>
+                      </a:fillRef>
+                      <a:effectRef idx="0">
+                        <a:scrgbClr r="0" g="0" b="0"/>
+                      </a:effectRef>
+                      <a:fontRef idx="none"/>
+                    </wps:style>
                     <wps:bodyPr/>
                   </wps:wsp>
                   <wps:wsp>
-                    <wps:cNvPr id="3000011" name="Arrow 3000011"/>
+                    <wps:cNvPr id="5000011" name="Arrow 5000011"/>
                     <wps:cNvSpPr/>
                     <wps:spPr>
                       <a:xfrm>
@@ -1792,8 +1816,23 @@
                         </a:solidFill>
                         <a:headEnd ty="triangle" w="med" len="med"/>
                         <a:tailEnd ty="triangle" w="med" len="med"/>
+                        <a:miter lim="100000"/>
                       </a:ln>
                     </wps:spPr>
+                    <wps:style>
+                      <a:lnRef idx="1">
+                        <a:srgbClr val="181818"/>
+                      </a:lnRef>
+                      <a:fillRef idx="0">
+                        <a:srgbClr val="000000">
+                          <a:alpha val="0"/>
+                        </a:srgbClr>
+                      </a:fillRef>
+                      <a:effectRef idx="0">
+                        <a:scrgbClr r="0" g="0" b="0"/>
+                      </a:effectRef>
+                      <a:fontRef idx="none"/>
+                    </wps:style>
                     <wps:bodyPr/>
                   </wps:wsp>
                 </wpg:wgp>
@@ -2515,7 +2554,7 @@
     <w:p>
       <w:r>
         <w:drawing>
-          <wp:anchor distT="0" distB="0" distL="114300" distR="114300" simplePos="0" relativeHeight="251679744" behindDoc="0" locked="0" layoutInCell="1" allowOverlap="1" wp14:anchorId="003D091C" wp14:editId="003D091D">
+          <wp:anchor distT="0" distB="0" distL="114300" distR="114300" simplePos="0" relativeHeight="251679744" behindDoc="0" locked="0" layoutInCell="1" allowOverlap="1" wp14:anchorId="004C4B79" wp14:editId="004C4B7A">
             <wp:simplePos x="0" y="0"/>
             <wp:positionH relativeFrom="column">
               <wp:posOffset>19050</wp:posOffset>
@@ -2523,10 +2562,10 @@
             <wp:positionV relativeFrom="paragraph">
               <wp:posOffset>179070</wp:posOffset>
             </wp:positionV>
-            <wp:extent cx="5700000" cy="4600000"/>
+            <wp:extent cx="5700000" cy="4500000"/>
             <wp:effectExtent l="0" t="0" r="0" b="10160"/>
             <wp:wrapTopAndBottom/>
-            <wp:docPr id="4000029" name="DFD Figure"/>
+            <wp:docPr id="5000058" name="DFD Figure"/>
             <wp:cNvGraphicFramePr/>
             <a:graphic xmlns:a="http://schemas.openxmlformats.org/drawingml/2006/main">
               <a:graphicData uri="http://schemas.microsoft.com/office/word/2010/wordprocessingGroup">
@@ -2535,13 +2574,13 @@
                   <wpg:grpSpPr>
                     <a:xfrm>
                       <a:off x="0" y="0"/>
-                      <a:ext cx="5700000" cy="4600000"/>
+                      <a:ext cx="5700000" cy="4500000"/>
                       <a:chOff x="0" y="0"/>
-                      <a:chExt cx="5700000" cy="4600000"/>
+                      <a:chExt cx="5700000" cy="4500000"/>
                     </a:xfrm>
                   </wpg:grpSpPr>
                   <wps:wsp>
-                    <wps:cNvPr id="4000001" name="Box 4000001"/>
+                    <wps:cNvPr id="5000012" name="Box 5000012"/>
                     <wps:cNvSpPr/>
                     <wps:spPr>
                       <a:xfrm>
@@ -2563,18 +2602,12 @@
                     <wps:txbx>
                       <wps:txbxContent>
                         <w:p>
-                          <w:pPr>
-                            <w:jc w:val="center"/>
-                          </w:pPr>
                           <w:r>
                             <w:rPr>
                               <w:rFonts w:ascii="Arial" w:eastAsia="Arial" w:hAnsi="Arial" w:cs="Arial"/>
-                              <w:b/>
-                              <w:bCs/>
                               <w:sz w:val="18"/>
-                              <w:szCs w:val="18"/>
                             </w:rPr>
-                            <w:t xml:space="preserve">Guest</w:t>
+                            <w:t>Guest</w:t>
                           </w:r>
                         </w:p>
                       </wps:txbxContent>
@@ -2584,7 +2617,7 @@
                     </wps:bodyPr>
                   </wps:wsp>
                   <wps:wsp>
-                    <wps:cNvPr id="4000002" name="Box 4000002"/>
+                    <wps:cNvPr id="5000013" name="Box 5000013"/>
                     <wps:cNvSpPr/>
                     <wps:spPr>
                       <a:xfrm>
@@ -2606,18 +2639,12 @@
                     <wps:txbx>
                       <wps:txbxContent>
                         <w:p>
-                          <w:pPr>
-                            <w:jc w:val="center"/>
-                          </w:pPr>
                           <w:r>
                             <w:rPr>
                               <w:rFonts w:ascii="Arial" w:eastAsia="Arial" w:hAnsi="Arial" w:cs="Arial"/>
-                              <w:b/>
-                              <w:bCs/>
                               <w:sz w:val="18"/>
-                              <w:szCs w:val="18"/>
                             </w:rPr>
-                            <w:t xml:space="preserve">Member</w:t>
+                            <w:t>Member</w:t>
                           </w:r>
                         </w:p>
                       </wps:txbxContent>
@@ -2627,7 +2654,7 @@
                     </wps:bodyPr>
                   </wps:wsp>
                   <wps:wsp>
-                    <wps:cNvPr id="4000003" name="Box 4000003"/>
+                    <wps:cNvPr id="5000014" name="Box 5000014"/>
                     <wps:cNvSpPr/>
                     <wps:spPr>
                       <a:xfrm>
@@ -2649,18 +2676,12 @@
                     <wps:txbx>
                       <wps:txbxContent>
                         <w:p>
-                          <w:pPr>
-                            <w:jc w:val="center"/>
-                          </w:pPr>
                           <w:r>
                             <w:rPr>
                               <w:rFonts w:ascii="Arial" w:eastAsia="Arial" w:hAnsi="Arial" w:cs="Arial"/>
-                              <w:b/>
-                              <w:bCs/>
                               <w:sz w:val="18"/>
-                              <w:szCs w:val="18"/>
                             </w:rPr>
-                            <w:t xml:space="preserve">Trainer</w:t>
+                            <w:t>Trainer</w:t>
                           </w:r>
                         </w:p>
                       </wps:txbxContent>
@@ -2670,7 +2691,7 @@
                     </wps:bodyPr>
                   </wps:wsp>
                   <wps:wsp>
-                    <wps:cNvPr id="4000004" name="Box 4000004"/>
+                    <wps:cNvPr id="5000015" name="Box 5000015"/>
                     <wps:cNvSpPr/>
                     <wps:spPr>
                       <a:xfrm>
@@ -2692,18 +2713,12 @@
                     <wps:txbx>
                       <wps:txbxContent>
                         <w:p>
-                          <w:pPr>
-                            <w:jc w:val="center"/>
-                          </w:pPr>
                           <w:r>
                             <w:rPr>
                               <w:rFonts w:ascii="Arial" w:eastAsia="Arial" w:hAnsi="Arial" w:cs="Arial"/>
-                              <w:b/>
-                              <w:bCs/>
                               <w:sz w:val="18"/>
-                              <w:szCs w:val="18"/>
                             </w:rPr>
-                            <w:t xml:space="preserve">Staff/Admin</w:t>
+                            <w:t>Staff/Admin</w:t>
                           </w:r>
                         </w:p>
                       </wps:txbxContent>
@@ -2713,7 +2728,7 @@
                     </wps:bodyPr>
                   </wps:wsp>
                   <wps:wsp>
-                    <wps:cNvPr id="4000005" name="Box 4000005"/>
+                    <wps:cNvPr id="5000016" name="Box 5000016"/>
                     <wps:cNvSpPr/>
                     <wps:spPr>
                       <a:xfrm>
@@ -2735,18 +2750,12 @@
                     <wps:txbx>
                       <wps:txbxContent>
                         <w:p>
-                          <w:pPr>
-                            <w:jc w:val="center"/>
-                          </w:pPr>
                           <w:r>
                             <w:rPr>
                               <w:rFonts w:ascii="Arial" w:eastAsia="Arial" w:hAnsi="Arial" w:cs="Arial"/>
-                              <w:b/>
-                              <w:bCs/>
                               <w:sz w:val="14"/>
-                              <w:szCs w:val="14"/>
                             </w:rPr>
-                            <w:t xml:space="preserve">1.0 Auth + Registration</w:t>
+                            <w:t>1.0 Auth + Registration</w:t>
                           </w:r>
                         </w:p>
                       </wps:txbxContent>
@@ -2756,7 +2765,7 @@
                     </wps:bodyPr>
                   </wps:wsp>
                   <wps:wsp>
-                    <wps:cNvPr id="4000006" name="Box 4000006"/>
+                    <wps:cNvPr id="5000017" name="Box 5000017"/>
                     <wps:cNvSpPr/>
                     <wps:spPr>
                       <a:xfrm>
@@ -2778,18 +2787,12 @@
                     <wps:txbx>
                       <wps:txbxContent>
                         <w:p>
-                          <w:pPr>
-                            <w:jc w:val="center"/>
-                          </w:pPr>
                           <w:r>
                             <w:rPr>
                               <w:rFonts w:ascii="Arial" w:eastAsia="Arial" w:hAnsi="Arial" w:cs="Arial"/>
-                              <w:b/>
-                              <w:bCs/>
                               <w:sz w:val="14"/>
-                              <w:szCs w:val="14"/>
                             </w:rPr>
-                            <w:t xml:space="preserve">2.0 Member Management</w:t>
+                            <w:t>2.0 Member Management</w:t>
                           </w:r>
                         </w:p>
                       </wps:txbxContent>
@@ -2799,7 +2802,7 @@
                     </wps:bodyPr>
                   </wps:wsp>
                   <wps:wsp>
-                    <wps:cNvPr id="4000007" name="Box 4000007"/>
+                    <wps:cNvPr id="5000018" name="Box 5000018"/>
                     <wps:cNvSpPr/>
                     <wps:spPr>
                       <a:xfrm>
@@ -2821,18 +2824,12 @@
                     <wps:txbx>
                       <wps:txbxContent>
                         <w:p>
-                          <w:pPr>
-                            <w:jc w:val="center"/>
-                          </w:pPr>
                           <w:r>
                             <w:rPr>
                               <w:rFonts w:ascii="Arial" w:eastAsia="Arial" w:hAnsi="Arial" w:cs="Arial"/>
-                              <w:b/>
-                              <w:bCs/>
                               <w:sz w:val="14"/>
-                              <w:szCs w:val="14"/>
                             </w:rPr>
-                            <w:t xml:space="preserve">3.0 Plans Management</w:t>
+                            <w:t>3.0 Plans Management</w:t>
                           </w:r>
                         </w:p>
                       </wps:txbxContent>
@@ -2842,7 +2839,7 @@
                     </wps:bodyPr>
                   </wps:wsp>
                   <wps:wsp>
-                    <wps:cNvPr id="4000008" name="Box 4000008"/>
+                    <wps:cNvPr id="5000019" name="Box 5000019"/>
                     <wps:cNvSpPr/>
                     <wps:spPr>
                       <a:xfrm>
@@ -2864,18 +2861,12 @@
                     <wps:txbx>
                       <wps:txbxContent>
                         <w:p>
-                          <w:pPr>
-                            <w:jc w:val="center"/>
-                          </w:pPr>
                           <w:r>
                             <w:rPr>
                               <w:rFonts w:ascii="Arial" w:eastAsia="Arial" w:hAnsi="Arial" w:cs="Arial"/>
-                              <w:b/>
-                              <w:bCs/>
                               <w:sz w:val="14"/>
-                              <w:szCs w:val="14"/>
                             </w:rPr>
-                            <w:t xml:space="preserve">4.0 Billing + Payments</w:t>
+                            <w:t>4.0 Billing + Payments</w:t>
                           </w:r>
                         </w:p>
                       </wps:txbxContent>
@@ -2885,7 +2876,7 @@
                     </wps:bodyPr>
                   </wps:wsp>
                   <wps:wsp>
-                    <wps:cNvPr id="4000009" name="Box 4000009"/>
+                    <wps:cNvPr id="5000020" name="Box 5000020"/>
                     <wps:cNvSpPr/>
                     <wps:spPr>
                       <a:xfrm>
@@ -2907,18 +2898,12 @@
                     <wps:txbx>
                       <wps:txbxContent>
                         <w:p>
-                          <w:pPr>
-                            <w:jc w:val="center"/>
-                          </w:pPr>
                           <w:r>
                             <w:rPr>
                               <w:rFonts w:ascii="Arial" w:eastAsia="Arial" w:hAnsi="Arial" w:cs="Arial"/>
-                              <w:b/>
-                              <w:bCs/>
                               <w:sz w:val="14"/>
-                              <w:szCs w:val="14"/>
                             </w:rPr>
-                            <w:t xml:space="preserve">5.0 Attendance + QR/Queue</w:t>
+                            <w:t>5.0 Attendance + QR/Queue</w:t>
                           </w:r>
                         </w:p>
                       </wps:txbxContent>
@@ -2928,7 +2913,7 @@
                     </wps:bodyPr>
                   </wps:wsp>
                   <wps:wsp>
-                    <wps:cNvPr id="4000010" name="Box 4000010"/>
+                    <wps:cNvPr id="5000021" name="Box 5000021"/>
                     <wps:cNvSpPr/>
                     <wps:spPr>
                       <a:xfrm>
@@ -2950,18 +2935,12 @@
                     <wps:txbx>
                       <wps:txbxContent>
                         <w:p>
-                          <w:pPr>
-                            <w:jc w:val="center"/>
-                          </w:pPr>
                           <w:r>
                             <w:rPr>
                               <w:rFonts w:ascii="Arial" w:eastAsia="Arial" w:hAnsi="Arial" w:cs="Arial"/>
-                              <w:b/>
-                              <w:bCs/>
                               <w:sz w:val="14"/>
-                              <w:szCs w:val="14"/>
                             </w:rPr>
-                            <w:t xml:space="preserve">6.0 Walk-In + Fee</w:t>
+                            <w:t>6.0 Walk-In + Fee</w:t>
                           </w:r>
                         </w:p>
                       </wps:txbxContent>
@@ -2971,7 +2950,7 @@
                     </wps:bodyPr>
                   </wps:wsp>
                   <wps:wsp>
-                    <wps:cNvPr id="4000011" name="Box 4000011"/>
+                    <wps:cNvPr id="5000022" name="Box 5000022"/>
                     <wps:cNvSpPr/>
                     <wps:spPr>
                       <a:xfrm>
@@ -2993,18 +2972,12 @@
                     <wps:txbx>
                       <wps:txbxContent>
                         <w:p>
-                          <w:pPr>
-                            <w:jc w:val="center"/>
-                          </w:pPr>
                           <w:r>
                             <w:rPr>
                               <w:rFonts w:ascii="Arial" w:eastAsia="Arial" w:hAnsi="Arial" w:cs="Arial"/>
-                              <w:b/>
-                              <w:bCs/>
                               <w:sz w:val="14"/>
-                              <w:szCs w:val="14"/>
                             </w:rPr>
-                            <w:t xml:space="preserve">7.0 Trainer + Sessions</w:t>
+                            <w:t>7.0 Trainer + Sessions</w:t>
                           </w:r>
                         </w:p>
                       </wps:txbxContent>
@@ -3014,7 +2987,7 @@
                     </wps:bodyPr>
                   </wps:wsp>
                   <wps:wsp>
-                    <wps:cNvPr id="4000012" name="Box 4000012"/>
+                    <wps:cNvPr id="5000023" name="Box 5000023"/>
                     <wps:cNvSpPr/>
                     <wps:spPr>
                       <a:xfrm>
@@ -3036,18 +3009,12 @@
                     <wps:txbx>
                       <wps:txbxContent>
                         <w:p>
-                          <w:pPr>
-                            <w:jc w:val="center"/>
-                          </w:pPr>
                           <w:r>
                             <w:rPr>
                               <w:rFonts w:ascii="Arial" w:eastAsia="Arial" w:hAnsi="Arial" w:cs="Arial"/>
-                              <w:b/>
-                              <w:bCs/>
                               <w:sz w:val="14"/>
-                              <w:szCs w:val="14"/>
                             </w:rPr>
-                            <w:t xml:space="preserve">8.0 Workout + Fitness</w:t>
+                            <w:t>8.0 Workout + Fitness</w:t>
                           </w:r>
                         </w:p>
                       </wps:txbxContent>
@@ -3057,7 +3024,7 @@
                     </wps:bodyPr>
                   </wps:wsp>
                   <wps:wsp>
-                    <wps:cNvPr id="4000013" name="Box 4000013"/>
+                    <wps:cNvPr id="5000024" name="Box 5000024"/>
                     <wps:cNvSpPr/>
                     <wps:spPr>
                       <a:xfrm>
@@ -3079,18 +3046,12 @@
                     <wps:txbx>
                       <wps:txbxContent>
                         <w:p>
-                          <w:pPr>
-                            <w:jc w:val="center"/>
-                          </w:pPr>
                           <w:r>
                             <w:rPr>
                               <w:rFonts w:ascii="Arial" w:eastAsia="Arial" w:hAnsi="Arial" w:cs="Arial"/>
-                              <w:b/>
-                              <w:bCs/>
                               <w:sz w:val="14"/>
-                              <w:szCs w:val="14"/>
                             </w:rPr>
-                            <w:t xml:space="preserve">9.0 Announce + Msg</w:t>
+                            <w:t>9.0 Announce + Msg</w:t>
                           </w:r>
                         </w:p>
                       </wps:txbxContent>
@@ -3100,7 +3061,7 @@
                     </wps:bodyPr>
                   </wps:wsp>
                   <wps:wsp>
-                    <wps:cNvPr id="4000014" name="Box 4000014"/>
+                    <wps:cNvPr id="5000025" name="Box 5000025"/>
                     <wps:cNvSpPr/>
                     <wps:spPr>
                       <a:xfrm>
@@ -3122,18 +3083,12 @@
                     <wps:txbx>
                       <wps:txbxContent>
                         <w:p>
-                          <w:pPr>
-                            <w:jc w:val="center"/>
-                          </w:pPr>
                           <w:r>
                             <w:rPr>
                               <w:rFonts w:ascii="Arial" w:eastAsia="Arial" w:hAnsi="Arial" w:cs="Arial"/>
-                              <w:b/>
-                              <w:bCs/>
                               <w:sz w:val="14"/>
-                              <w:szCs w:val="14"/>
                             </w:rPr>
-                            <w:t xml:space="preserve">10.0 User Management</w:t>
+                            <w:t>10.0 User Management</w:t>
                           </w:r>
                         </w:p>
                       </wps:txbxContent>
@@ -3143,7 +3098,7 @@
                     </wps:bodyPr>
                   </wps:wsp>
                   <wps:wsp>
-                    <wps:cNvPr id="4000015" name="Box 4000015"/>
+                    <wps:cNvPr id="5000026" name="Box 5000026"/>
                     <wps:cNvSpPr/>
                     <wps:spPr>
                       <a:xfrm>
@@ -3165,18 +3120,12 @@
                     <wps:txbx>
                       <wps:txbxContent>
                         <w:p>
-                          <w:pPr>
-                            <w:jc w:val="center"/>
-                          </w:pPr>
                           <w:r>
                             <w:rPr>
                               <w:rFonts w:ascii="Arial" w:eastAsia="Arial" w:hAnsi="Arial" w:cs="Arial"/>
-                              <w:b/>
-                              <w:bCs/>
                               <w:sz w:val="14"/>
-                              <w:szCs w:val="14"/>
                             </w:rPr>
-                            <w:t xml:space="preserve">11.0 Reports</w:t>
+                            <w:t>11.0 Reports</w:t>
                           </w:r>
                         </w:p>
                       </wps:txbxContent>
@@ -3186,7 +3135,7 @@
                     </wps:bodyPr>
                   </wps:wsp>
                   <wps:wsp>
-                    <wps:cNvPr id="4000016" name="Box 4000016"/>
+                    <wps:cNvPr id="5000027" name="Box 5000027"/>
                     <wps:cNvSpPr/>
                     <wps:spPr>
                       <a:xfrm>
@@ -3208,18 +3157,12 @@
                     <wps:txbx>
                       <wps:txbxContent>
                         <w:p>
-                          <w:pPr>
-                            <w:jc w:val="center"/>
-                          </w:pPr>
                           <w:r>
                             <w:rPr>
                               <w:rFonts w:ascii="Arial" w:eastAsia="Arial" w:hAnsi="Arial" w:cs="Arial"/>
-                              <w:b/>
-                              <w:bCs/>
                               <w:sz w:val="14"/>
-                              <w:szCs w:val="14"/>
                             </w:rPr>
-                            <w:t xml:space="preserve">D1-D3 Users/Members/Plans</w:t>
+                            <w:t>D1-D3 Users/Members/Plans</w:t>
                           </w:r>
                         </w:p>
                       </wps:txbxContent>
@@ -3229,7 +3172,7 @@
                     </wps:bodyPr>
                   </wps:wsp>
                   <wps:wsp>
-                    <wps:cNvPr id="4000017" name="Box 4000017"/>
+                    <wps:cNvPr id="5000028" name="Box 5000028"/>
                     <wps:cNvSpPr/>
                     <wps:spPr>
                       <a:xfrm>
@@ -3251,18 +3194,12 @@
                     <wps:txbx>
                       <wps:txbxContent>
                         <w:p>
-                          <w:pPr>
-                            <w:jc w:val="center"/>
-                          </w:pPr>
                           <w:r>
                             <w:rPr>
                               <w:rFonts w:ascii="Arial" w:eastAsia="Arial" w:hAnsi="Arial" w:cs="Arial"/>
-                              <w:b/>
-                              <w:bCs/>
                               <w:sz w:val="14"/>
-                              <w:szCs w:val="14"/>
                             </w:rPr>
-                            <w:t xml:space="preserve">D4-D7 Payments/Attend/Walkin/Sessions</w:t>
+                            <w:t>D4-D7 Payments/Attend/Walkin/Sessions</w:t>
                           </w:r>
                         </w:p>
                       </wps:txbxContent>
@@ -3272,7 +3209,7 @@
                     </wps:bodyPr>
                   </wps:wsp>
                   <wps:wsp>
-                    <wps:cNvPr id="4000018" name="Box 4000018"/>
+                    <wps:cNvPr id="5000029" name="Box 5000029"/>
                     <wps:cNvSpPr/>
                     <wps:spPr>
                       <a:xfrm>
@@ -3294,18 +3231,12 @@
                     <wps:txbx>
                       <wps:txbxContent>
                         <w:p>
-                          <w:pPr>
-                            <w:jc w:val="center"/>
-                          </w:pPr>
                           <w:r>
                             <w:rPr>
                               <w:rFonts w:ascii="Arial" w:eastAsia="Arial" w:hAnsi="Arial" w:cs="Arial"/>
-                              <w:b/>
-                              <w:bCs/>
                               <w:sz w:val="14"/>
-                              <w:szCs w:val="14"/>
                             </w:rPr>
-                            <w:t xml:space="preserve">D8-D12 Comms/Workouts/Settings/Log</w:t>
+                            <w:t>D8-D12 Comms/Workouts/Settings/Log</w:t>
                           </w:r>
                         </w:p>
                       </wps:txbxContent>
@@ -3315,7 +3246,7 @@
                     </wps:bodyPr>
                   </wps:wsp>
                   <wps:wsp>
-                    <wps:cNvPr id="4000019" name="Box 4000019"/>
+                    <wps:cNvPr id="5000030" name="Box 5000030"/>
                     <wps:cNvSpPr/>
                     <wps:spPr>
                       <a:xfrm>
@@ -3337,18 +3268,12 @@
                     <wps:txbx>
                       <wps:txbxContent>
                         <w:p>
-                          <w:pPr>
-                            <w:jc w:val="center"/>
-                          </w:pPr>
                           <w:r>
                             <w:rPr>
                               <w:rFonts w:ascii="Arial" w:eastAsia="Arial" w:hAnsi="Arial" w:cs="Arial"/>
-                              <w:b/>
-                              <w:bCs/>
                               <w:sz w:val="16"/>
-                              <w:szCs w:val="16"/>
                             </w:rPr>
-                            <w:t xml:space="preserve">Firebase Auth</w:t>
+                            <w:t>Firebase Auth</w:t>
                           </w:r>
                         </w:p>
                       </wps:txbxContent>
@@ -3358,7 +3283,7 @@
                     </wps:bodyPr>
                   </wps:wsp>
                   <wps:wsp>
-                    <wps:cNvPr id="4000020" name="Arrow 4000020"/>
+                    <wps:cNvPr id="5000031" name="Arrow 5000031"/>
                     <wps:cNvSpPr/>
                     <wps:spPr>
                       <a:xfrm>
@@ -3388,12 +3313,27 @@
                         </a:solidFill>
                         <a:headEnd ty="triangle" w="med" len="med"/>
                         <a:tailEnd ty="triangle" w="med" len="med"/>
+                        <a:miter lim="100000"/>
                       </a:ln>
                     </wps:spPr>
+                    <wps:style>
+                      <a:lnRef idx="1">
+                        <a:srgbClr val="181818"/>
+                      </a:lnRef>
+                      <a:fillRef idx="0">
+                        <a:srgbClr val="000000">
+                          <a:alpha val="0"/>
+                        </a:srgbClr>
+                      </a:fillRef>
+                      <a:effectRef idx="0">
+                        <a:scrgbClr r="0" g="0" b="0"/>
+                      </a:effectRef>
+                      <a:fontRef idx="none"/>
+                    </wps:style>
                     <wps:bodyPr/>
                   </wps:wsp>
                   <wps:wsp>
-                    <wps:cNvPr id="4000021" name="Arrow 4000021"/>
+                    <wps:cNvPr id="5000032" name="Arrow 5000032"/>
                     <wps:cNvSpPr/>
                     <wps:spPr>
                       <a:xfrm>
@@ -3423,12 +3363,27 @@
                         </a:solidFill>
                         <a:headEnd ty="triangle" w="med" len="med"/>
                         <a:tailEnd ty="triangle" w="med" len="med"/>
+                        <a:miter lim="100000"/>
                       </a:ln>
                     </wps:spPr>
+                    <wps:style>
+                      <a:lnRef idx="1">
+                        <a:srgbClr val="181818"/>
+                      </a:lnRef>
+                      <a:fillRef idx="0">
+                        <a:srgbClr val="000000">
+                          <a:alpha val="0"/>
+                        </a:srgbClr>
+                      </a:fillRef>
+                      <a:effectRef idx="0">
+                        <a:scrgbClr r="0" g="0" b="0"/>
+                      </a:effectRef>
+                      <a:fontRef idx="none"/>
+                    </wps:style>
                     <wps:bodyPr/>
                   </wps:wsp>
                   <wps:wsp>
-                    <wps:cNvPr id="4000022" name="Arrow 4000022"/>
+                    <wps:cNvPr id="5000033" name="Arrow 5000033"/>
                     <wps:cNvSpPr/>
                     <wps:spPr>
                       <a:xfrm>
@@ -3458,12 +3413,27 @@
                         </a:solidFill>
                         <a:headEnd ty="triangle" w="med" len="med"/>
                         <a:tailEnd ty="triangle" w="med" len="med"/>
+                        <a:miter lim="100000"/>
                       </a:ln>
                     </wps:spPr>
+                    <wps:style>
+                      <a:lnRef idx="1">
+                        <a:srgbClr val="181818"/>
+                      </a:lnRef>
+                      <a:fillRef idx="0">
+                        <a:srgbClr val="000000">
+                          <a:alpha val="0"/>
+                        </a:srgbClr>
+                      </a:fillRef>
+                      <a:effectRef idx="0">
+                        <a:scrgbClr r="0" g="0" b="0"/>
+                      </a:effectRef>
+                      <a:fontRef idx="none"/>
+                    </wps:style>
                     <wps:bodyPr/>
                   </wps:wsp>
                   <wps:wsp>
-                    <wps:cNvPr id="4000023" name="Arrow 4000023"/>
+                    <wps:cNvPr id="5000034" name="Arrow 5000034"/>
                     <wps:cNvSpPr/>
                     <wps:spPr>
                       <a:xfrm>
@@ -3493,12 +3463,27 @@
                         </a:solidFill>
                         <a:headEnd ty="triangle" w="med" len="med"/>
                         <a:tailEnd ty="triangle" w="med" len="med"/>
+                        <a:miter lim="100000"/>
                       </a:ln>
                     </wps:spPr>
+                    <wps:style>
+                      <a:lnRef idx="1">
+                        <a:srgbClr val="181818"/>
+                      </a:lnRef>
+                      <a:fillRef idx="0">
+                        <a:srgbClr val="000000">
+                          <a:alpha val="0"/>
+                        </a:srgbClr>
+                      </a:fillRef>
+                      <a:effectRef idx="0">
+                        <a:scrgbClr r="0" g="0" b="0"/>
+                      </a:effectRef>
+                      <a:fontRef idx="none"/>
+                    </wps:style>
                     <wps:bodyPr/>
                   </wps:wsp>
                   <wps:wsp>
-                    <wps:cNvPr id="4000024" name="Arrow 4000024"/>
+                    <wps:cNvPr id="5000035" name="Arrow 5000035"/>
                     <wps:cNvSpPr/>
                     <wps:spPr>
                       <a:xfrm>
@@ -3528,12 +3513,27 @@
                         </a:solidFill>
                         <a:headEnd ty="triangle" w="med" len="med"/>
                         <a:tailEnd ty="triangle" w="med" len="med"/>
+                        <a:miter lim="100000"/>
                       </a:ln>
                     </wps:spPr>
+                    <wps:style>
+                      <a:lnRef idx="1">
+                        <a:srgbClr val="181818"/>
+                      </a:lnRef>
+                      <a:fillRef idx="0">
+                        <a:srgbClr val="000000">
+                          <a:alpha val="0"/>
+                        </a:srgbClr>
+                      </a:fillRef>
+                      <a:effectRef idx="0">
+                        <a:scrgbClr r="0" g="0" b="0"/>
+                      </a:effectRef>
+                      <a:fontRef idx="none"/>
+                    </wps:style>
                     <wps:bodyPr/>
                   </wps:wsp>
                   <wps:wsp>
-                    <wps:cNvPr id="4000025" name="Arrow 4000025"/>
+                    <wps:cNvPr id="5000036" name="Arrow 5000036"/>
                     <wps:cNvSpPr/>
                     <wps:spPr>
                       <a:xfrm>
@@ -3563,12 +3563,27 @@
                         </a:solidFill>
                         <a:headEnd ty="triangle" w="med" len="med"/>
                         <a:tailEnd ty="triangle" w="med" len="med"/>
+                        <a:miter lim="100000"/>
                       </a:ln>
                     </wps:spPr>
+                    <wps:style>
+                      <a:lnRef idx="1">
+                        <a:srgbClr val="181818"/>
+                      </a:lnRef>
+                      <a:fillRef idx="0">
+                        <a:srgbClr val="000000">
+                          <a:alpha val="0"/>
+                        </a:srgbClr>
+                      </a:fillRef>
+                      <a:effectRef idx="0">
+                        <a:scrgbClr r="0" g="0" b="0"/>
+                      </a:effectRef>
+                      <a:fontRef idx="none"/>
+                    </wps:style>
                     <wps:bodyPr/>
                   </wps:wsp>
                   <wps:wsp>
-                    <wps:cNvPr id="4000026" name="Arrow 4000026"/>
+                    <wps:cNvPr id="5000037" name="Arrow 5000037"/>
                     <wps:cNvSpPr/>
                     <wps:spPr>
                       <a:xfrm>
@@ -3598,8 +3613,23 @@
                         </a:solidFill>
                         <a:headEnd ty="triangle" w="med" len="med"/>
                         <a:tailEnd ty="triangle" w="med" len="med"/>
+                        <a:miter lim="100000"/>
                       </a:ln>
                     </wps:spPr>
+                    <wps:style>
+                      <a:lnRef idx="1">
+                        <a:srgbClr val="181818"/>
+                      </a:lnRef>
+                      <a:fillRef idx="0">
+                        <a:srgbClr val="000000">
+                          <a:alpha val="0"/>
+                        </a:srgbClr>
+                      </a:fillRef>
+                      <a:effectRef idx="0">
+                        <a:scrgbClr r="0" g="0" b="0"/>
+                      </a:effectRef>
+                      <a:fontRef idx="none"/>
+                    </wps:style>
                     <wps:bodyPr/>
                   </wps:wsp>
                 </wpg:wgp>
@@ -4701,7 +4731,7 @@
     <w:p>
       <w:r>
         <w:drawing>
-          <wp:anchor distT="0" distB="0" distL="114300" distR="114300" simplePos="0" relativeHeight="251679744" behindDoc="0" locked="0" layoutInCell="1" allowOverlap="1" wp14:anchorId="003D092E" wp14:editId="003D092F">
+          <wp:anchor distT="0" distB="0" distL="114300" distR="114300" simplePos="0" relativeHeight="251679744" behindDoc="0" locked="0" layoutInCell="1" allowOverlap="1" wp14:anchorId="004C4B7C" wp14:editId="004C4B7D">
             <wp:simplePos x="0" y="0"/>
             <wp:positionH relativeFrom="column">
               <wp:posOffset>19050</wp:posOffset>
@@ -4712,7 +4742,7 @@
             <wp:extent cx="5700000" cy="3800000"/>
             <wp:effectExtent l="0" t="0" r="0" b="10160"/>
             <wp:wrapTopAndBottom/>
-            <wp:docPr id="4000047" name="DFD Figure"/>
+            <wp:docPr id="5000061" name="DFD Figure"/>
             <wp:cNvGraphicFramePr/>
             <a:graphic xmlns:a="http://schemas.openxmlformats.org/drawingml/2006/main">
               <a:graphicData uri="http://schemas.microsoft.com/office/word/2010/wordprocessingGroup">
@@ -4727,7 +4757,7 @@
                     </a:xfrm>
                   </wpg:grpSpPr>
                   <wps:wsp>
-                    <wps:cNvPr id="4000030" name="Box 4000030"/>
+                    <wps:cNvPr id="5000038" name="Box 5000038"/>
                     <wps:cNvSpPr/>
                     <wps:spPr>
                       <a:xfrm>
@@ -4749,18 +4779,12 @@
                     <wps:txbx>
                       <wps:txbxContent>
                         <w:p>
-                          <w:pPr>
-                            <w:jc w:val="center"/>
-                          </w:pPr>
                           <w:r>
                             <w:rPr>
                               <w:rFonts w:ascii="Arial" w:eastAsia="Arial" w:hAnsi="Arial" w:cs="Arial"/>
-                              <w:b/>
-                              <w:bCs/>
                               <w:sz w:val="15"/>
-                              <w:szCs w:val="15"/>
                             </w:rPr>
-                            <w:t xml:space="preserve">1.1 Login</w:t>
+                            <w:t>1.1 Login</w:t>
                           </w:r>
                         </w:p>
                       </wps:txbxContent>
@@ -4770,7 +4794,7 @@
                     </wps:bodyPr>
                   </wps:wsp>
                   <wps:wsp>
-                    <wps:cNvPr id="4000031" name="Box 4000031"/>
+                    <wps:cNvPr id="5000039" name="Box 5000039"/>
                     <wps:cNvSpPr/>
                     <wps:spPr>
                       <a:xfrm>
@@ -4792,18 +4816,12 @@
                     <wps:txbx>
                       <wps:txbxContent>
                         <w:p>
-                          <w:pPr>
-                            <w:jc w:val="center"/>
-                          </w:pPr>
                           <w:r>
                             <w:rPr>
                               <w:rFonts w:ascii="Arial" w:eastAsia="Arial" w:hAnsi="Arial" w:cs="Arial"/>
-                              <w:b/>
-                              <w:bCs/>
                               <w:sz w:val="15"/>
-                              <w:szCs w:val="15"/>
                             </w:rPr>
-                            <w:t xml:space="preserve">1.2 Register</w:t>
+                            <w:t>1.2 Register</w:t>
                           </w:r>
                         </w:p>
                       </wps:txbxContent>
@@ -4813,7 +4831,7 @@
                     </wps:bodyPr>
                   </wps:wsp>
                   <wps:wsp>
-                    <wps:cNvPr id="4000032" name="Box 4000032"/>
+                    <wps:cNvPr id="5000040" name="Box 5000040"/>
                     <wps:cNvSpPr/>
                     <wps:spPr>
                       <a:xfrm>
@@ -4835,18 +4853,12 @@
                     <wps:txbx>
                       <wps:txbxContent>
                         <w:p>
-                          <w:pPr>
-                            <w:jc w:val="center"/>
-                          </w:pPr>
                           <w:r>
                             <w:rPr>
                               <w:rFonts w:ascii="Arial" w:eastAsia="Arial" w:hAnsi="Arial" w:cs="Arial"/>
-                              <w:b/>
-                              <w:bCs/>
                               <w:sz w:val="15"/>
-                              <w:szCs w:val="15"/>
                             </w:rPr>
-                            <w:t xml:space="preserve">1.3 Forgot-OTP</w:t>
+                            <w:t>1.3 Forgot-OTP</w:t>
                           </w:r>
                         </w:p>
                       </wps:txbxContent>
@@ -4856,7 +4868,7 @@
                     </wps:bodyPr>
                   </wps:wsp>
                   <wps:wsp>
-                    <wps:cNvPr id="4000033" name="Box 4000033"/>
+                    <wps:cNvPr id="5000041" name="Box 5000041"/>
                     <wps:cNvSpPr/>
                     <wps:spPr>
                       <a:xfrm>
@@ -4878,18 +4890,12 @@
                     <wps:txbx>
                       <wps:txbxContent>
                         <w:p>
-                          <w:pPr>
-                            <w:jc w:val="center"/>
-                          </w:pPr>
                           <w:r>
                             <w:rPr>
                               <w:rFonts w:ascii="Arial" w:eastAsia="Arial" w:hAnsi="Arial" w:cs="Arial"/>
-                              <w:b/>
-                              <w:bCs/>
                               <w:sz w:val="15"/>
-                              <w:szCs w:val="15"/>
                             </w:rPr>
-                            <w:t xml:space="preserve">4.1 Record Payment</w:t>
+                            <w:t>4.1 Record Payment</w:t>
                           </w:r>
                         </w:p>
                       </wps:txbxContent>
@@ -4899,7 +4905,7 @@
                     </wps:bodyPr>
                   </wps:wsp>
                   <wps:wsp>
-                    <wps:cNvPr id="4000034" name="Box 4000034"/>
+                    <wps:cNvPr id="5000042" name="Box 5000042"/>
                     <wps:cNvSpPr/>
                     <wps:spPr>
                       <a:xfrm>
@@ -4921,18 +4927,12 @@
                     <wps:txbx>
                       <wps:txbxContent>
                         <w:p>
-                          <w:pPr>
-                            <w:jc w:val="center"/>
-                          </w:pPr>
                           <w:r>
                             <w:rPr>
                               <w:rFonts w:ascii="Arial" w:eastAsia="Arial" w:hAnsi="Arial" w:cs="Arial"/>
-                              <w:b/>
-                              <w:bCs/>
                               <w:sz w:val="15"/>
-                              <w:szCs w:val="15"/>
                             </w:rPr>
-                            <w:t xml:space="preserve">4.2 Confirm + Activate</w:t>
+                            <w:t>4.2 Confirm + Activate</w:t>
                           </w:r>
                         </w:p>
                       </wps:txbxContent>
@@ -4942,7 +4942,7 @@
                     </wps:bodyPr>
                   </wps:wsp>
                   <wps:wsp>
-                    <wps:cNvPr id="4000035" name="Box 4000035"/>
+                    <wps:cNvPr id="5000043" name="Box 5000043"/>
                     <wps:cNvSpPr/>
                     <wps:spPr>
                       <a:xfrm>
@@ -4964,18 +4964,12 @@
                     <wps:txbx>
                       <wps:txbxContent>
                         <w:p>
-                          <w:pPr>
-                            <w:jc w:val="center"/>
-                          </w:pPr>
                           <w:r>
                             <w:rPr>
                               <w:rFonts w:ascii="Arial" w:eastAsia="Arial" w:hAnsi="Arial" w:cs="Arial"/>
-                              <w:b/>
-                              <w:bCs/>
                               <w:sz w:val="15"/>
-                              <w:szCs w:val="15"/>
                             </w:rPr>
-                            <w:t xml:space="preserve">4.3 Print Receipt</w:t>
+                            <w:t>4.3 Print Receipt</w:t>
                           </w:r>
                         </w:p>
                       </wps:txbxContent>
@@ -4985,7 +4979,7 @@
                     </wps:bodyPr>
                   </wps:wsp>
                   <wps:wsp>
-                    <wps:cNvPr id="4000036" name="Box 4000036"/>
+                    <wps:cNvPr id="5000044" name="Box 5000044"/>
                     <wps:cNvSpPr/>
                     <wps:spPr>
                       <a:xfrm>
@@ -5007,18 +5001,12 @@
                     <wps:txbx>
                       <wps:txbxContent>
                         <w:p>
-                          <w:pPr>
-                            <w:jc w:val="center"/>
-                          </w:pPr>
                           <w:r>
                             <w:rPr>
                               <w:rFonts w:ascii="Arial" w:eastAsia="Arial" w:hAnsi="Arial" w:cs="Arial"/>
-                              <w:b/>
-                              <w:bCs/>
                               <w:sz w:val="15"/>
-                              <w:szCs w:val="15"/>
                             </w:rPr>
-                            <w:t xml:space="preserve">5.1 Check-In</w:t>
+                            <w:t>5.1 Check-In</w:t>
                           </w:r>
                         </w:p>
                       </wps:txbxContent>
@@ -5028,7 +5016,7 @@
                     </wps:bodyPr>
                   </wps:wsp>
                   <wps:wsp>
-                    <wps:cNvPr id="4000037" name="Box 4000037"/>
+                    <wps:cNvPr id="5000045" name="Box 5000045"/>
                     <wps:cNvSpPr/>
                     <wps:spPr>
                       <a:xfrm>
@@ -5050,18 +5038,12 @@
                     <wps:txbx>
                       <wps:txbxContent>
                         <w:p>
-                          <w:pPr>
-                            <w:jc w:val="center"/>
-                          </w:pPr>
                           <w:r>
                             <w:rPr>
                               <w:rFonts w:ascii="Arial" w:eastAsia="Arial" w:hAnsi="Arial" w:cs="Arial"/>
-                              <w:b/>
-                              <w:bCs/>
                               <w:sz w:val="15"/>
-                              <w:szCs w:val="15"/>
                             </w:rPr>
-                            <w:t xml:space="preserve">5.2 Check-Out</w:t>
+                            <w:t>5.2 Check-Out</w:t>
                           </w:r>
                         </w:p>
                       </wps:txbxContent>
@@ -5071,7 +5053,7 @@
                     </wps:bodyPr>
                   </wps:wsp>
                   <wps:wsp>
-                    <wps:cNvPr id="4000038" name="Box 4000038"/>
+                    <wps:cNvPr id="5000046" name="Box 5000046"/>
                     <wps:cNvSpPr/>
                     <wps:spPr>
                       <a:xfrm>
@@ -5093,18 +5075,12 @@
                     <wps:txbx>
                       <wps:txbxContent>
                         <w:p>
-                          <w:pPr>
-                            <w:jc w:val="center"/>
-                          </w:pPr>
                           <w:r>
                             <w:rPr>
                               <w:rFonts w:ascii="Arial" w:eastAsia="Arial" w:hAnsi="Arial" w:cs="Arial"/>
-                              <w:b/>
-                              <w:bCs/>
                               <w:sz w:val="15"/>
-                              <w:szCs w:val="15"/>
                             </w:rPr>
-                            <w:t xml:space="preserve">5.3 QR Scan</w:t>
+                            <w:t>5.3 QR Scan</w:t>
                           </w:r>
                         </w:p>
                       </wps:txbxContent>
@@ -5114,7 +5090,7 @@
                     </wps:bodyPr>
                   </wps:wsp>
                   <wps:wsp>
-                    <wps:cNvPr id="4000039" name="Box 4000039"/>
+                    <wps:cNvPr id="5000047" name="Box 5000047"/>
                     <wps:cNvSpPr/>
                     <wps:spPr>
                       <a:xfrm>
@@ -5136,18 +5112,12 @@
                     <wps:txbx>
                       <wps:txbxContent>
                         <w:p>
-                          <w:pPr>
-                            <w:jc w:val="center"/>
-                          </w:pPr>
                           <w:r>
                             <w:rPr>
                               <w:rFonts w:ascii="Arial" w:eastAsia="Arial" w:hAnsi="Arial" w:cs="Arial"/>
-                              <w:b/>
-                              <w:bCs/>
                               <w:sz w:val="15"/>
-                              <w:szCs w:val="15"/>
                             </w:rPr>
-                            <w:t xml:space="preserve">7.1 Manage Schedule</w:t>
+                            <w:t>7.1 Manage Schedule</w:t>
                           </w:r>
                         </w:p>
                       </wps:txbxContent>
@@ -5157,7 +5127,7 @@
                     </wps:bodyPr>
                   </wps:wsp>
                   <wps:wsp>
-                    <wps:cNvPr id="4000040" name="Box 4000040"/>
+                    <wps:cNvPr id="5000048" name="Box 5000048"/>
                     <wps:cNvSpPr/>
                     <wps:spPr>
                       <a:xfrm>
@@ -5179,18 +5149,12 @@
                     <wps:txbx>
                       <wps:txbxContent>
                         <w:p>
-                          <w:pPr>
-                            <w:jc w:val="center"/>
-                          </w:pPr>
                           <w:r>
                             <w:rPr>
                               <w:rFonts w:ascii="Arial" w:eastAsia="Arial" w:hAnsi="Arial" w:cs="Arial"/>
-                              <w:b/>
-                              <w:bCs/>
                               <w:sz w:val="15"/>
-                              <w:szCs w:val="15"/>
                             </w:rPr>
-                            <w:t xml:space="preserve">7.2 Book Session</w:t>
+                            <w:t>7.2 Book Session</w:t>
                           </w:r>
                         </w:p>
                       </wps:txbxContent>
@@ -5200,7 +5164,7 @@
                     </wps:bodyPr>
                   </wps:wsp>
                   <wps:wsp>
-                    <wps:cNvPr id="4000041" name="Box 4000041"/>
+                    <wps:cNvPr id="5000049" name="Box 5000049"/>
                     <wps:cNvSpPr/>
                     <wps:spPr>
                       <a:xfrm>
@@ -5222,18 +5186,12 @@
                     <wps:txbx>
                       <wps:txbxContent>
                         <w:p>
-                          <w:pPr>
-                            <w:jc w:val="center"/>
-                          </w:pPr>
                           <w:r>
                             <w:rPr>
                               <w:rFonts w:ascii="Arial" w:eastAsia="Arial" w:hAnsi="Arial" w:cs="Arial"/>
-                              <w:b/>
-                              <w:bCs/>
                               <w:sz w:val="15"/>
-                              <w:szCs w:val="15"/>
                             </w:rPr>
-                            <w:t xml:space="preserve">7.3 Complete / Cancel</w:t>
+                            <w:t>7.3 Complete / Cancel</w:t>
                           </w:r>
                         </w:p>
                       </wps:txbxContent>
@@ -5243,7 +5201,7 @@
                     </wps:bodyPr>
                   </wps:wsp>
                   <wps:wsp>
-                    <wps:cNvPr id="4000042" name="Box 4000042"/>
+                    <wps:cNvPr id="5000050" name="Box 5000050"/>
                     <wps:cNvSpPr/>
                     <wps:spPr>
                       <a:xfrm>
@@ -5265,18 +5223,12 @@
                     <wps:txbx>
                       <wps:txbxContent>
                         <w:p>
-                          <w:pPr>
-                            <w:jc w:val="center"/>
-                          </w:pPr>
                           <w:r>
                             <w:rPr>
                               <w:rFonts w:ascii="Arial" w:eastAsia="Arial" w:hAnsi="Arial" w:cs="Arial"/>
-                              <w:b/>
-                              <w:bCs/>
                               <w:sz w:val="15"/>
-                              <w:szCs w:val="15"/>
                             </w:rPr>
-                            <w:t xml:space="preserve">8.1 Exercise Library</w:t>
+                            <w:t>8.1 Exercise Library</w:t>
                           </w:r>
                         </w:p>
                       </wps:txbxContent>
@@ -5286,7 +5238,7 @@
                     </wps:bodyPr>
                   </wps:wsp>
                   <wps:wsp>
-                    <wps:cNvPr id="4000043" name="Box 4000043"/>
+                    <wps:cNvPr id="5000051" name="Box 5000051"/>
                     <wps:cNvSpPr/>
                     <wps:spPr>
                       <a:xfrm>
@@ -5308,18 +5260,12 @@
                     <wps:txbx>
                       <wps:txbxContent>
                         <w:p>
-                          <w:pPr>
-                            <w:jc w:val="center"/>
-                          </w:pPr>
                           <w:r>
                             <w:rPr>
                               <w:rFonts w:ascii="Arial" w:eastAsia="Arial" w:hAnsi="Arial" w:cs="Arial"/>
-                              <w:b/>
-                              <w:bCs/>
                               <w:sz w:val="15"/>
-                              <w:szCs w:val="15"/>
                             </w:rPr>
-                            <w:t xml:space="preserve">8.2 Build Workout Plan</w:t>
+                            <w:t>8.2 Build Workout Plan</w:t>
                           </w:r>
                         </w:p>
                       </wps:txbxContent>
@@ -5329,7 +5275,7 @@
                     </wps:bodyPr>
                   </wps:wsp>
                   <wps:wsp>
-                    <wps:cNvPr id="4000044" name="Box 4000044"/>
+                    <wps:cNvPr id="5000052" name="Box 5000052"/>
                     <wps:cNvSpPr/>
                     <wps:spPr>
                       <a:xfrm>
@@ -5351,18 +5297,12 @@
                     <wps:txbx>
                       <wps:txbxContent>
                         <w:p>
-                          <w:pPr>
-                            <w:jc w:val="center"/>
-                          </w:pPr>
                           <w:r>
                             <w:rPr>
                               <w:rFonts w:ascii="Arial" w:eastAsia="Arial" w:hAnsi="Arial" w:cs="Arial"/>
-                              <w:b/>
-                              <w:bCs/>
                               <w:sz w:val="15"/>
-                              <w:szCs w:val="15"/>
                             </w:rPr>
-                            <w:t xml:space="preserve">8.3 Log + Track Goals</w:t>
+                            <w:t>8.3 Log + Track Goals</w:t>
                           </w:r>
                         </w:p>
                       </wps:txbxContent>

</xml_diff>